<commit_message>
Guiones 09/10: gancho de 2 segundos por pieza, grupo real B1/B2 (3 empezaron de cero), prioridad video dia 1 vs hoy; base LaHaus bloques con 'presencial'
Co-Authored-By: Claude Fable 5.1 <noreply@anthropic.com>
</commit_message>
<xml_diff>
--- a/recursos/comercial/campañas/GUIONES_GRABACION_2026-10-09.docx
+++ b/recursos/comercial/campañas/GUIONES_GRABACION_2026-10-09.docx
@@ -23,7 +23,7 @@
           <w:color w:val="666666"/>
           <w:sz w:val="19"/>
         </w:rPr>
-        <w:t>Venden el SERVICIO, no el producto: garantía por escrito, profesor que entrena (coach), acompañamiento diario, y un plan con fecha de llegada. Reglas del calendario: gancho de destino, sin precio ni nombre del programa, nunca "fácil", "rápido" ni "gratis"; caras de profes, estudiantes con cláusula de imagen y coordinación; nunca gerencia. Verticales (9:16), 20-30 segundos, subtítulos grandes, el primer segundo ya con la frase fuerte. Cierre siempre a WhatsApp.</w:t>
+        <w:t>Venden el SERVICIO, no el producto: garantía por escrito, profesor que entrena (coach), acompañamiento diario, y un plan con fecha de llegada. Reglas del calendario: gancho de destino, sin precio ni nombre del programa, nunca "fácil", "rápido" ni "gratis"; caras de profes, estudiantes con cláusula de imagen y coordinación; nunca gerencia. Verticales (9:16), 20-30 segundos, subtítulos grandes. Cada guion abre con un GANCHO de 2 segundos (imagen + texto grande) que es lo que detiene el dedo; la clase, el profe o el contrato son la prueba que viene después. Cierre siempre a WhatsApp. GRUPO DISPONIBLE EL 09/10: un grupo de B1/B2 de 5 estudiantes; 3 de ellos empezaron de cero (A1) en Heiiu y tienen video de entrada en el portafolio: son los protagonistas de los guiones 2 y 6.</w:t>
       </w:r>
     </w:p>
     <w:p>
@@ -49,7 +49,7 @@
           <w:i w:val="0"/>
           <w:sz w:val="21"/>
         </w:rPr>
-        <w:t>1. GUION 1 "Te lo firmamos" (coordinación con el contrato): la prueba que nadie más tiene.</w:t>
+        <w:t>1. GUION 6 "El video de hoy" (los 3 que empezaron de cero: día 1 vs. hoy) y GUION 2 "Esto es una clase": estudiantes reales hablando. Es la prueba que más convierte en compras caras (investigación 08/10) y lo que ningún avatar ni competidor puede mostrar.</w:t>
       </w:r>
     </w:p>
     <w:p>
@@ -62,7 +62,7 @@
           <w:i w:val="0"/>
           <w:sz w:val="21"/>
         </w:rPr>
-        <w:t>2. GUION 2 "Esto es una clase" (aula real con estudiantes hablando): el servicio visto, no contado.</w:t>
+        <w:t>2. GUION 4 "Siete meses": velocidad con número (575 h, 7 meses). Ningún competidor publica sus horas.</w:t>
       </w:r>
     </w:p>
     <w:p>
@@ -75,7 +75,7 @@
           <w:i w:val="0"/>
           <w:sz w:val="21"/>
         </w:rPr>
-        <w:t>3. GUION 3 "La vacante" (profe): el destino #1 de la base.</w:t>
+        <w:t>3. GUION 3 "La vacante": el destino #1 de la base.</w:t>
       </w:r>
     </w:p>
     <w:p>
@@ -88,7 +88,20 @@
           <w:i w:val="0"/>
           <w:sz w:val="21"/>
         </w:rPr>
-        <w:t>4. Si hay tiempo: GUION 4 "Siete meses", GUION 5 "El Pacto", GUION 6 "El video de hoy", GUION 7 "Su hijo a los 18".</w:t>
+        <w:t>4. GUION 1 "Te lo firmamos": la garantía va DESPUÉS del precio (bot, cita, retargeting), no como gancho de alcance. Se graba igual.</w:t>
+      </w:r>
+    </w:p>
+    <w:p>
+      <w:pPr>
+        <w:spacing w:after="40"/>
+      </w:pPr>
+      <w:r>
+        <w:rPr>
+          <w:b w:val="0"/>
+          <w:i w:val="0"/>
+          <w:sz w:val="21"/>
+        </w:rPr>
+        <w:t>5. Si hay tiempo: GUION 5 "El Pacto" (filtro, poco volumen), GUION 7 "Su hijo a los 18".</w:t>
       </w:r>
     </w:p>
     <w:p>
@@ -114,6 +127,27 @@
           <w:i w:val="0"/>
           <w:sz w:val="21"/>
         </w:rPr>
+        <w:t>GANCHO (segundos 0-2, lo que para el dedo):</w:t>
+      </w:r>
+      <w:r>
+        <w:rPr>
+          <w:b w:val="0"/>
+          <w:i w:val="0"/>
+          <w:sz w:val="21"/>
+        </w:rPr>
+        <w:t xml:space="preserve"> Jacqueline levanta el contrato a cámara. Texto grande: "Si no aprendes, te devolvemos el 100%. Firmado."</w:t>
+      </w:r>
+    </w:p>
+    <w:p>
+      <w:pPr>
+        <w:spacing w:after="40"/>
+      </w:pPr>
+      <w:r>
+        <w:rPr>
+          <w:b/>
+          <w:i w:val="0"/>
+          <w:sz w:val="21"/>
+        </w:rPr>
         <w:t>Qué vende:</w:t>
       </w:r>
       <w:r>
@@ -122,7 +156,7 @@
           <w:i w:val="0"/>
           <w:sz w:val="21"/>
         </w:rPr>
-        <w:t xml:space="preserve"> La garantía por escrito: lo único que ninguna academia de la ciudad firma.</w:t>
+        <w:t xml:space="preserve"> La garantía por escrito, legible y fácil de cobrar. OJO: siempre "única academia PRESENCIAL de Bucaramanga" (las plataformas online E4CC y EF sí tienen garantía escrita; Wall Street ya no opera en la ciudad). Y la nuestra cabe en 3 líneas.</w:t>
       </w:r>
     </w:p>
     <w:p>
@@ -253,7 +287,7 @@
           <w:i w:val="0"/>
           <w:sz w:val="21"/>
         </w:rPr>
-        <w:t xml:space="preserve"> "GARANTÍA DE APRENDIZAJE POR ESCRITO" · "Única academia de Bucaramanga que la firma"</w:t>
+        <w:t xml:space="preserve"> "GARANTÍA DE APRENDIZAJE POR ESCRITO" · "Única academia presencial de Bucaramanga que la firma · sin letra pequeña"</w:t>
       </w:r>
     </w:p>
     <w:p>
@@ -288,7 +322,7 @@
           <w:color w:val="666666"/>
           <w:sz w:val="19"/>
         </w:rPr>
-        <w:t>Nota: Que el contrato real se vea legible en el plano cerrado (cláusula de garantía). Sin cifras de precio en cuadro.</w:t>
+        <w:t>Nota: Que el contrato real se vea legible en el plano cerrado (cláusula de garantía). Sin cifras de precio en cuadro. Esta pieza se usa en retargeting (quien ya vio otro anuncio o preguntó precio): ahí es donde la garantía decide.</w:t>
       </w:r>
     </w:p>
     <w:p>
@@ -302,6 +336,27 @@
           <w:sz w:val="25"/>
         </w:rPr>
         <w:t>GUION 2 — ESTO ES UNA CLASE   [PRIORITARIO]</w:t>
+      </w:r>
+    </w:p>
+    <w:p>
+      <w:pPr>
+        <w:spacing w:after="40"/>
+      </w:pPr>
+      <w:r>
+        <w:rPr>
+          <w:b/>
+          <w:i w:val="0"/>
+          <w:sz w:val="21"/>
+        </w:rPr>
+        <w:t>GANCHO (segundos 0-2, lo que para el dedo):</w:t>
+      </w:r>
+      <w:r>
+        <w:rPr>
+          <w:b w:val="0"/>
+          <w:i w:val="0"/>
+          <w:sz w:val="21"/>
+        </w:rPr>
+        <w:t xml:space="preserve"> Segundo 0: el estudiante de pie, a mitad de una frase en inglés, con el profe diciendo "Again. Louder." Texto grande: "Empezó de cero aquí. Escúchalo." Alternativa: "¿Cuánto llevas en: estoy aprendiendo inglés?"</w:t>
       </w:r>
     </w:p>
     <w:p>
@@ -343,7 +398,7 @@
           <w:i w:val="0"/>
           <w:sz w:val="21"/>
         </w:rPr>
-        <w:t xml:space="preserve"> Nadie a cámara: se graba una simulación real en un aula activa (A2 o B1), 30 segundos de estudiantes de pie resolviendo una situación (entrevista, llamada, reclamo). Voz del profe corrigiendo en vivo. Al final, el profe dice UNA frase a cámara.   ·   </w:t>
+        <w:t xml:space="preserve"> Nadie a cámara: se graba la simulación real del grupo B1/B2 (entrevista de trabajo o reclamo a un proveedor), estudiantes de pie; protagonista uno de los 3 que empezó de cero en Heiiu. Voz del profe corrigiendo en vivo. Al final, el profe dice UNA frase a cámara.   ·   </w:t>
       </w:r>
       <w:r>
         <w:rPr>
@@ -440,7 +495,7 @@
           <w:i w:val="0"/>
           <w:sz w:val="21"/>
         </w:rPr>
-        <w:t xml:space="preserve"> "Clase de A2, martes 7:00 PM" (hora real) · "Hablas desde el primer día"</w:t>
+        <w:t xml:space="preserve"> "Empezó de cero en Heiiu" (solo sobre los 3 que sí) · "Clase de B1, 7:00 PM" (nivel y hora reales) · "Hablas desde el primer día"</w:t>
       </w:r>
     </w:p>
     <w:p>
@@ -475,7 +530,7 @@
           <w:color w:val="666666"/>
           <w:sz w:val="19"/>
         </w:rPr>
-        <w:t>Nota: Solo estudiantes con cláusula de imagen firmada y avisados ese día. Sin nombres en pantalla.</w:t>
+        <w:t>Nota: Solo estudiantes con cláusula de imagen firmada y avisados ese día. Sin nombres en pantalla. Nunca poner cuánto tiempo lleva si no es el dato real del estudiante.</w:t>
       </w:r>
     </w:p>
     <w:p>
@@ -489,6 +544,27 @@
           <w:sz w:val="25"/>
         </w:rPr>
         <w:t>GUION 3 — LA VACANTE   [PRIORITARIO]</w:t>
+      </w:r>
+    </w:p>
+    <w:p>
+      <w:pPr>
+        <w:spacing w:after="40"/>
+      </w:pPr>
+      <w:r>
+        <w:rPr>
+          <w:b/>
+          <w:i w:val="0"/>
+          <w:sz w:val="21"/>
+        </w:rPr>
+        <w:t>GANCHO (segundos 0-2, lo que para el dedo):</w:t>
+      </w:r>
+      <w:r>
+        <w:rPr>
+          <w:b w:val="0"/>
+          <w:i w:val="0"/>
+          <w:sz w:val="21"/>
+        </w:rPr>
+        <w:t xml:space="preserve"> Texto grande sobre el profe mirando a cámara en silencio 1 segundo: "Decía: inglés intermedio. Y la cerraste."</w:t>
       </w:r>
     </w:p>
     <w:p>
@@ -688,7 +764,28 @@
           <w:color w:val="E54C09"/>
           <w:sz w:val="25"/>
         </w:rPr>
-        <w:t>GUION 4 — SIETE MESES   [ALTERNO]</w:t>
+        <w:t>GUION 4 — SIETE MESES   [PRIORITARIO]</w:t>
+      </w:r>
+    </w:p>
+    <w:p>
+      <w:pPr>
+        <w:spacing w:after="40"/>
+      </w:pPr>
+      <w:r>
+        <w:rPr>
+          <w:b/>
+          <w:i w:val="0"/>
+          <w:sz w:val="21"/>
+        </w:rPr>
+        <w:t>GANCHO (segundos 0-2, lo que para el dedo):</w:t>
+      </w:r>
+      <w:r>
+        <w:rPr>
+          <w:b w:val="0"/>
+          <w:i w:val="0"/>
+          <w:sz w:val="21"/>
+        </w:rPr>
+        <w:t xml:space="preserve"> El profe escribe en el tablero un "5 AÑOS" grande y lo tacha. Texto: "Lo que tarda el inglés a 2 horas por semana."</w:t>
       </w:r>
     </w:p>
     <w:p>
@@ -709,7 +806,7 @@
           <w:i w:val="0"/>
           <w:sz w:val="21"/>
         </w:rPr>
-        <w:t xml:space="preserve"> Un plan con fecha de llegada: de cero a B2 en unos siete meses en el súper intensivo. Honesto: no es rápido, son 575 horas.</w:t>
+        <w:t xml:space="preserve"> Velocidad con número: 575 h (estándar Cambridge para B2) en 7 meses. Es el único "rápido" verificable del mercado; los demás dicen "2x" o "10 meses" sin publicar horas.</w:t>
       </w:r>
     </w:p>
     <w:p>
@@ -793,7 +890,7 @@
           <w:i/>
           <w:sz w:val="21"/>
         </w:rPr>
-        <w:t>"No te vamos a decir que el inglés es rápido. Son quinientas setenta y cinco horas de entrenamiento."</w:t>
+        <w:t>"Llegar a B2 son unas quinientas setenta y cinco horas de clase. En cualquier academia."</w:t>
       </w:r>
     </w:p>
     <w:p>
@@ -806,7 +903,7 @@
           <w:i/>
           <w:sz w:val="21"/>
         </w:rPr>
-        <w:t>"Lo que sí te decimos es cuándo llegas: cuatro horas al día, de lunes a viernes, y en unos siete meses estás en B2, hablando. Con fecha. Y con garantía por escrito."</w:t>
+        <w:t>"A dos horas por semana, eso son cinco años. Aquí son cuatro horas al día, de lunes a viernes: siete meses."</w:t>
       </w:r>
     </w:p>
     <w:p>
@@ -819,7 +916,7 @@
           <w:i/>
           <w:sz w:val="21"/>
         </w:rPr>
-        <w:t>"Si lo que buscas es una fecha, aquí la tienes."</w:t>
+        <w:t>"No es fácil. Es rápido porque es intenso. Y te lo firmamos."</w:t>
       </w:r>
     </w:p>
     <w:p>
@@ -840,7 +937,7 @@
           <w:i w:val="0"/>
           <w:sz w:val="21"/>
         </w:rPr>
-        <w:t xml:space="preserve"> "575 horas · ~7 meses · de cero a B2" · "Con garantía por escrito"</w:t>
+        <w:t xml:space="preserve"> "B2 = 575 horas" · "2 h/semana = 5 años" · "Aquí: 7 meses"</w:t>
       </w:r>
     </w:p>
     <w:p>
@@ -875,7 +972,7 @@
           <w:color w:val="666666"/>
           <w:sz w:val="19"/>
         </w:rPr>
-        <w:t>Nota: El "~7 meses" aplica al súper intensivo de 4 h; en la noche son ~14 meses: no mezclar. Sin precio.</w:t>
+        <w:t>Nota: El "7 meses" aplica al súper intensivo de 4 h; en la noche son ~14 meses: no mezclar. Sin precio. Versión nocturna del cierre: "dos horas cada noche, catorce meses".</w:t>
       </w:r>
     </w:p>
     <w:p>
@@ -889,6 +986,27 @@
           <w:sz w:val="25"/>
         </w:rPr>
         <w:t>GUION 5 — EL PACTO   [ALTERNO]</w:t>
+      </w:r>
+    </w:p>
+    <w:p>
+      <w:pPr>
+        <w:spacing w:after="40"/>
+      </w:pPr>
+      <w:r>
+        <w:rPr>
+          <w:b/>
+          <w:i w:val="0"/>
+          <w:sz w:val="21"/>
+        </w:rPr>
+        <w:t>GANCHO (segundos 0-2, lo que para el dedo):</w:t>
+      </w:r>
+      <w:r>
+        <w:rPr>
+          <w:b w:val="0"/>
+          <w:i w:val="0"/>
+          <w:sz w:val="21"/>
+        </w:rPr>
+        <w:t xml:space="preserve"> Profe muy cerca, bajo: "No te voy a decir que es fácil." Texto grande: "Lo que NO te prometemos".</w:t>
       </w:r>
     </w:p>
     <w:p>
@@ -1088,7 +1206,28 @@
           <w:color w:val="E54C09"/>
           <w:sz w:val="25"/>
         </w:rPr>
-        <w:t>GUION 6 — EL VIDEO DE HOY   [ALTERNO]</w:t>
+        <w:t>GUION 6 — EL VIDEO DE HOY   [PRIORITARIO]</w:t>
+      </w:r>
+    </w:p>
+    <w:p>
+      <w:pPr>
+        <w:spacing w:after="40"/>
+      </w:pPr>
+      <w:r>
+        <w:rPr>
+          <w:b/>
+          <w:i w:val="0"/>
+          <w:sz w:val="21"/>
+        </w:rPr>
+        <w:t>GANCHO (segundos 0-2, lo que para el dedo):</w:t>
+      </w:r>
+      <w:r>
+        <w:rPr>
+          <w:b w:val="0"/>
+          <w:i w:val="0"/>
+          <w:sz w:val="21"/>
+        </w:rPr>
+        <w:t xml:space="preserve"> Segundo 0: su video de entrada, nervioso, sin poder terminar la frase. Texto grande: "Día 1." Corte seco al de hoy hablando de corrido: "Hoy."</w:t>
       </w:r>
     </w:p>
     <w:p>
@@ -1130,7 +1269,7 @@
           <w:i w:val="0"/>
           <w:sz w:val="21"/>
         </w:rPr>
-        <w:t xml:space="preserve"> Un estudiante con cláusula de imagen: 5 segundos de su video de entrada (día 1, nervioso) y 5 segundos de un video reciente. Luego el profe a cámara.   ·   </w:t>
+        <w:t xml:space="preserve"> Uno de los 3 estudiantes del grupo que empezó de cero en Heiiu (cláusula de imagen + autorización escrita para usar sus dos videos): 5 segundos de su video de entrada en A1 (día 1) y 5 segundos hablando hoy en B1 (grabado mañana o de su portafolio reciente). Luego el profe a cámara.   ·   </w:t>
       </w:r>
       <w:r>
         <w:rPr>
@@ -1167,7 +1306,7 @@
           <w:i w:val="0"/>
           <w:sz w:val="21"/>
         </w:rPr>
-        <w:t xml:space="preserve"> Pantalla partida o corte seco: "Día 1" / "Semana 12". Luego el profe, con el celular en la mano, mostrando (sin que se lea el nombre) el chat donde manda la corrección.</w:t>
+        <w:t xml:space="preserve"> Pantalla partida o corte seco: "Día 1" / "Hoy" (con el dato real: "hace ___ meses", se llena con la fecha de matrícula del estudiante). Luego el profe, con el celular en la mano, mostrando (sin que se lea el nombre) el chat donde manda la corrección.</w:t>
       </w:r>
     </w:p>
     <w:p>
@@ -1193,7 +1332,7 @@
           <w:i/>
           <w:sz w:val="21"/>
         </w:rPr>
-        <w:t>"(video día 1, 5 s) (video semana 12, 5 s)"</w:t>
+        <w:t>"(video día 1 en A1, 5 s) (video de hoy en B1, 5 s)"</w:t>
       </w:r>
     </w:p>
     <w:p>
@@ -1240,7 +1379,7 @@
           <w:i w:val="0"/>
           <w:sz w:val="21"/>
         </w:rPr>
-        <w:t xml:space="preserve"> "Día 1" · "Semana 12" · "Un video al día. Un profesor que lo revisa."</w:t>
+        <w:t xml:space="preserve"> "Día 1" · "Hoy (hace ___ meses)" · "Un video al día. Un profesor que lo revisa."</w:t>
       </w:r>
     </w:p>
     <w:p>
@@ -1275,7 +1414,7 @@
           <w:color w:val="666666"/>
           <w:sz w:val="19"/>
         </w:rPr>
-        <w:t>Nota: Solo con autorización escrita del estudiante para usar sus dos videos. Si no hay uno listo, se graba el guion 4 o 5 en su lugar.</w:t>
+        <w:t>Nota: Solo con autorización escrita del estudiante para usar sus dos videos. Si se puede, grabar los 3 (tres piezas distintas con el mismo guion: Meta premia conceptos y caras distintas).</w:t>
       </w:r>
     </w:p>
     <w:p>
@@ -1289,6 +1428,27 @@
           <w:sz w:val="25"/>
         </w:rPr>
         <w:t>GUION 7 — SU HIJO A LOS 18   [ALTERNO (para el grupo de la tarde y el sabatino)]</w:t>
+      </w:r>
+    </w:p>
+    <w:p>
+      <w:pPr>
+        <w:spacing w:after="40"/>
+      </w:pPr>
+      <w:r>
+        <w:rPr>
+          <w:b/>
+          <w:i w:val="0"/>
+          <w:sz w:val="21"/>
+        </w:rPr>
+        <w:t>GANCHO (segundos 0-2, lo que para el dedo):</w:t>
+      </w:r>
+      <w:r>
+        <w:rPr>
+          <w:b w:val="0"/>
+          <w:i w:val="0"/>
+          <w:sz w:val="21"/>
+        </w:rPr>
+        <w:t xml:space="preserve"> Texto grande sobre jóvenes en clase: "A los 18, con el inglés resuelto."</w:t>
       </w:r>
     </w:p>
     <w:p>
@@ -1527,7 +1687,7 @@
           <w:i w:val="0"/>
           <w:sz w:val="21"/>
         </w:rPr>
-        <w:t>• Prohibido en pantalla y en voz: precio, "Arranque", "A1 intensivo", "descuento", "gratis", "fácil", "rápido", "bilingüe en X meses", "consigue trabajo", fecha de inicio de cohorte.</w:t>
+        <w:t>• Prohibido en pantalla y en voz: precio, "Arranque", "A1 intensivo", "descuento", "gratis", "fácil", "rápido" sin número, "bilingüe", "consigue trabajo", "duplica tu salario", "profesores nativos", "única academia con garantía" sin la palabra PRESENCIAL (las online E4CC y EF la tienen), fecha de inicio de cohorte.</w:t>
       </w:r>
     </w:p>
     <w:p>

</xml_diff>

<commit_message>
Guiones 09/10: guion 8 El pasaporte (destino irse: Au Pair / Work and Travel / Europa)
Co-Authored-By: Claude Fable 5.1 <noreply@anthropic.com>
</commit_message>
<xml_diff>
--- a/recursos/comercial/campañas/GUIONES_GRABACION_2026-10-09.docx
+++ b/recursos/comercial/campañas/GUIONES_GRABACION_2026-10-09.docx
@@ -101,7 +101,20 @@
           <w:i w:val="0"/>
           <w:sz w:val="21"/>
         </w:rPr>
-        <w:t>5. Si hay tiempo: GUION 5 "El Pacto" (filtro, poco volumen), GUION 7 "Su hijo a los 18".</w:t>
+        <w:t>5. GUION 8 "El pasaporte": el destino de irse (Au Pair / Work and Travel / Europa), la conversación más barata.</w:t>
+      </w:r>
+    </w:p>
+    <w:p>
+      <w:pPr>
+        <w:spacing w:after="40"/>
+      </w:pPr>
+      <w:r>
+        <w:rPr>
+          <w:b w:val="0"/>
+          <w:i w:val="0"/>
+          <w:sz w:val="21"/>
+        </w:rPr>
+        <w:t>6. Si hay tiempo: GUION 5 "El Pacto" (filtro, poco volumen), GUION 7 "Su hijo a los 18".</w:t>
       </w:r>
     </w:p>
     <w:p>
@@ -1640,6 +1653,227 @@
     </w:p>
     <w:p>
       <w:pPr>
+        <w:spacing w:before="280" w:after="80"/>
+      </w:pPr>
+      <w:r>
+        <w:rPr>
+          <w:b/>
+          <w:color w:val="E54C09"/>
+          <w:sz w:val="25"/>
+        </w:rPr>
+        <w:t>GUION 8 — EL PASAPORTE   [PRIORITARIO (destino: irse)]</w:t>
+      </w:r>
+    </w:p>
+    <w:p>
+      <w:pPr>
+        <w:spacing w:after="40"/>
+      </w:pPr>
+      <w:r>
+        <w:rPr>
+          <w:b/>
+          <w:i w:val="0"/>
+          <w:sz w:val="21"/>
+        </w:rPr>
+        <w:t>GANCHO (segundos 0-2, lo que para el dedo):</w:t>
+      </w:r>
+      <w:r>
+        <w:rPr>
+          <w:b w:val="0"/>
+          <w:i w:val="0"/>
+          <w:sz w:val="21"/>
+        </w:rPr>
+        <w:t xml:space="preserve"> Estudiante a cámara, en inglés, respondiendo "Tell me about yourself". Texto grande: "La familia te entrevista en inglés antes de elegirte."</w:t>
+      </w:r>
+    </w:p>
+    <w:p>
+      <w:pPr>
+        <w:spacing w:after="40"/>
+      </w:pPr>
+      <w:r>
+        <w:rPr>
+          <w:b/>
+          <w:i w:val="0"/>
+          <w:sz w:val="21"/>
+        </w:rPr>
+        <w:t>Qué vende:</w:t>
+      </w:r>
+      <w:r>
+        <w:rPr>
+          <w:b w:val="0"/>
+          <w:i w:val="0"/>
+          <w:sz w:val="21"/>
+        </w:rPr>
+        <w:t xml:space="preserve"> El destino #2 de la base: Au Pair, Work and Travel, Europa. Sin prometer familia, visa ni empleo: la entrevista es en inglés y aquí se ensaya.</w:t>
+      </w:r>
+    </w:p>
+    <w:p>
+      <w:pPr>
+        <w:spacing w:after="40"/>
+      </w:pPr>
+      <w:r>
+        <w:rPr>
+          <w:b/>
+          <w:i w:val="0"/>
+          <w:sz w:val="21"/>
+        </w:rPr>
+        <w:t>Quién habla:</w:t>
+      </w:r>
+      <w:r>
+        <w:rPr>
+          <w:b w:val="0"/>
+          <w:i w:val="0"/>
+          <w:sz w:val="21"/>
+        </w:rPr>
+        <w:t xml:space="preserve"> Simulación real del grupo B1/B2: entrevista con una familia o un empleador del exterior, un estudiante responde, otro hace de entrevistador. Luego un profe a cámara.   ·   </w:t>
+      </w:r>
+      <w:r>
+        <w:rPr>
+          <w:b/>
+          <w:i w:val="0"/>
+          <w:sz w:val="21"/>
+        </w:rPr>
+        <w:t>Duración:</w:t>
+      </w:r>
+      <w:r>
+        <w:rPr>
+          <w:b w:val="0"/>
+          <w:i w:val="0"/>
+          <w:sz w:val="21"/>
+        </w:rPr>
+        <w:t xml:space="preserve"> 25-30 s</w:t>
+      </w:r>
+    </w:p>
+    <w:p>
+      <w:pPr>
+        <w:spacing w:after="80"/>
+      </w:pPr>
+      <w:r>
+        <w:rPr>
+          <w:b/>
+          <w:i w:val="0"/>
+          <w:sz w:val="21"/>
+        </w:rPr>
+        <w:t>Qué se ve:</w:t>
+      </w:r>
+      <w:r>
+        <w:rPr>
+          <w:b w:val="0"/>
+          <w:i w:val="0"/>
+          <w:sz w:val="21"/>
+        </w:rPr>
+        <w:t xml:space="preserve"> Dos segundos de la entrevista en inglés; 8 segundos más de la simulación; profe a cámara; cierre.</w:t>
+      </w:r>
+    </w:p>
+    <w:p>
+      <w:pPr>
+        <w:spacing w:after="20"/>
+      </w:pPr>
+      <w:r>
+        <w:rPr>
+          <w:b/>
+          <w:i w:val="0"/>
+          <w:sz w:val="21"/>
+        </w:rPr>
+        <w:t>Texto (se dice tal cual, con subtítulos):</w:t>
+      </w:r>
+    </w:p>
+    <w:p>
+      <w:pPr>
+        <w:spacing w:after="40"/>
+      </w:pPr>
+      <w:r>
+        <w:rPr>
+          <w:b w:val="0"/>
+          <w:i/>
+          <w:sz w:val="21"/>
+        </w:rPr>
+        <w:t>"(simulación: "Tell me about yourself. Why do you want to live with a family abroad?")"</w:t>
+      </w:r>
+    </w:p>
+    <w:p>
+      <w:pPr>
+        <w:spacing w:after="40"/>
+      </w:pPr>
+      <w:r>
+        <w:rPr>
+          <w:b w:val="0"/>
+          <w:i/>
+          <w:sz w:val="21"/>
+        </w:rPr>
+        <w:t>"Profe: Au Pair, Work and Travel, Europa: ninguno te recibe por querer irte. Te reciben porque pasas la entrevista. Y la entrevista es en inglés."</w:t>
+      </w:r>
+    </w:p>
+    <w:p>
+      <w:pPr>
+        <w:spacing w:after="40"/>
+      </w:pPr>
+      <w:r>
+        <w:rPr>
+          <w:b w:val="0"/>
+          <w:i/>
+          <w:sz w:val="21"/>
+        </w:rPr>
+        <w:t>"Aquí la ensayamos hasta que la contestas sin pensar."</w:t>
+      </w:r>
+    </w:p>
+    <w:p>
+      <w:pPr>
+        <w:spacing w:after="40"/>
+      </w:pPr>
+      <w:r>
+        <w:rPr>
+          <w:b/>
+          <w:i w:val="0"/>
+          <w:sz w:val="21"/>
+        </w:rPr>
+        <w:t>Texto en pantalla:</w:t>
+      </w:r>
+      <w:r>
+        <w:rPr>
+          <w:b w:val="0"/>
+          <w:i w:val="0"/>
+          <w:sz w:val="21"/>
+        </w:rPr>
+        <w:t xml:space="preserve"> "El inglés es el pasaporte" · "Entrevista real en clase"</w:t>
+      </w:r>
+    </w:p>
+    <w:p>
+      <w:pPr>
+        <w:spacing w:after="40"/>
+      </w:pPr>
+      <w:r>
+        <w:rPr>
+          <w:b/>
+          <w:i w:val="0"/>
+          <w:sz w:val="21"/>
+        </w:rPr>
+        <w:t>Cierre:</w:t>
+      </w:r>
+      <w:r>
+        <w:rPr>
+          <w:b w:val="0"/>
+          <w:i w:val="0"/>
+          <w:sz w:val="21"/>
+        </w:rPr>
+        <w:t xml:space="preserve"> "Cuéntanos a dónde quieres ir y te decimos qué nivel te pide. Escríbenos." Botón: WhatsApp.</w:t>
+      </w:r>
+    </w:p>
+    <w:p>
+      <w:pPr>
+        <w:spacing w:after="80"/>
+      </w:pPr>
+      <w:r>
+        <w:rPr>
+          <w:b w:val="0"/>
+          <w:i w:val="0"/>
+          <w:color w:val="666666"/>
+          <w:sz w:val="19"/>
+        </w:rPr>
+        <w:t>Nota: Prohibido: "te conseguimos la familia / la visa / el empleo", nombres de agencias, países con salario prometido. Es preparación para la entrevista, no colocación. Prueba la hipótesis destino "irse" contra destino "trabajo aquí" (guion 3).</w:t>
+      </w:r>
+    </w:p>
+    <w:p>
+      <w:pPr>
         <w:spacing w:before="200" w:after="80"/>
       </w:pPr>
       <w:r>

</xml_diff>

<commit_message>
Guiones 09/10: seccion 'que vamos a lograr' (hipotesis por pieza, metricas 15-31/10)
Co-Authored-By: Claude Fable 5.1 <noreply@anthropic.com>
</commit_message>
<xml_diff>
--- a/recursos/comercial/campañas/GUIONES_GRABACION_2026-10-09.docx
+++ b/recursos/comercial/campañas/GUIONES_GRABACION_2026-10-09.docx
@@ -24,6 +24,410 @@
           <w:sz w:val="19"/>
         </w:rPr>
         <w:t>Venden el SERVICIO, no el producto: garantía por escrito, profesor que entrena (coach), acompañamiento diario, y un plan con fecha de llegada. Reglas del calendario: gancho de destino, sin precio ni nombre del programa, nunca "fácil", "rápido" ni "gratis"; caras de profes, estudiantes con cláusula de imagen y coordinación; nunca gerencia. Verticales (9:16), 20-30 segundos, subtítulos grandes. Cada guion abre con un GANCHO de 2 segundos (imagen + texto grande) que es lo que detiene el dedo; la clase, el profe o el contrato son la prueba que viene después. Cierre siempre a WhatsApp. GRUPO DISPONIBLE EL 09/10: un grupo de B1/B2 de 5 estudiantes; 3 de ellos empezaron de cero (A1) en Heiiu y tienen video de entrada en el portafolio: son los protagonistas de los guiones 2 y 6.</w:t>
+      </w:r>
+    </w:p>
+    <w:p>
+      <w:pPr>
+        <w:spacing w:before="200" w:after="80"/>
+      </w:pPr>
+      <w:r>
+        <w:rPr>
+          <w:b/>
+          <w:color w:val="E54C09"/>
+          <w:sz w:val="24"/>
+        </w:rPr>
+        <w:t>QUÉ VAMOS A LOGRAR CON ESTOS VIDEOS</w:t>
+      </w:r>
+    </w:p>
+    <w:p>
+      <w:pPr>
+        <w:spacing w:after="80"/>
+      </w:pPr>
+      <w:r>
+        <w:rPr>
+          <w:b w:val="0"/>
+          <w:i w:val="0"/>
+          <w:sz w:val="21"/>
+        </w:rPr>
+        <w:t>Una sola pregunta: ¿qué hace que un desconocido en Bucaramanga pida cita por una academia que no vende fácil? Cada pieza es una hipótesis distinta; del 15 al 31/10 corren con el mismo presupuesto, cada una en su propio conjunto de anuncios, y se miden tres números por pieza: costo por conversación, costo por cita atendida y citas. La que gane se queda con la pauta de noviembre y define el mensaje de todo (agente, flyers, asesoras); las demás se apagan.</w:t>
+      </w:r>
+    </w:p>
+    <w:tbl>
+      <w:tblPr>
+        <w:tblStyle w:val="TableGrid"/>
+        <w:tblW w:type="auto" w:w="0"/>
+        <w:tblLook w:firstColumn="1" w:firstRow="1" w:lastColumn="0" w:lastRow="0" w:noHBand="0" w:noVBand="1" w:val="04A0"/>
+      </w:tblPr>
+      <w:tblGrid>
+        <w:gridCol w:w="3280"/>
+        <w:gridCol w:w="3280"/>
+        <w:gridCol w:w="3280"/>
+      </w:tblGrid>
+      <w:tr>
+        <w:tc>
+          <w:tcPr>
+            <w:tcW w:type="dxa" w:w="3280"/>
+          </w:tcPr>
+          <w:p>
+            <w:r>
+              <w:rPr>
+                <w:b/>
+                <w:sz w:val="18"/>
+              </w:rPr>
+              <w:t>Pieza</w:t>
+            </w:r>
+          </w:p>
+        </w:tc>
+        <w:tc>
+          <w:tcPr>
+            <w:tcW w:type="dxa" w:w="3280"/>
+          </w:tcPr>
+          <w:p>
+            <w:r>
+              <w:rPr>
+                <w:b/>
+                <w:sz w:val="18"/>
+              </w:rPr>
+              <w:t>Hipótesis que prueba</w:t>
+            </w:r>
+          </w:p>
+        </w:tc>
+        <w:tc>
+          <w:tcPr>
+            <w:tcW w:type="dxa" w:w="3280"/>
+          </w:tcPr>
+          <w:p>
+            <w:r>
+              <w:rPr>
+                <w:b/>
+                <w:sz w:val="18"/>
+              </w:rPr>
+              <w:t>Gana si…</w:t>
+            </w:r>
+          </w:p>
+        </w:tc>
+      </w:tr>
+      <w:tr>
+        <w:tc>
+          <w:tcPr>
+            <w:tcW w:type="dxa" w:w="3280"/>
+          </w:tcPr>
+          <w:p>
+            <w:r>
+              <w:rPr>
+                <w:b/>
+                <w:sz w:val="18"/>
+              </w:rPr>
+              <w:t>6 "El video de hoy" + 2 "Esto es una clase"</w:t>
+            </w:r>
+          </w:p>
+        </w:tc>
+        <w:tc>
+          <w:tcPr>
+            <w:tcW w:type="dxa" w:w="3280"/>
+          </w:tcPr>
+          <w:p>
+            <w:r>
+              <w:rPr>
+                <w:b w:val="0"/>
+                <w:sz w:val="18"/>
+              </w:rPr>
+              <w:t>PRUEBA: ver gente real hablando convierte más que cualquier promesa (lo que dice el cliente que compró en otra parte: "no me importa la garantía si veo que los que muestran hablan").</w:t>
+            </w:r>
+          </w:p>
+        </w:tc>
+        <w:tc>
+          <w:tcPr>
+            <w:tcW w:type="dxa" w:w="3280"/>
+          </w:tcPr>
+          <w:p>
+            <w:r>
+              <w:rPr>
+                <w:b w:val="0"/>
+                <w:sz w:val="18"/>
+              </w:rPr>
+              <w:t>Menor costo por cita de todas.</w:t>
+            </w:r>
+          </w:p>
+        </w:tc>
+      </w:tr>
+      <w:tr>
+        <w:tc>
+          <w:tcPr>
+            <w:tcW w:type="dxa" w:w="3280"/>
+          </w:tcPr>
+          <w:p>
+            <w:r>
+              <w:rPr>
+                <w:b/>
+                <w:sz w:val="18"/>
+              </w:rPr>
+              <w:t>4 "Siete meses"</w:t>
+            </w:r>
+          </w:p>
+        </w:tc>
+        <w:tc>
+          <w:tcPr>
+            <w:tcW w:type="dxa" w:w="3280"/>
+          </w:tcPr>
+          <w:p>
+            <w:r>
+              <w:rPr>
+                <w:b w:val="0"/>
+                <w:sz w:val="18"/>
+              </w:rPr>
+              <w:t>VELOCIDAD CON NÚMERO: "7 meses, 575 horas" compite con el "rápido" de Open English y E4CC sin mentir; nadie más publica horas.</w:t>
+            </w:r>
+          </w:p>
+        </w:tc>
+        <w:tc>
+          <w:tcPr>
+            <w:tcW w:type="dxa" w:w="3280"/>
+          </w:tcPr>
+          <w:p>
+            <w:r>
+              <w:rPr>
+                <w:b w:val="0"/>
+                <w:sz w:val="18"/>
+              </w:rPr>
+              <w:t>Costo por cita igual o menor que las de prueba, y leads que ya no preguntan "¿cuánto dura?".</w:t>
+            </w:r>
+          </w:p>
+        </w:tc>
+      </w:tr>
+      <w:tr>
+        <w:tc>
+          <w:tcPr>
+            <w:tcW w:type="dxa" w:w="3280"/>
+          </w:tcPr>
+          <w:p>
+            <w:r>
+              <w:rPr>
+                <w:b/>
+                <w:sz w:val="18"/>
+              </w:rPr>
+              <w:t>3 "La vacante"</w:t>
+            </w:r>
+          </w:p>
+        </w:tc>
+        <w:tc>
+          <w:tcPr>
+            <w:tcW w:type="dxa" w:w="3280"/>
+          </w:tcPr>
+          <w:p>
+            <w:r>
+              <w:rPr>
+                <w:b w:val="0"/>
+                <w:sz w:val="18"/>
+              </w:rPr>
+              <w:t>DESTINO TRABAJO AQUÍ: el gancho de empleo trae las conversaciones más baratas (dato propio: destino cuesta la mitad que producto).</w:t>
+            </w:r>
+          </w:p>
+        </w:tc>
+        <w:tc>
+          <w:tcPr>
+            <w:tcW w:type="dxa" w:w="3280"/>
+          </w:tcPr>
+          <w:p>
+            <w:r>
+              <w:rPr>
+                <w:b w:val="0"/>
+                <w:sz w:val="18"/>
+              </w:rPr>
+              <w:t>Más conversaciones baratas, aunque conviertan menos a cita.</w:t>
+            </w:r>
+          </w:p>
+        </w:tc>
+      </w:tr>
+      <w:tr>
+        <w:tc>
+          <w:tcPr>
+            <w:tcW w:type="dxa" w:w="3280"/>
+          </w:tcPr>
+          <w:p>
+            <w:r>
+              <w:rPr>
+                <w:b/>
+                <w:sz w:val="18"/>
+              </w:rPr>
+              <w:t>8 "El pasaporte"</w:t>
+            </w:r>
+          </w:p>
+        </w:tc>
+        <w:tc>
+          <w:tcPr>
+            <w:tcW w:type="dxa" w:w="3280"/>
+          </w:tcPr>
+          <w:p>
+            <w:r>
+              <w:rPr>
+                <w:b w:val="0"/>
+                <w:sz w:val="18"/>
+              </w:rPr>
+              <w:t>DESTINO IRSE (Au Pair, Work and Travel, Europa): la conversación más barata de la base, sin confundirse con agencia de empleo.</w:t>
+            </w:r>
+          </w:p>
+        </w:tc>
+        <w:tc>
+          <w:tcPr>
+            <w:tcW w:type="dxa" w:w="3280"/>
+          </w:tcPr>
+          <w:p>
+            <w:r>
+              <w:rPr>
+                <w:b w:val="0"/>
+                <w:sz w:val="18"/>
+              </w:rPr>
+              <w:t>Conversaciones baratas que SÍ contestan al agente (hoy 3 de 5 creen que es una agencia).</w:t>
+            </w:r>
+          </w:p>
+        </w:tc>
+      </w:tr>
+      <w:tr>
+        <w:tc>
+          <w:tcPr>
+            <w:tcW w:type="dxa" w:w="3280"/>
+          </w:tcPr>
+          <w:p>
+            <w:r>
+              <w:rPr>
+                <w:b/>
+                <w:sz w:val="18"/>
+              </w:rPr>
+              <w:t>1 "Te lo firmamos"</w:t>
+            </w:r>
+          </w:p>
+        </w:tc>
+        <w:tc>
+          <w:tcPr>
+            <w:tcW w:type="dxa" w:w="3280"/>
+          </w:tcPr>
+          <w:p>
+            <w:r>
+              <w:rPr>
+                <w:b w:val="0"/>
+                <w:sz w:val="18"/>
+              </w:rPr>
+              <w:t>GARANTÍA COMO CIERRE, no como gancho: en retargeting (quien ya vio otra pieza o preguntó precio) sube la tasa de cita. Es donde está la rotura real: 284 preguntaron precio, 21 agendaron.</w:t>
+            </w:r>
+          </w:p>
+        </w:tc>
+        <w:tc>
+          <w:tcPr>
+            <w:tcW w:type="dxa" w:w="3280"/>
+          </w:tcPr>
+          <w:p>
+            <w:r>
+              <w:rPr>
+                <w:b w:val="0"/>
+                <w:sz w:val="18"/>
+              </w:rPr>
+              <w:t>Entre los que ya preguntaron precio, más citas que sin ella.</w:t>
+            </w:r>
+          </w:p>
+        </w:tc>
+      </w:tr>
+      <w:tr>
+        <w:tc>
+          <w:tcPr>
+            <w:tcW w:type="dxa" w:w="3280"/>
+          </w:tcPr>
+          <w:p>
+            <w:r>
+              <w:rPr>
+                <w:b/>
+                <w:sz w:val="18"/>
+              </w:rPr>
+              <w:t>5 "El Pacto"</w:t>
+            </w:r>
+          </w:p>
+        </w:tc>
+        <w:tc>
+          <w:tcPr>
+            <w:tcW w:type="dxa" w:w="3280"/>
+          </w:tcPr>
+          <w:p>
+            <w:r>
+              <w:rPr>
+                <w:b w:val="0"/>
+                <w:sz w:val="18"/>
+              </w:rPr>
+              <w:t>FILTRO: decir "no es fácil" trae menos leads pero más citas atendidas (menos "no contesta").</w:t>
+            </w:r>
+          </w:p>
+        </w:tc>
+        <w:tc>
+          <w:tcPr>
+            <w:tcW w:type="dxa" w:w="3280"/>
+          </w:tcPr>
+          <w:p>
+            <w:r>
+              <w:rPr>
+                <w:b w:val="0"/>
+                <w:sz w:val="18"/>
+              </w:rPr>
+              <w:t>Menos leads, mayor % que contesta y asiste a la cita.</w:t>
+            </w:r>
+          </w:p>
+        </w:tc>
+      </w:tr>
+      <w:tr>
+        <w:tc>
+          <w:tcPr>
+            <w:tcW w:type="dxa" w:w="3280"/>
+          </w:tcPr>
+          <w:p>
+            <w:r>
+              <w:rPr>
+                <w:b/>
+                <w:sz w:val="18"/>
+              </w:rPr>
+              <w:t>7 "Su hijo a los 18"</w:t>
+            </w:r>
+          </w:p>
+        </w:tc>
+        <w:tc>
+          <w:tcPr>
+            <w:tcW w:type="dxa" w:w="3280"/>
+          </w:tcPr>
+          <w:p>
+            <w:r>
+              <w:rPr>
+                <w:b w:val="0"/>
+                <w:sz w:val="18"/>
+              </w:rPr>
+              <w:t>PADRES: abre el grupo de la tarde y el sabatino con un comprador distinto (el acudiente).</w:t>
+            </w:r>
+          </w:p>
+        </w:tc>
+        <w:tc>
+          <w:tcPr>
+            <w:tcW w:type="dxa" w:w="3280"/>
+          </w:tcPr>
+          <w:p>
+            <w:r>
+              <w:rPr>
+                <w:b w:val="0"/>
+                <w:sz w:val="18"/>
+              </w:rPr>
+              <w:t>Citas con acudiente para la franja 1:30-6:00.</w:t>
+            </w:r>
+          </w:p>
+        </w:tc>
+      </w:tr>
+    </w:tbl>
+    <w:p>
+      <w:pPr>
+        <w:spacing w:after="160"/>
+      </w:pPr>
+      <w:r>
+        <w:rPr>
+          <w:b w:val="0"/>
+          <w:i w:val="0"/>
+          <w:color w:val="666666"/>
+          <w:sz w:val="19"/>
+        </w:rPr>
+        <w:t>Lo que NO se prueba porque ya se sabe que no diferencia: "fácil", "gratis", descuento, nombre del programa, miedo ("¿te congelas?"), profesores nativos.</w:t>
       </w:r>
     </w:p>
     <w:p>

</xml_diff>

<commit_message>
Guiones 09/10 cruzados con investigacion Meta: codigo V1-V8 y prellenado por pieza, ganchos sin atributos personales, zona segura Reels, Au Pair 'no somos agencia', lectura temprana
Co-Authored-By: Claude Fable 5.1 <noreply@anthropic.com>
</commit_message>
<xml_diff>
--- a/recursos/comercial/campañas/GUIONES_GRABACION_2026-10-09.docx
+++ b/recursos/comercial/campañas/GUIONES_GRABACION_2026-10-09.docx
@@ -418,6 +418,20 @@
     </w:tbl>
     <w:p>
       <w:pPr>
+        <w:spacing w:after="40"/>
+      </w:pPr>
+      <w:r>
+        <w:rPr>
+          <w:b w:val="0"/>
+          <w:i w:val="0"/>
+          <w:color w:val="666666"/>
+          <w:sz w:val="19"/>
+        </w:rPr>
+        <w:t>Cómo se lee (investigación Meta 08/10): con ~75 conversaciones en 17 días, el costo por cita por video no va a ser estadísticamente sólido; la lectura temprana se hace con tasa de gancho (vistas de 3 s ÷ impresiones), reproducción completa, CTR y costo por conversación. Ningún video se declara ganador con menos de 5 citas, y ninguno se apaga antes del corte del 22/10.</w:t>
+      </w:r>
+    </w:p>
+    <w:p>
+      <w:pPr>
         <w:spacing w:after="160"/>
       </w:pPr>
       <w:r>
@@ -531,7 +545,28 @@
           <w:color w:val="E54C09"/>
           <w:sz w:val="25"/>
         </w:rPr>
-        <w:t>GUION 1 — TE LO FIRMAMOS   [PRIORITARIO]</w:t>
+        <w:t>GUION 1 — TE LO FIRMAMOS   [PRIORITARIO]   · anuncio V6_GARANTIA</w:t>
+      </w:r>
+    </w:p>
+    <w:p>
+      <w:pPr>
+        <w:spacing w:after="40"/>
+      </w:pPr>
+      <w:r>
+        <w:rPr>
+          <w:b/>
+          <w:i w:val="0"/>
+          <w:sz w:val="21"/>
+        </w:rPr>
+        <w:t>Mensaje prellenado del botón de WhatsApp:</w:t>
+      </w:r>
+      <w:r>
+        <w:rPr>
+          <w:b w:val="0"/>
+          <w:i w:val="0"/>
+          <w:sz w:val="21"/>
+        </w:rPr>
+        <w:t xml:space="preserve"> "Hola, vi el video de la garantía (V6). ¿Me muestran el contrato?"</w:t>
       </w:r>
     </w:p>
     <w:p>
@@ -552,7 +587,7 @@
           <w:i w:val="0"/>
           <w:sz w:val="21"/>
         </w:rPr>
-        <w:t xml:space="preserve"> Jacqueline levanta el contrato a cámara. Texto grande: "Si no aprendes, te devolvemos el 100%. Firmado."</w:t>
+        <w:t xml:space="preserve"> Jacqueline levanta el contrato a cámara. Texto grande: "Si cumples y no avanzas, te devolvemos el 100%. Firmado."</w:t>
       </w:r>
     </w:p>
     <w:p>
@@ -752,7 +787,28 @@
           <w:color w:val="E54C09"/>
           <w:sz w:val="25"/>
         </w:rPr>
-        <w:t>GUION 2 — ESTO ES UNA CLASE   [PRIORITARIO]</w:t>
+        <w:t>GUION 2 — ESTO ES UNA CLASE   [PRIORITARIO]   · anuncio V2_CLASE</w:t>
+      </w:r>
+    </w:p>
+    <w:p>
+      <w:pPr>
+        <w:spacing w:after="40"/>
+      </w:pPr>
+      <w:r>
+        <w:rPr>
+          <w:b/>
+          <w:i w:val="0"/>
+          <w:sz w:val="21"/>
+        </w:rPr>
+        <w:t>Mensaje prellenado del botón de WhatsApp:</w:t>
+      </w:r>
+      <w:r>
+        <w:rPr>
+          <w:b w:val="0"/>
+          <w:i w:val="0"/>
+          <w:sz w:val="21"/>
+        </w:rPr>
+        <w:t xml:space="preserve"> "Hola, vi el video de la clase (V2). Quiero ver una por dentro."</w:t>
       </w:r>
     </w:p>
     <w:p>
@@ -773,7 +829,7 @@
           <w:i w:val="0"/>
           <w:sz w:val="21"/>
         </w:rPr>
-        <w:t xml:space="preserve"> Segundo 0: el estudiante de pie, a mitad de una frase en inglés, con el profe diciendo "Again. Louder." Texto grande: "Empezó de cero aquí. Escúchalo." Alternativa: "¿Cuánto llevas en: estoy aprendiendo inglés?"</w:t>
+        <w:t xml:space="preserve"> Segundo 0: el estudiante de pie, a mitad de una frase en inglés, con el profe diciendo "Again. Louder." Texto grande: "Empezó de cero aquí. Escúchalo." (Nunca ganchos que le atribuyan una carencia al que mira: política de Meta.)</w:t>
       </w:r>
     </w:p>
     <w:p>
@@ -960,7 +1016,28 @@
           <w:color w:val="E54C09"/>
           <w:sz w:val="25"/>
         </w:rPr>
-        <w:t>GUION 3 — LA VACANTE   [PRIORITARIO]</w:t>
+        <w:t>GUION 3 — LA VACANTE   [PRIORITARIO]   · anuncio V4_VACANTE</w:t>
+      </w:r>
+    </w:p>
+    <w:p>
+      <w:pPr>
+        <w:spacing w:after="40"/>
+      </w:pPr>
+      <w:r>
+        <w:rPr>
+          <w:b/>
+          <w:i w:val="0"/>
+          <w:sz w:val="21"/>
+        </w:rPr>
+        <w:t>Mensaje prellenado del botón de WhatsApp:</w:t>
+      </w:r>
+      <w:r>
+        <w:rPr>
+          <w:b w:val="0"/>
+          <w:i w:val="0"/>
+          <w:sz w:val="21"/>
+        </w:rPr>
+        <w:t xml:space="preserve"> "Hola, vi el video de la vacante (V4). Necesito el inglés para el trabajo."</w:t>
       </w:r>
     </w:p>
     <w:p>
@@ -981,7 +1058,7 @@
           <w:i w:val="0"/>
           <w:sz w:val="21"/>
         </w:rPr>
-        <w:t xml:space="preserve"> Texto grande sobre el profe mirando a cámara en silencio 1 segundo: "Decía: inglés intermedio. Y la cerraste."</w:t>
+        <w:t xml:space="preserve"> Texto grande sobre el profe mirando a cámara en silencio 1 segundo: "La vacante decía: inglés intermedio." (En tercera persona, no "tú no sabes": política de atributos personales de Meta.)</w:t>
       </w:r>
     </w:p>
     <w:p>
@@ -1086,7 +1163,7 @@
           <w:i/>
           <w:sz w:val="21"/>
         </w:rPr>
-        <w:t>"¿Cuántas vacantes has dejado pasar porque decían "inglés intermedio"?"</w:t>
+        <w:t>"Hay vacantes que dicen "inglés intermedio". Ese renglón deja a mucha gente por fuera."</w:t>
       </w:r>
     </w:p>
     <w:p>
@@ -1099,7 +1176,7 @@
           <w:i/>
           <w:sz w:val="21"/>
         </w:rPr>
-        <w:t>"El inglés no te da el puesto. Te quita la excusa que hoy te lo cierra."</w:t>
+        <w:t>"El inglés no da el puesto. Quita el requisito que lo cierra."</w:t>
       </w:r>
     </w:p>
     <w:p>
@@ -1112,7 +1189,7 @@
           <w:i/>
           <w:sz w:val="21"/>
         </w:rPr>
-        <w:t>"Aquí entrenamos esa entrevista hasta que la haces sin pensar."</w:t>
+        <w:t>"Aquí entrenamos esa entrevista hasta que se contesta sin pensar."</w:t>
       </w:r>
     </w:p>
     <w:p>
@@ -1133,7 +1210,7 @@
           <w:i w:val="0"/>
           <w:sz w:val="21"/>
         </w:rPr>
-        <w:t xml:space="preserve"> "La vacante que hoy pasas de largo" · "Entrenamos la entrevista en clase"</w:t>
+        <w:t xml:space="preserve"> "La vacante decía: inglés intermedio" · "Entrenamos la entrevista en clase"</w:t>
       </w:r>
     </w:p>
     <w:p>
@@ -1181,7 +1258,28 @@
           <w:color w:val="E54C09"/>
           <w:sz w:val="25"/>
         </w:rPr>
-        <w:t>GUION 4 — SIETE MESES   [PRIORITARIO]</w:t>
+        <w:t>GUION 4 — SIETE MESES   [PRIORITARIO]   · anuncio V3_575H</w:t>
+      </w:r>
+    </w:p>
+    <w:p>
+      <w:pPr>
+        <w:spacing w:after="40"/>
+      </w:pPr>
+      <w:r>
+        <w:rPr>
+          <w:b/>
+          <w:i w:val="0"/>
+          <w:sz w:val="21"/>
+        </w:rPr>
+        <w:t>Mensaje prellenado del botón de WhatsApp:</w:t>
+      </w:r>
+      <w:r>
+        <w:rPr>
+          <w:b w:val="0"/>
+          <w:i w:val="0"/>
+          <w:sz w:val="21"/>
+        </w:rPr>
+        <w:t xml:space="preserve"> "Hola, vi el video de los 7 meses (V3). ¿Qué jornada me sirve?"</w:t>
       </w:r>
     </w:p>
     <w:p>
@@ -1202,7 +1300,7 @@
           <w:i w:val="0"/>
           <w:sz w:val="21"/>
         </w:rPr>
-        <w:t xml:space="preserve"> El profe escribe en el tablero un "5 AÑOS" grande y lo tacha. Texto: "Lo que tarda el inglés a 2 horas por semana."</w:t>
+        <w:t xml:space="preserve"> El profe escribe en el tablero un "5 AÑOS" grande y lo tacha. Texto: "Lo que tarda el inglés a 2 horas por semana." Política: "7 meses" es descripción del programa; jamás "garantizado que hablas en 7 meses".</w:t>
       </w:r>
     </w:p>
     <w:p>
@@ -1402,7 +1500,28 @@
           <w:color w:val="E54C09"/>
           <w:sz w:val="25"/>
         </w:rPr>
-        <w:t>GUION 5 — EL PACTO   [ALTERNO]</w:t>
+        <w:t>GUION 5 — EL PACTO   [ALTERNO]   · anuncio V7_NOESFACIL</w:t>
+      </w:r>
+    </w:p>
+    <w:p>
+      <w:pPr>
+        <w:spacing w:after="40"/>
+      </w:pPr>
+      <w:r>
+        <w:rPr>
+          <w:b/>
+          <w:i w:val="0"/>
+          <w:sz w:val="21"/>
+        </w:rPr>
+        <w:t>Mensaje prellenado del botón de WhatsApp:</w:t>
+      </w:r>
+      <w:r>
+        <w:rPr>
+          <w:b w:val="0"/>
+          <w:i w:val="0"/>
+          <w:sz w:val="21"/>
+        </w:rPr>
+        <w:t xml:space="preserve"> "Hola, vi el video de lo que no prometen (V7). Voy en serio."</w:t>
       </w:r>
     </w:p>
     <w:p>
@@ -1623,7 +1742,28 @@
           <w:color w:val="E54C09"/>
           <w:sz w:val="25"/>
         </w:rPr>
-        <w:t>GUION 6 — EL VIDEO DE HOY   [PRIORITARIO]</w:t>
+        <w:t>GUION 6 — EL VIDEO DE HOY   [PRIORITARIO]   · anuncio V1_VIDEODEHOY</w:t>
+      </w:r>
+    </w:p>
+    <w:p>
+      <w:pPr>
+        <w:spacing w:after="40"/>
+      </w:pPr>
+      <w:r>
+        <w:rPr>
+          <w:b/>
+          <w:i w:val="0"/>
+          <w:sz w:val="21"/>
+        </w:rPr>
+        <w:t>Mensaje prellenado del botón de WhatsApp:</w:t>
+      </w:r>
+      <w:r>
+        <w:rPr>
+          <w:b w:val="0"/>
+          <w:i w:val="0"/>
+          <w:sz w:val="21"/>
+        </w:rPr>
+        <w:t xml:space="preserve"> "Hola, vi el video del antes y después (V1). Quiero saber más."</w:t>
       </w:r>
     </w:p>
     <w:p>
@@ -1644,7 +1784,7 @@
           <w:i w:val="0"/>
           <w:sz w:val="21"/>
         </w:rPr>
-        <w:t xml:space="preserve"> Segundo 0: su video de entrada, nervioso, sin poder terminar la frase. Texto grande: "Día 1." Corte seco al de hoy hablando de corrido: "Hoy."</w:t>
+        <w:t xml:space="preserve"> Segundo 0: su video de entrada, nervioso, sin poder terminar la frase. Texto grande: "Día 1." Corte seco al de hoy hablando de corrido: "Hoy." VERSIÓN B (testimonio, el formato con mejor tasa de acierto según Motion 2026): el mismo estudiante a cámara, en español, 5 segundos: "Empecé de cero hace ___ meses" (dato real) y luego 5 segundos hablando en inglés.</w:t>
       </w:r>
     </w:p>
     <w:p>
@@ -1844,7 +1984,28 @@
           <w:color w:val="E54C09"/>
           <w:sz w:val="25"/>
         </w:rPr>
-        <w:t>GUION 7 — SU HIJO A LOS 18   [ALTERNO (para el grupo de la tarde y el sabatino)]</w:t>
+        <w:t>GUION 7 — SU HIJO A LOS 18   [ALTERNO (para el grupo de la tarde y el sabatino)]   · anuncio V8_PADRES</w:t>
+      </w:r>
+    </w:p>
+    <w:p>
+      <w:pPr>
+        <w:spacing w:after="40"/>
+      </w:pPr>
+      <w:r>
+        <w:rPr>
+          <w:b/>
+          <w:i w:val="0"/>
+          <w:sz w:val="21"/>
+        </w:rPr>
+        <w:t>Mensaje prellenado del botón de WhatsApp:</w:t>
+      </w:r>
+      <w:r>
+        <w:rPr>
+          <w:b w:val="0"/>
+          <w:i w:val="0"/>
+          <w:sz w:val="21"/>
+        </w:rPr>
+        <w:t xml:space="preserve"> "Hola, vi el video para padres (V8). Es para mi hijo/a."</w:t>
       </w:r>
     </w:p>
     <w:p>
@@ -2065,7 +2226,28 @@
           <w:color w:val="E54C09"/>
           <w:sz w:val="25"/>
         </w:rPr>
-        <w:t>GUION 8 — EL PASAPORTE   [PRIORITARIO (destino: irse)]</w:t>
+        <w:t>GUION 8 — EL PASAPORTE   [PRIORITARIO (destino: irse)]   · anuncio V5_PASAPORTE</w:t>
+      </w:r>
+    </w:p>
+    <w:p>
+      <w:pPr>
+        <w:spacing w:after="40"/>
+      </w:pPr>
+      <w:r>
+        <w:rPr>
+          <w:b/>
+          <w:i w:val="0"/>
+          <w:sz w:val="21"/>
+        </w:rPr>
+        <w:t>Mensaje prellenado del botón de WhatsApp:</w:t>
+      </w:r>
+      <w:r>
+        <w:rPr>
+          <w:b w:val="0"/>
+          <w:i w:val="0"/>
+          <w:sz w:val="21"/>
+        </w:rPr>
+        <w:t xml:space="preserve"> "Hola, quiero prepararme en inglés para Au Pair / irme (V5)."</w:t>
       </w:r>
     </w:p>
     <w:p>
@@ -2086,7 +2268,7 @@
           <w:i w:val="0"/>
           <w:sz w:val="21"/>
         </w:rPr>
-        <w:t xml:space="preserve"> Estudiante a cámara, en inglés, respondiendo "Tell me about yourself". Texto grande: "La familia te entrevista en inglés antes de elegirte."</w:t>
+        <w:t xml:space="preserve"> Estudiante a cámara, en inglés, respondiendo "Tell me about yourself". Texto grande: "La familia te entrevista en inglés antes de elegirte." Texto del anuncio (no del video), primera línea obligatoria: "No somos agencia: te preparamos en inglés para la entrevista de Au Pair o de trabajo en el exterior. El trámite lo haces con la agencia que elijas."</w:t>
       </w:r>
     </w:p>
     <w:p>
@@ -2238,7 +2420,7 @@
           <w:i w:val="0"/>
           <w:sz w:val="21"/>
         </w:rPr>
-        <w:t xml:space="preserve"> "El inglés es el pasaporte" · "Entrevista real en clase"</w:t>
+        <w:t xml:space="preserve"> "No somos agencia. Te preparamos para la entrevista" · "El inglés es el pasaporte"</w:t>
       </w:r>
     </w:p>
     <w:p>
@@ -2299,7 +2481,20 @@
           <w:i w:val="0"/>
           <w:sz w:val="21"/>
         </w:rPr>
-        <w:t>• Vertical 9:16, subtítulos grandes desde el primer segundo, sin música encima de la voz en los guiones 1, 5 y 6.</w:t>
+        <w:t>• Vertical 9:16, subtítulos grandes desde el primer segundo, sin música encima de la voz en los guiones 1, 5 y 6. Texto y subtítulos dentro de la ZONA SEGURA de Reels (ni en el 14% superior ni en el 35% inferior de la pantalla); audio siempre (Meta: video 9:16 con audio y texto en zona segura = 34,5% menos costo por resultado que imágenes).</w:t>
+      </w:r>
+    </w:p>
+    <w:p>
+      <w:pPr>
+        <w:spacing w:after="40"/>
+      </w:pPr>
+      <w:r>
+        <w:rPr>
+          <w:b w:val="0"/>
+          <w:i w:val="0"/>
+          <w:sz w:val="21"/>
+        </w:rPr>
+        <w:t>• Cada video lleva su código de anuncio (V1-V8) y su mensaje prellenado (están en cada guion): el editor nombra el archivo con el código.</w:t>
       </w:r>
     </w:p>
     <w:p>

</xml_diff>

<commit_message>
Guiones 09/10 v final: correcciones de consistencia (rapido/firmamos), confesion en G6-B, reciprocidad (guion 9 correccion del dia + cierre audio), Bucaramanga en G3/G8; anexo investigacion ganchos y persuasion
Co-Authored-By: Claude Fable 5.1 <noreply@anthropic.com>
</commit_message>
<xml_diff>
--- a/recursos/comercial/campañas/GUIONES_GRABACION_2026-10-09.docx
+++ b/recursos/comercial/campañas/GUIONES_GRABACION_2026-10-09.docx
@@ -532,7 +532,20 @@
           <w:i w:val="0"/>
           <w:sz w:val="21"/>
         </w:rPr>
-        <w:t>6. Si hay tiempo: GUION 5 "El Pacto" (filtro, poco volumen), GUION 7 "Su hijo a los 18".</w:t>
+        <w:t>6. GUION 9 "La corrección del día": 10 minutos, el único que da algo antes de pedir (reciprocidad).</w:t>
+      </w:r>
+    </w:p>
+    <w:p>
+      <w:pPr>
+        <w:spacing w:after="40"/>
+      </w:pPr>
+      <w:r>
+        <w:rPr>
+          <w:b w:val="0"/>
+          <w:i w:val="0"/>
+          <w:sz w:val="21"/>
+        </w:rPr>
+        <w:t>7. Si hay tiempo: GUION 5 "El Pacto" (filtro, poco volumen), GUION 7 "Su hijo a los 18".</w:t>
       </w:r>
     </w:p>
     <w:p>
@@ -718,7 +731,7 @@
           <w:i/>
           <w:sz w:val="21"/>
         </w:rPr>
-        <w:t>"No te pedimos que nos creas. Te pedimos que leas."</w:t>
+        <w:t>"Si cumples y no avanzas, el que pierde plata somos nosotros. No te pedimos que nos creas: te pedimos que leas."</w:t>
       </w:r>
     </w:p>
     <w:p>
@@ -989,7 +1002,7 @@
           <w:i w:val="0"/>
           <w:sz w:val="21"/>
         </w:rPr>
-        <w:t xml:space="preserve"> "¿Quieres ver una clase así por dentro? Escríbenos." Botón: WhatsApp.</w:t>
+        <w:t xml:space="preserve"> "¿Quieres ver una clase así por dentro? Escríbenos." Botón: WhatsApp. VARIANTE DE CIERRE (grabar también): "Mándanos un audio de 30 segundos y te decimos tu nivel." (misma condición que el guion 6).</w:t>
       </w:r>
     </w:p>
     <w:p>
@@ -1137,7 +1150,7 @@
           <w:i w:val="0"/>
           <w:sz w:val="21"/>
         </w:rPr>
-        <w:t xml:space="preserve"> Plano medio fijo. Al final, corte a 2 segundos de una simulación de entrevista de trabajo en clase.</w:t>
+        <w:t xml:space="preserve"> Abre con 1 segundo de la fachada y el texto "Aquí, en Bucaramanga" (lo que Open English, Platzi y E4CC no pueden decir). Plano medio fijo. Al final, corte a 2 segundos de una simulación de entrevista de trabajo en clase.</w:t>
       </w:r>
     </w:p>
     <w:p>
@@ -1189,7 +1202,7 @@
           <w:i/>
           <w:sz w:val="21"/>
         </w:rPr>
-        <w:t>"Aquí entrenamos esa entrevista hasta que se contesta sin pensar."</w:t>
+        <w:t>"En clase ensayamos esa pregunta: "Tell me about yourself". Hasta que se contesta sin pensar."</w:t>
       </w:r>
     </w:p>
     <w:p>
@@ -1210,7 +1223,7 @@
           <w:i w:val="0"/>
           <w:sz w:val="21"/>
         </w:rPr>
-        <w:t xml:space="preserve"> "La vacante decía: inglés intermedio" · "Entrenamos la entrevista en clase"</w:t>
+        <w:t xml:space="preserve"> "Aquí, en Bucaramanga" · "La vacante decía: inglés intermedio" · "Entrenamos la entrevista en clase"</w:t>
       </w:r>
     </w:p>
     <w:p>
@@ -1231,7 +1244,7 @@
           <w:i w:val="0"/>
           <w:sz w:val="21"/>
         </w:rPr>
-        <w:t xml:space="preserve"> "Cuéntanos para qué necesitas el inglés y te decimos por dónde empezar. Escríbenos." Botón: WhatsApp.</w:t>
+        <w:t xml:space="preserve"> "Cuéntanos para qué necesitas el inglés y te decimos por dónde empezar. Escríbenos." Botón: WhatsApp. VARIANTE DE CIERRE: "Mándanos un audio de 30 segundos y te decimos tu nivel." (misma condición que el guion 6).</w:t>
       </w:r>
     </w:p>
     <w:p>
@@ -1431,7 +1444,20 @@
           <w:i/>
           <w:sz w:val="21"/>
         </w:rPr>
-        <w:t>"No es fácil. Es rápido porque es intenso. Y te lo firmamos."</w:t>
+        <w:t>"No es fácil. Es rápido porque es intenso."</w:t>
+      </w:r>
+    </w:p>
+    <w:p>
+      <w:pPr>
+        <w:spacing w:after="40"/>
+      </w:pPr>
+      <w:r>
+        <w:rPr>
+          <w:b w:val="0"/>
+          <w:i/>
+          <w:sz w:val="21"/>
+        </w:rPr>
+        <w:t>"Lo que firmamos: si cumples y no avanzas, te devolvemos el nivel."</w:t>
       </w:r>
     </w:p>
     <w:p>
@@ -1647,7 +1673,7 @@
           <w:i/>
           <w:sz w:val="21"/>
         </w:rPr>
-        <w:t>"Te voy a decir lo que no te prometemos: que sea fácil, que sea rápido, o que te guste todos los días. Vas a tener clases pesadas y días de no querer venir."</w:t>
+        <w:t>"Te voy a decir lo que no te prometemos: que sea fácil, ni que te guste todos los días. Vas a tener clases pesadas y días de no querer venir."</w:t>
       </w:r>
     </w:p>
     <w:p>
@@ -1784,7 +1810,7 @@
           <w:i w:val="0"/>
           <w:sz w:val="21"/>
         </w:rPr>
-        <w:t xml:space="preserve"> Segundo 0: su video de entrada, nervioso, sin poder terminar la frase. Texto grande: "Día 1." Corte seco al de hoy hablando de corrido: "Hoy." VERSIÓN B (testimonio, el formato con mejor tasa de acierto según Motion 2026): el mismo estudiante a cámara, en español, 5 segundos: "Empecé de cero hace ___ meses" (dato real) y luego 5 segundos hablando en inglés.</w:t>
+        <w:t xml:space="preserve"> Segundo 0: su video de entrada, nervioso, sin poder terminar la frase. Texto grande: "Día 1." Corte seco al de hoy hablando de corrido: "Hoy." VERSIÓN B (formato CONFESIÓN, top 5 de ganchos por tasa de acierto en Motion 2026): el mismo estudiante a cámara, en español, 3 segundos: "Mi video del día 1 me da vergüenza. Mírenlo." → corte a su video de entrada → corte a él hoy en inglés. En pantalla los datos exactos: "___ meses · ___ horas de clase" (de la ficha del estudiante; el antes/después vago ya no convence).</w:t>
       </w:r>
     </w:p>
     <w:p>
@@ -1936,7 +1962,7 @@
           <w:i w:val="0"/>
           <w:sz w:val="21"/>
         </w:rPr>
-        <w:t xml:space="preserve"> "Día 1" · "Hoy (hace ___ meses)" · "Un video al día. Un profesor que lo revisa."</w:t>
+        <w:t xml:space="preserve"> "Día 1" · "Hoy: ___ meses, ___ horas de clase" (datos reales de la ficha) · "Un video al día. Un profesor que lo revisa."</w:t>
       </w:r>
     </w:p>
     <w:p>
@@ -1957,7 +1983,7 @@
           <w:i w:val="0"/>
           <w:sz w:val="21"/>
         </w:rPr>
-        <w:t xml:space="preserve"> "¿Quieres que te acompañen así? Escríbenos." Botón: WhatsApp.</w:t>
+        <w:t xml:space="preserve"> "¿Quieres que te acompañen así? Escríbenos." Botón: WhatsApp. VARIANTE DE CIERRE (grabar también, 5 s del profe): "Mándanos un audio de 30 segundos y te decimos tu nivel." Solo se publica si el agente recibe audios y alguien los responde en menos de 24 h; si no, "te decimos tu nivel en la cita".</w:t>
       </w:r>
     </w:p>
     <w:p>
@@ -2131,7 +2157,7 @@
           <w:i/>
           <w:sz w:val="21"/>
         </w:rPr>
-        <w:t>"Imagínese a su hijo a los dieciocho con el inglés resuelto: la universidad o la beca sin ese requisito pendiente."</w:t>
+        <w:t>"En grado once, el Saber 11 ya le evalúa inglés. Imagínese a su hijo a los dieciocho con eso resuelto: la universidad o la beca sin ese requisito pendiente."</w:t>
       </w:r>
     </w:p>
     <w:p>
@@ -2347,7 +2373,7 @@
           <w:i w:val="0"/>
           <w:sz w:val="21"/>
         </w:rPr>
-        <w:t xml:space="preserve"> Dos segundos de la entrevista en inglés; 8 segundos más de la simulación; profe a cámara; cierre.</w:t>
+        <w:t xml:space="preserve"> Abre con 1 segundo de la fachada y el texto "Aquí, en Bucaramanga". Dos segundos de la entrevista en inglés; 8 segundos más de la simulación; profe a cámara; cierre.</w:t>
       </w:r>
     </w:p>
     <w:p>
@@ -2399,7 +2425,7 @@
           <w:i/>
           <w:sz w:val="21"/>
         </w:rPr>
-        <w:t>"Aquí la ensayamos hasta que la contestas sin pensar."</w:t>
+        <w:t>"Sin la entrevista en inglés, el proceso se detiene ahí. Aquí la ensayamos hasta que la contestas sin pensar."</w:t>
       </w:r>
     </w:p>
     <w:p>
@@ -2460,6 +2486,248 @@
     </w:p>
     <w:p>
       <w:pPr>
+        <w:spacing w:before="280" w:after="80"/>
+      </w:pPr>
+      <w:r>
+        <w:rPr>
+          <w:b/>
+          <w:color w:val="E54C09"/>
+          <w:sz w:val="25"/>
+        </w:rPr>
+        <w:t>GUION 9 — LA CORRECCIÓN DEL DÍA   [PRIORITARIO (10 minutos; el único que da algo antes de pedir)]   · anuncio V9_CORRECCION</w:t>
+      </w:r>
+    </w:p>
+    <w:p>
+      <w:pPr>
+        <w:spacing w:after="40"/>
+      </w:pPr>
+      <w:r>
+        <w:rPr>
+          <w:b/>
+          <w:i w:val="0"/>
+          <w:sz w:val="21"/>
+        </w:rPr>
+        <w:t>Mensaje prellenado del botón de WhatsApp:</w:t>
+      </w:r>
+      <w:r>
+        <w:rPr>
+          <w:b w:val="0"/>
+          <w:i w:val="0"/>
+          <w:sz w:val="21"/>
+        </w:rPr>
+        <w:t xml:space="preserve"> "Hola, vi la corrección del día (V9). Aquí va mi audio."</w:t>
+      </w:r>
+    </w:p>
+    <w:p>
+      <w:pPr>
+        <w:spacing w:after="40"/>
+      </w:pPr>
+      <w:r>
+        <w:rPr>
+          <w:b/>
+          <w:i w:val="0"/>
+          <w:sz w:val="21"/>
+        </w:rPr>
+        <w:t>GANCHO (segundos 0-2, lo que para el dedo):</w:t>
+      </w:r>
+      <w:r>
+        <w:rPr>
+          <w:b w:val="0"/>
+          <w:i w:val="0"/>
+          <w:sz w:val="21"/>
+        </w:rPr>
+        <w:t xml:space="preserve"> Segundo 0: el marcador escribiendo el error en el tablero. Texto grande: "El error que más oigo en clase."</w:t>
+      </w:r>
+    </w:p>
+    <w:p>
+      <w:pPr>
+        <w:spacing w:after="40"/>
+      </w:pPr>
+      <w:r>
+        <w:rPr>
+          <w:b/>
+          <w:i w:val="0"/>
+          <w:sz w:val="21"/>
+        </w:rPr>
+        <w:t>Qué vende:</w:t>
+      </w:r>
+      <w:r>
+        <w:rPr>
+          <w:b w:val="0"/>
+          <w:i w:val="0"/>
+          <w:sz w:val="21"/>
+        </w:rPr>
+        <w:t xml:space="preserve"> Reciprocidad + valor primero: el único formato tutorial del set. Muestra cómo se corrige en Heiiu y regala una corrección real.</w:t>
+      </w:r>
+    </w:p>
+    <w:p>
+      <w:pPr>
+        <w:spacing w:after="40"/>
+      </w:pPr>
+      <w:r>
+        <w:rPr>
+          <w:b/>
+          <w:i w:val="0"/>
+          <w:sz w:val="21"/>
+        </w:rPr>
+        <w:t>Quién habla:</w:t>
+      </w:r>
+      <w:r>
+        <w:rPr>
+          <w:b w:val="0"/>
+          <w:i w:val="0"/>
+          <w:sz w:val="21"/>
+        </w:rPr>
+        <w:t xml:space="preserve"> El profe en el tablero con el grupo B1/B2 de pie. El error sale del ERROR PAPER real del grupo (anónimo); no se inventa.   ·   </w:t>
+      </w:r>
+      <w:r>
+        <w:rPr>
+          <w:b/>
+          <w:i w:val="0"/>
+          <w:sz w:val="21"/>
+        </w:rPr>
+        <w:t>Duración:</w:t>
+      </w:r>
+      <w:r>
+        <w:rPr>
+          <w:b w:val="0"/>
+          <w:i w:val="0"/>
+          <w:sz w:val="21"/>
+        </w:rPr>
+        <w:t xml:space="preserve"> 15-20 s</w:t>
+      </w:r>
+    </w:p>
+    <w:p>
+      <w:pPr>
+        <w:spacing w:after="80"/>
+      </w:pPr>
+      <w:r>
+        <w:rPr>
+          <w:b/>
+          <w:i w:val="0"/>
+          <w:sz w:val="21"/>
+        </w:rPr>
+        <w:t>Qué se ve:</w:t>
+      </w:r>
+      <w:r>
+        <w:rPr>
+          <w:b w:val="0"/>
+          <w:i w:val="0"/>
+          <w:sz w:val="21"/>
+        </w:rPr>
+        <w:t xml:space="preserve"> Segundos 0-2: el profe escribe el error real en el tablero. Segundos 2-8: lo tacha y escribe la forma correcta; debajo queda la Frase del Día. Segundos 8-14: los estudiantes la repiten de pie; uno de los que empezó de cero la usa en una frase propia. Cierre del profe a cámara.</w:t>
+      </w:r>
+    </w:p>
+    <w:p>
+      <w:pPr>
+        <w:spacing w:after="20"/>
+      </w:pPr>
+      <w:r>
+        <w:rPr>
+          <w:b/>
+          <w:i w:val="0"/>
+          <w:sz w:val="21"/>
+        </w:rPr>
+        <w:t>Texto (se dice tal cual, con subtítulos):</w:t>
+      </w:r>
+    </w:p>
+    <w:p>
+      <w:pPr>
+        <w:spacing w:after="40"/>
+      </w:pPr>
+      <w:r>
+        <w:rPr>
+          <w:b w:val="0"/>
+          <w:i/>
+          <w:sz w:val="21"/>
+        </w:rPr>
+        <w:t>"(profe escribe el error, lo tacha, escribe la forma correcta y la dice en voz alta)"</w:t>
+      </w:r>
+    </w:p>
+    <w:p>
+      <w:pPr>
+        <w:spacing w:after="40"/>
+      </w:pPr>
+      <w:r>
+        <w:rPr>
+          <w:b w:val="0"/>
+          <w:i/>
+          <w:sz w:val="21"/>
+        </w:rPr>
+        <w:t>"Profe: Este es el error que más oigo. Así se corrige. Repeat."</w:t>
+      </w:r>
+    </w:p>
+    <w:p>
+      <w:pPr>
+        <w:spacing w:after="40"/>
+      </w:pPr>
+      <w:r>
+        <w:rPr>
+          <w:b w:val="0"/>
+          <w:i/>
+          <w:sz w:val="21"/>
+        </w:rPr>
+        <w:t>"Profe a cámara: Mándanos un audio diciéndola y te la corregimos."</w:t>
+      </w:r>
+    </w:p>
+    <w:p>
+      <w:pPr>
+        <w:spacing w:after="40"/>
+      </w:pPr>
+      <w:r>
+        <w:rPr>
+          <w:b/>
+          <w:i w:val="0"/>
+          <w:sz w:val="21"/>
+        </w:rPr>
+        <w:t>Texto en pantalla:</w:t>
+      </w:r>
+      <w:r>
+        <w:rPr>
+          <w:b w:val="0"/>
+          <w:i w:val="0"/>
+          <w:sz w:val="21"/>
+        </w:rPr>
+        <w:t xml:space="preserve"> "El error que más oigo en clase" · la forma correcta en el tablero · "Así se corrige en Heiiu"</w:t>
+      </w:r>
+    </w:p>
+    <w:p>
+      <w:pPr>
+        <w:spacing w:after="40"/>
+      </w:pPr>
+      <w:r>
+        <w:rPr>
+          <w:b/>
+          <w:i w:val="0"/>
+          <w:sz w:val="21"/>
+        </w:rPr>
+        <w:t>Cierre:</w:t>
+      </w:r>
+      <w:r>
+        <w:rPr>
+          <w:b w:val="0"/>
+          <w:i w:val="0"/>
+          <w:sz w:val="21"/>
+        </w:rPr>
+        <w:t xml:space="preserve"> "Mándanos un audio diciéndola y te la corregimos." Botón: WhatsApp. (Si el agente no recibe audios: "Escríbenos y te decimos tu nivel en la cita".)</w:t>
+      </w:r>
+    </w:p>
+    <w:p>
+      <w:pPr>
+        <w:spacing w:after="80"/>
+      </w:pPr>
+      <w:r>
+        <w:rPr>
+          <w:b w:val="0"/>
+          <w:i w:val="0"/>
+          <w:color w:val="666666"/>
+          <w:sz w:val="19"/>
+        </w:rPr>
+        <w:t>Nota: Sin la palabra "gratis". Es la pieza que prueba la hipótesis de dar valor primero (Freedman y Fraser 1966: un pedido pequeño sube la aceptación del grande).</w:t>
+      </w:r>
+    </w:p>
+    <w:p>
+      <w:pPr>
         <w:spacing w:before="200" w:after="80"/>
       </w:pPr>
       <w:r>
@@ -2494,7 +2762,20 @@
           <w:i w:val="0"/>
           <w:sz w:val="21"/>
         </w:rPr>
-        <w:t>• Cada video lleva su código de anuncio (V1-V8) y su mensaje prellenado (están en cada guion): el editor nombra el archivo con el código.</w:t>
+        <w:t>• DATOS A CONFIRMAR ANTES DE PUBLICAR (no se inventan): meses y horas reales de cada uno de los 3 estudiantes que empezaron de cero (guiones 2, 4, 6); que el agente de WhatsApp recibe audios y alguien los responde en menos de 24 h (cierres de reciprocidad); el error real del error paper (guion 9).</w:t>
+      </w:r>
+    </w:p>
+    <w:p>
+      <w:pPr>
+        <w:spacing w:after="40"/>
+      </w:pPr>
+      <w:r>
+        <w:rPr>
+          <w:b w:val="0"/>
+          <w:i w:val="0"/>
+          <w:sz w:val="21"/>
+        </w:rPr>
+        <w:t>• Cada video lleva su código de anuncio (V1-V9) y su mensaje prellenado (están en cada guion): el editor nombra el archivo con el código.</w:t>
       </w:r>
     </w:p>
     <w:p>

</xml_diff>

<commit_message>
Guiones 09/10: plan de la jornada (logistica, permisos, orden cronologico, entregables del editor)
Co-Authored-By: Claude Fable 5.1 <noreply@anthropic.com>
</commit_message>
<xml_diff>
--- a/recursos/comercial/campañas/GUIONES_GRABACION_2026-10-09.docx
+++ b/recursos/comercial/campañas/GUIONES_GRABACION_2026-10-09.docx
@@ -24,6 +24,230 @@
           <w:sz w:val="19"/>
         </w:rPr>
         <w:t>Venden el SERVICIO, no el producto: garantía por escrito, profesor que entrena (coach), acompañamiento diario, y un plan con fecha de llegada. Reglas del calendario: gancho de destino, sin precio ni nombre del programa, nunca "fácil", "rápido" ni "gratis"; caras de profes, estudiantes con cláusula de imagen y coordinación; nunca gerencia. Verticales (9:16), 20-30 segundos, subtítulos grandes. Cada guion abre con un GANCHO de 2 segundos (imagen + texto grande) que es lo que detiene el dedo; la clase, el profe o el contrato son la prueba que viene después. Cierre siempre a WhatsApp. GRUPO DISPONIBLE EL 09/10: un grupo de B1/B2 de 5 estudiantes; 3 de ellos empezaron de cero (A1) en Heiiu y tienen video de entrada en el portafolio: son los protagonistas de los guiones 2 y 6.</w:t>
+      </w:r>
+    </w:p>
+    <w:p>
+      <w:pPr>
+        <w:spacing w:before="200" w:after="80"/>
+      </w:pPr>
+      <w:r>
+        <w:rPr>
+          <w:b/>
+          <w:color w:val="E54C09"/>
+          <w:sz w:val="24"/>
+        </w:rPr>
+        <w:t>PLAN DE LA JORNADA (para grabar sin la gerente presente)</w:t>
+      </w:r>
+    </w:p>
+    <w:p>
+      <w:pPr>
+        <w:spacing w:after="60"/>
+      </w:pPr>
+      <w:r>
+        <w:rPr>
+          <w:b/>
+          <w:i w:val="0"/>
+          <w:sz w:val="21"/>
+        </w:rPr>
+        <w:t>Fecha y lugar:</w:t>
+      </w:r>
+      <w:r>
+        <w:rPr>
+          <w:b w:val="0"/>
+          <w:i w:val="0"/>
+          <w:sz w:val="21"/>
+        </w:rPr>
+        <w:t xml:space="preserve"> jueves 09/10/2026, sede Heiiu. </w:t>
+      </w:r>
+      <w:r>
+        <w:rPr>
+          <w:b/>
+          <w:i w:val="0"/>
+          <w:sz w:val="21"/>
+        </w:rPr>
+        <w:t>Hora de llegada del equipo:</w:t>
+      </w:r>
+      <w:r>
+        <w:rPr>
+          <w:b w:val="0"/>
+          <w:i w:val="0"/>
+          <w:sz w:val="21"/>
+        </w:rPr>
+        <w:t xml:space="preserve"> 45 minutos antes de la clase. </w:t>
+      </w:r>
+      <w:r>
+        <w:rPr>
+          <w:b/>
+          <w:i w:val="0"/>
+          <w:sz w:val="21"/>
+        </w:rPr>
+        <w:t>Hora de la clase del grupo B1/B2:</w:t>
+      </w:r>
+      <w:r>
+        <w:rPr>
+          <w:b w:val="0"/>
+          <w:i w:val="0"/>
+          <w:sz w:val="21"/>
+        </w:rPr>
+        <w:t xml:space="preserve"> ______ (llenar). </w:t>
+      </w:r>
+      <w:r>
+        <w:rPr>
+          <w:b/>
+          <w:i w:val="0"/>
+          <w:sz w:val="21"/>
+        </w:rPr>
+        <w:t>Profe:</w:t>
+      </w:r>
+      <w:r>
+        <w:rPr>
+          <w:b w:val="0"/>
+          <w:i w:val="0"/>
+          <w:sz w:val="21"/>
+        </w:rPr>
+        <w:t xml:space="preserve"> ______ (llenar). </w:t>
+      </w:r>
+      <w:r>
+        <w:rPr>
+          <w:b/>
+          <w:i w:val="0"/>
+          <w:sz w:val="21"/>
+        </w:rPr>
+        <w:t>Salón:</w:t>
+      </w:r>
+      <w:r>
+        <w:rPr>
+          <w:b w:val="0"/>
+          <w:i w:val="0"/>
+          <w:sz w:val="21"/>
+        </w:rPr>
+        <w:t xml:space="preserve"> ______ (llenar).</w:t>
+      </w:r>
+    </w:p>
+    <w:p>
+      <w:pPr>
+        <w:spacing w:after="60"/>
+      </w:pPr>
+      <w:r>
+        <w:rPr>
+          <w:b/>
+          <w:i w:val="0"/>
+          <w:sz w:val="21"/>
+        </w:rPr>
+        <w:t>Quién manda en el set:</w:t>
+      </w:r>
+      <w:r>
+        <w:rPr>
+          <w:b w:val="0"/>
+          <w:i w:val="0"/>
+          <w:sz w:val="21"/>
+        </w:rPr>
+        <w:t xml:space="preserve"> el que graba (Brian) dirige las escenas tal como están escritas; el profe ejecuta; coordinación (Jacqueline) consigue permisos, datos y está disponible para sus dos piezas. Si algo no se puede grabar como está escrito, se graba la versión más cercana y se anota; no se inventa otra escena.</w:t>
+      </w:r>
+    </w:p>
+    <w:p>
+      <w:pPr>
+        <w:spacing w:after="60"/>
+      </w:pPr>
+      <w:r>
+        <w:rPr>
+          <w:b/>
+          <w:i w:val="0"/>
+          <w:sz w:val="21"/>
+        </w:rPr>
+        <w:t>Equipo:</w:t>
+      </w:r>
+      <w:r>
+        <w:rPr>
+          <w:b w:val="0"/>
+          <w:i w:val="0"/>
+          <w:sz w:val="21"/>
+        </w:rPr>
+        <w:t xml:space="preserve"> celular o cámara en vertical (9:16, 1080x1920), micrófono de solapa o el celular a menos de 1,5 m del que habla, luz natural o del salón (sin aro de luz: se ve a anuncio). Un segundo celular para grabar la simulación desde otro ángulo.</w:t>
+      </w:r>
+    </w:p>
+    <w:p>
+      <w:pPr>
+        <w:spacing w:after="60"/>
+      </w:pPr>
+      <w:r>
+        <w:rPr>
+          <w:b/>
+          <w:i w:val="0"/>
+          <w:sz w:val="21"/>
+        </w:rPr>
+        <w:t>Permisos (ANTES de encender la cámara):</w:t>
+      </w:r>
+      <w:r>
+        <w:rPr>
+          <w:b w:val="0"/>
+          <w:i w:val="0"/>
+          <w:sz w:val="21"/>
+        </w:rPr>
+        <w:t xml:space="preserve"> cláusula de imagen firmada por cada estudiante que aparezca; autorización escrita de los 3 que empezaron de cero para usar su video de entrada y el de hoy; fecha de matrícula de cada uno (para los "___ meses · ___ horas" en pantalla). Quien no firme no sale en cámara: se le ubica fuera de plano. Sin nombres de estudiantes en pantalla.</w:t>
+      </w:r>
+    </w:p>
+    <w:p>
+      <w:pPr>
+        <w:spacing w:after="60"/>
+      </w:pPr>
+      <w:r>
+        <w:rPr>
+          <w:b/>
+          <w:i w:val="0"/>
+          <w:sz w:val="21"/>
+        </w:rPr>
+        <w:t>Orden cronológico del día:</w:t>
+      </w:r>
+      <w:r>
+        <w:rPr>
+          <w:b w:val="0"/>
+          <w:i w:val="0"/>
+          <w:sz w:val="21"/>
+        </w:rPr>
+        <w:t xml:space="preserve"> (1) antes de la clase, con el salón vacío: guion 3 "Siete meses" (profe + tablero), guion 4 "La vacante" (profe), tomas de la fachada y la recepción; (2) durante la clase, con el grupo: guion 7 "La corrección del día" al abrir (usa el error paper real), guion 2 "Esto es una clase" (simulación de entrevista o reclamo, 10 minutos de pie), guion 5 "El pasaporte" (simulación de entrevista con familia/empleador, 10 minutos), guion 1 "El video de hoy" (cada uno de los 3 que empezó de cero: 5 s hablando en inglés + 3 s de la confesión en español); (3) después de la clase: guion 6 "Te lo firmamos" (Jacqueline con el contrato impreso), guion 9 "Su hijo a los 18" (Jacqueline en recepción) y, si queda tiempo, guion 8 "El Pacto" (profe). Total estimado: 3 horas.</w:t>
+      </w:r>
+    </w:p>
+    <w:p>
+      <w:pPr>
+        <w:spacing w:after="60"/>
+      </w:pPr>
+      <w:r>
+        <w:rPr>
+          <w:b/>
+          <w:i w:val="0"/>
+          <w:sz w:val="21"/>
+        </w:rPr>
+        <w:t>Qué entrega el editor (lunes 12/10, a la carpeta ______ (llenar)):</w:t>
+      </w:r>
+      <w:r>
+        <w:rPr>
+          <w:b w:val="0"/>
+          <w:i w:val="0"/>
+          <w:sz w:val="21"/>
+        </w:rPr>
+        <w:t xml:space="preserve"> por cada guion, dos archivos: versión completa (20-30 s) y versión de 15 s (gancho + frase fuerte + cierre). Nombre del archivo = código del anuncio + duración: V1_VIDEODEHOY_30s.mp4, V1_VIDEODEHOY_15s.mp4, etc. (los códigos están en cada guion). Formato 9:16, 1080x1920, MP4. Subtítulos grandes, palabra por palabra, dentro de la zona segura de Reels (ni en el 14% superior ni en el 35% inferior). Colores de marca: naranja #E54C09 y amarillo #FBC900 para los textos en pantalla (el amarillo nunca como texto sobre blanco). Logo de Heiiu solo en el último segundo. Sin música encima de la voz en los guiones 1, 6 y 8; en los demás, música baja o ninguna. Además, el material en bruto completo en una subcarpeta BRUTO (sirve para cortar otros ganchos sin volver a grabar).</w:t>
+      </w:r>
+    </w:p>
+    <w:p>
+      <w:pPr>
+        <w:spacing w:after="60"/>
+      </w:pPr>
+      <w:r>
+        <w:rPr>
+          <w:b/>
+          <w:i w:val="0"/>
+          <w:sz w:val="21"/>
+        </w:rPr>
+        <w:t>Lo que NO se graba ni se edita (reglas fijas):</w:t>
+      </w:r>
+      <w:r>
+        <w:rPr>
+          <w:b w:val="0"/>
+          <w:i w:val="0"/>
+          <w:sz w:val="21"/>
+        </w:rPr>
+        <w:t xml:space="preserve"> precio, nombres de programas ("Arranque", "A1 intensivo"), "fácil", "gratis", "descuento", "rápido" sin número, "garantizado en X meses", "consigue trabajo", "visa", "profesores nativos", días de la semana. Si el profe lo dice, se repite la toma.</w:t>
       </w:r>
     </w:p>
     <w:p>

</xml_diff>

<commit_message>
Guiones 09/10: hoja de la profe (lidera la secuencia, 35-40 min de clase, frases a camara); el que graba sigue la hoja
Co-Authored-By: Claude Fable 5.1 <noreply@anthropic.com>
</commit_message>
<xml_diff>
--- a/recursos/comercial/campañas/GUIONES_GRABACION_2026-10-09.docx
+++ b/recursos/comercial/campañas/GUIONES_GRABACION_2026-10-09.docx
@@ -134,7 +134,7 @@
           <w:i w:val="0"/>
           <w:sz w:val="21"/>
         </w:rPr>
-        <w:t>Quién manda en el set:</w:t>
+        <w:t>Quién manda en el set: LA PROFE.</w:t>
       </w:r>
       <w:r>
         <w:rPr>
@@ -142,7 +142,7 @@
           <w:i w:val="0"/>
           <w:sz w:val="21"/>
         </w:rPr>
-        <w:t xml:space="preserve"> el que graba (Brian) dirige las escenas tal como están escritas; el profe ejecuta; coordinación (Jacqueline) consigue permisos, datos y está disponible para sus dos piezas. Si algo no se puede grabar como está escrito, se graba la versión más cercana y se anota; no se inventa otra escena.</w:t>
+        <w:t xml:space="preserve"> Ella dirige la clase y las escenas con la HOJA DE LA PROFE (página siguiente); el que graba sigue esa hoja y se encarga de que se vea y se oiga bien (encuadre, audio, dos ángulos); coordinación (Jacqueline) consigue permisos y datos antes de la clase y graba sus dos piezas después. Si algo no sale como está escrito, se graba la versión más cercana y se anota; no se inventa otra escena.</w:t>
       </w:r>
     </w:p>
     <w:p>
@@ -248,6 +248,223 @@
           <w:sz w:val="21"/>
         </w:rPr>
         <w:t xml:space="preserve"> precio, nombres de programas ("Arranque", "A1 intensivo"), "fácil", "gratis", "descuento", "rápido" sin número, "garantizado en X meses", "consigue trabajo", "visa", "profesores nativos", días de la semana. Si el profe lo dice, se repite la toma.</w:t>
+      </w:r>
+    </w:p>
+    <w:p>
+      <w:r>
+        <w:br w:type="page"/>
+      </w:r>
+    </w:p>
+    <w:p>
+      <w:pPr>
+        <w:spacing w:before="200" w:after="80"/>
+      </w:pPr>
+      <w:r>
+        <w:rPr>
+          <w:b/>
+          <w:color w:val="E54C09"/>
+          <w:sz w:val="25"/>
+        </w:rPr>
+        <w:t>HOJA DE LA PROFE — SECUENCIA DE LA CLASE CON CÁMARA (35-40 min de clase)</w:t>
+      </w:r>
+    </w:p>
+    <w:p>
+      <w:pPr>
+        <w:spacing w:after="120"/>
+      </w:pPr>
+      <w:r>
+        <w:rPr>
+          <w:b w:val="0"/>
+          <w:i w:val="0"/>
+          <w:color w:val="666666"/>
+          <w:sz w:val="19"/>
+        </w:rPr>
+        <w:t>Tú diriges. La cámara te sigue. La clase ocurre igual que siempre: las dos simulaciones son tu Bloque 3 y la corrección es tu error paper. Habla normal, corrige en voz alta como siempre, no mires a la cámara salvo cuando diga "A CÁMARA".</w:t>
+      </w:r>
+    </w:p>
+    <w:p>
+      <w:pPr>
+        <w:spacing w:after="60"/>
+      </w:pPr>
+      <w:r>
+        <w:rPr>
+          <w:b/>
+          <w:i w:val="0"/>
+          <w:sz w:val="21"/>
+        </w:rPr>
+        <w:t>20 min ANTES de la clase, salón vacío (10 min):</w:t>
+      </w:r>
+    </w:p>
+    <w:p>
+      <w:pPr>
+        <w:spacing w:after="60"/>
+      </w:pPr>
+      <w:r>
+        <w:rPr>
+          <w:b w:val="0"/>
+          <w:i w:val="0"/>
+          <w:sz w:val="21"/>
+        </w:rPr>
+        <w:t xml:space="preserve">  1. Escribe en el tablero un "5 AÑOS" grande y táchalo. A CÁMARA: "Llegar a B2 son unas quinientas setenta y cinco horas de clase. En cualquier academia. A dos horas por semana, eso son cinco años. Aquí son cuatro horas al día, de lunes a viernes: siete meses. No es fácil. Es rápido porque es intenso. Lo que firmamos: si cumples y no avanzas, te devolvemos el nivel." Mientras hablas, escribe "575 h" y "7 meses". (2 tomas.)</w:t>
+      </w:r>
+    </w:p>
+    <w:p>
+      <w:pPr>
+        <w:spacing w:after="60"/>
+      </w:pPr>
+      <w:r>
+        <w:rPr>
+          <w:b w:val="0"/>
+          <w:i w:val="0"/>
+          <w:sz w:val="21"/>
+        </w:rPr>
+        <w:t xml:space="preserve">  2. Sentada en el borde del escritorio, A CÁMARA, seria: "Hay vacantes que dicen inglés intermedio. Ese renglón deja a mucha gente por fuera. El inglés no da el puesto. Quita el requisito que lo cierra. En clase ensayamos esa pregunta: Tell me about yourself. Hasta que se contesta sin pensar." (2 tomas.)</w:t>
+      </w:r>
+    </w:p>
+    <w:p>
+      <w:pPr>
+        <w:spacing w:after="60"/>
+      </w:pPr>
+      <w:r>
+        <w:rPr>
+          <w:b/>
+          <w:i w:val="0"/>
+          <w:sz w:val="21"/>
+        </w:rPr>
+        <w:t>EN LA CLASE:</w:t>
+      </w:r>
+    </w:p>
+    <w:p>
+      <w:pPr>
+        <w:spacing w:after="60"/>
+      </w:pPr>
+      <w:r>
+        <w:rPr>
+          <w:b w:val="0"/>
+          <w:i w:val="0"/>
+          <w:sz w:val="21"/>
+        </w:rPr>
+        <w:t xml:space="preserve">  3. Minuto 0-7 · Corrección del día: con el grupo de pie, escribe en el tablero el error más repetido del error paper de la semana (real). Dilo, táchalo, escribe la forma correcta y di: "This is the mistake I hear the most. This is how we fix it. Repeat." Todos la repiten dos veces; pide a uno de los 3 que empezó de cero que la use en una frase propia. Al final, A CÁMARA, en español: "Mándanos un audio diciéndola y te la corregimos."</w:t>
+      </w:r>
+    </w:p>
+    <w:p>
+      <w:pPr>
+        <w:spacing w:after="60"/>
+      </w:pPr>
+      <w:r>
+        <w:rPr>
+          <w:b w:val="0"/>
+          <w:i w:val="0"/>
+          <w:sz w:val="21"/>
+        </w:rPr>
+        <w:t xml:space="preserve">  4. Minuto 7-19 · Simulación 1, entrevista de trabajo: un estudiante es el candidato (uno de los 3 que empezó de cero), otro el entrevistador, los demás observan de pie y anotan. Preguntas: "Tell me about yourself", "Why should we hire you?", "Describe a problem you solved." Corrige en voz alta, en el momento: "Again. Louder. Look at her, not at me." Rota el candidato cada 4 minutos. Al terminar, A CÁMARA: "Aquí nadie copia del tablero. Desde la primera clase hablas, te equivocas, te corregimos y lo vuelves a decir. Así se entrena un idioma."</w:t>
+      </w:r>
+    </w:p>
+    <w:p>
+      <w:pPr>
+        <w:spacing w:after="60"/>
+      </w:pPr>
+      <w:r>
+        <w:rPr>
+          <w:b w:val="0"/>
+          <w:i w:val="0"/>
+          <w:sz w:val="21"/>
+        </w:rPr>
+        <w:t xml:space="preserve">  5. Minuto 19-29 · Simulación 2, entrevista con una familia o un empleador del exterior: "Tell me about yourself. Why do you want to live with a family abroad? What would you do if the child refuses to eat?" Mismo formato. Al terminar, A CÁMARA: "Au Pair, Work and Travel, Europa: ninguno te recibe por querer irte. Te reciben porque pasas la entrevista. Y la entrevista es en inglés. Sin la entrevista en inglés, el proceso se detiene ahí. Aquí la ensayamos hasta que la contestas sin pensar."</w:t>
+      </w:r>
+    </w:p>
+    <w:p>
+      <w:pPr>
+        <w:spacing w:after="60"/>
+      </w:pPr>
+      <w:r>
+        <w:rPr>
+          <w:b w:val="0"/>
+          <w:i w:val="0"/>
+          <w:sz w:val="21"/>
+        </w:rPr>
+        <w:t xml:space="preserve">  6. Minuto 29-37 · Los 3 que empezaron de cero, uno por uno, de pie frente a la cámara: (a) 10 segundos hablando en inglés de algo suyo (su trabajo, su plan); (b) luego en español, 3 segundos: "Mi video del día 1 me da vergüenza. Mírenlo." Después tú, A CÁMARA: "Esto no pasa solo por venir a clase. Pasa porque todos los días graba un minuto, me lo manda, y yo le digo exactamente qué corregir. Al día siguiente, otra vez. Un profesor que te acompaña todos los días. Eso es lo que compras aquí." Y la variante de cierre: "Mándanos un audio de 30 segundos y te decimos tu nivel."</w:t>
+      </w:r>
+    </w:p>
+    <w:p>
+      <w:pPr>
+        <w:spacing w:after="60"/>
+      </w:pPr>
+      <w:r>
+        <w:rPr>
+          <w:b w:val="0"/>
+          <w:i w:val="0"/>
+          <w:sz w:val="21"/>
+        </w:rPr>
+        <w:t xml:space="preserve">  7. El resto de la clase sigue normal (Bloque 4, ticket de salida, tarea). La cámara se apaga.</w:t>
+      </w:r>
+    </w:p>
+    <w:p>
+      <w:pPr>
+        <w:spacing w:after="60"/>
+      </w:pPr>
+      <w:r>
+        <w:rPr>
+          <w:b/>
+          <w:i w:val="0"/>
+          <w:sz w:val="21"/>
+        </w:rPr>
+        <w:t>Si sobra tiempo al final (opcional, 5 min, a solas):</w:t>
+      </w:r>
+      <w:r>
+        <w:rPr>
+          <w:b w:val="0"/>
+          <w:i w:val="0"/>
+          <w:sz w:val="21"/>
+        </w:rPr>
+        <w:t xml:space="preserve"> muy cerca de la cámara, hablando bajo: "Te voy a decir lo que no te prometemos: que sea fácil, ni que te guste todos los días. Vas a tener clases pesadas y días de no querer venir. Lo que sí te prometemos: que hablas desde el primer día, que alguien revisa tu práctica todos los días, y que si cumples y no avanzas, te devolvemos la plata. Por escrito. Si buscas que sea divertido, no somos tu academia. Si buscas hablar inglés, sí."</w:t>
+      </w:r>
+    </w:p>
+    <w:p>
+      <w:pPr>
+        <w:spacing w:after="60"/>
+      </w:pPr>
+      <w:r>
+        <w:rPr>
+          <w:b/>
+          <w:i w:val="0"/>
+          <w:sz w:val="21"/>
+        </w:rPr>
+        <w:t>Reglas mientras la cámara está prendida:</w:t>
+      </w:r>
+      <w:r>
+        <w:rPr>
+          <w:b w:val="0"/>
+          <w:i w:val="0"/>
+          <w:sz w:val="21"/>
+        </w:rPr>
+        <w:t xml:space="preserve"> no digas precio, ni "Arranque", ni "fácil", ni "gratis", ni "rápido" sin el número, ni "garantizado en siete meses", ni "consigue trabajo", ni nombres de estudiantes. Si se te sale, repites la toma; no pasa nada.</w:t>
+      </w:r>
+    </w:p>
+    <w:p>
+      <w:pPr>
+        <w:spacing w:after="60"/>
+      </w:pPr>
+      <w:r>
+        <w:rPr>
+          <w:b/>
+          <w:i w:val="0"/>
+          <w:sz w:val="21"/>
+        </w:rPr>
+        <w:t>Antes de empezar, confirma con Jacqueline:</w:t>
+      </w:r>
+      <w:r>
+        <w:rPr>
+          <w:b w:val="0"/>
+          <w:i w:val="0"/>
+          <w:sz w:val="21"/>
+        </w:rPr>
+        <w:t xml:space="preserve"> cláusulas firmadas de los que salen en cámara, autorización de los 3 para usar su video de entrada, y quién NO firmó (lo ubicas fuera de plano).</w:t>
+      </w:r>
+    </w:p>
+    <w:p>
+      <w:r>
+        <w:br w:type="page"/>
       </w:r>
     </w:p>
     <w:p>

</xml_diff>

<commit_message>
Guiones 09/10: plan B si los estudiantes no cooperan
Co-Authored-By: Claude Fable 5.1 <noreply@anthropic.com>
</commit_message>
<xml_diff>
--- a/recursos/comercial/campañas/GUIONES_GRABACION_2026-10-09.docx
+++ b/recursos/comercial/campañas/GUIONES_GRABACION_2026-10-09.docx
@@ -460,6 +460,27 @@
           <w:sz w:val="21"/>
         </w:rPr>
         <w:t xml:space="preserve"> cláusulas firmadas de los que salen en cámara, autorización de los 3 para usar su video de entrada, y quién NO firmó (lo ubicas fuera de plano).</w:t>
+      </w:r>
+    </w:p>
+    <w:p>
+      <w:pPr>
+        <w:spacing w:after="60"/>
+      </w:pPr>
+      <w:r>
+        <w:rPr>
+          <w:b/>
+          <w:i w:val="0"/>
+          <w:sz w:val="21"/>
+        </w:rPr>
+        <w:t>PLAN B SI LOS ESTUDIANTES NO COOPERAN:</w:t>
+      </w:r>
+      <w:r>
+        <w:rPr>
+          <w:b w:val="0"/>
+          <w:i w:val="0"/>
+          <w:sz w:val="21"/>
+        </w:rPr>
+        <w:t xml:space="preserve"> (1) No firman: quedan fuera de plano; mínimo 2 firmados para las simulaciones y 1 de los 3 "de cero" para el día 1 vs. hoy; se confirma ANTES de la clase. (2) Firman pero les da pena: cámara en trípode al fondo, no en la cara; los primeros 5 minutos de la simulación no se graban; tú corriges como siempre y lo encuadras como lo que es: la clase de simulación de siempre, que en Heiiu se graba para el portafolio; cada uno recibe su clip editado para él (LinkedIn, familia). (3) Se traban o hablan mal: no importa; la pieza vende el entrenamiento, no la fluidez; el momento "Again. Louder." ES el anuncio; lo que no sirve es gente callada. (4) Nadie coopera: se graba todo lo que no necesita estudiantes (pasos 1 y 2 de esta hoja, la corrección del día tú sola en el tablero, El Pacto, y las piezas de Jacqueline) y las de estudiantes se reprograman la semana siguiente con otro grupo, avisando con dos días para las cláusulas. Nunca se paga a un estudiante por salir ni se presiona al que dijo que no.</w:t>
       </w:r>
     </w:p>
     <w:p>

</xml_diff>

<commit_message>
Guiones 09/10: Isaac graba y edita; entrega a Brian para la pauta
Co-Authored-By: Claude Fable 5.1 <noreply@anthropic.com>
</commit_message>
<xml_diff>
--- a/recursos/comercial/campañas/GUIONES_GRABACION_2026-10-09.docx
+++ b/recursos/comercial/campañas/GUIONES_GRABACION_2026-10-09.docx
@@ -142,7 +142,7 @@
           <w:i w:val="0"/>
           <w:sz w:val="21"/>
         </w:rPr>
-        <w:t xml:space="preserve"> Ella dirige la clase y las escenas con la HOJA DE LA PROFE (página siguiente); el que graba sigue esa hoja y se encarga de que se vea y se oiga bien (encuadre, audio, dos ángulos); coordinación (Jacqueline) consigue permisos y datos antes de la clase y graba sus dos piezas después. Si algo no sale como está escrito, se graba la versión más cercana y se anota; no se inventa otra escena.</w:t>
+        <w:t xml:space="preserve"> Ella dirige la clase y las escenas con la HOJA DE LA PROFE (página siguiente); el que graba (Isaac) sigue esa hoja y se encarga de que se vea y se oiga bien (encuadre, audio, dos ángulos); coordinación (Jacqueline) consigue permisos y datos antes de la clase y graba sus dos piezas después. Si algo no sale como está escrito, se graba la versión más cercana y se anota; no se inventa otra escena.</w:t>
       </w:r>
     </w:p>
     <w:p>
@@ -218,7 +218,7 @@
           <w:i w:val="0"/>
           <w:sz w:val="21"/>
         </w:rPr>
-        <w:t>Qué entrega el editor (lunes 12/10, a la carpeta ______ (llenar)):</w:t>
+        <w:t>Qué entrega Isaac (lunes 12/10, a la carpeta ______ (llenar), y aviso a Brian, que monta la pauta el 15):</w:t>
       </w:r>
       <w:r>
         <w:rPr>

</xml_diff>

<commit_message>
Grabacion 09/10: autorizacion de imagen ya esta en el contrato; verificar que cubre publicidad + aviso y opt-out
Co-Authored-By: Claude Fable 5.1 <noreply@anthropic.com>
</commit_message>
<xml_diff>
--- a/recursos/comercial/campañas/GUIONES_GRABACION_2026-10-09.docx
+++ b/recursos/comercial/campañas/GUIONES_GRABACION_2026-10-09.docx
@@ -184,7 +184,7 @@
           <w:i w:val="0"/>
           <w:sz w:val="21"/>
         </w:rPr>
-        <w:t xml:space="preserve"> cláusula de imagen firmada por cada estudiante que aparezca; autorización escrita de los 3 que empezaron de cero para usar su video de entrada y el de hoy; fecha de matrícula de cada uno (para los "___ meses · ___ horas" en pantalla). Quien no firme no sale en cámara: se le ubica fuera de plano. Sin nombres de estudiantes en pantalla.</w:t>
+        <w:t xml:space="preserve"> todos los estudiantes firmaron el contrato de matrícula, que incluye la autorización de uso de imagen; coordinación verifica que la cláusula cubre uso publicitario (redes y anuncios) y avisa al grupo que la clase se graba. Quien pida no salir, queda fuera de plano (la autorización se puede revocar; no se discute). Fecha de matrícula de los 3 que empezaron de cero (para los "___ meses · ___ horas" en pantalla). Sin nombres de estudiantes en pantalla.</w:t>
       </w:r>
     </w:p>
     <w:p>
@@ -459,7 +459,7 @@
           <w:i w:val="0"/>
           <w:sz w:val="21"/>
         </w:rPr>
-        <w:t xml:space="preserve"> cláusulas firmadas de los que salen en cámara, autorización de los 3 para usar su video de entrada, y quién NO firmó (lo ubicas fuera de plano).</w:t>
+        <w:t xml:space="preserve"> que la cláusula de imagen del contrato cubre publicidad (todos la firmaron), que el grupo ya sabe que se graba, y quién pidió no salir (lo ubicas fuera de plano).</w:t>
       </w:r>
     </w:p>
     <w:p>
@@ -480,7 +480,7 @@
           <w:i w:val="0"/>
           <w:sz w:val="21"/>
         </w:rPr>
-        <w:t xml:space="preserve"> (1) No firman: quedan fuera de plano; mínimo 2 firmados para las simulaciones y 1 de los 3 "de cero" para el día 1 vs. hoy; se confirma ANTES de la clase. (2) Firman pero les da pena: cámara en trípode al fondo, no en la cara; los primeros 5 minutos de la simulación no se graban; tú corriges como siempre y lo encuadras como lo que es: la clase de simulación de siempre, que en Heiiu se graba para el portafolio; cada uno recibe su clip editado para él (LinkedIn, familia). (3) Se traban o hablan mal: no importa; la pieza vende el entrenamiento, no la fluidez; el momento "Again. Louder." ES el anuncio; lo que no sirve es gente callada. (4) Nadie coopera: se graba todo lo que no necesita estudiantes (pasos 1 y 2 de esta hoja, la corrección del día tú sola en el tablero, El Pacto, y las piezas de Jacqueline) y las de estudiantes se reprograman la semana siguiente con otro grupo, avisando con dos días para las cláusulas. Nunca se paga a un estudiante por salir ni se presiona al que dijo que no.</w:t>
+        <w:t xml:space="preserve"> (1) Alguien pide no salir: queda fuera de plano, sin discusión; se necesitan mínimo 2 que sí para las simulaciones y 1 de los 3 "de cero" para el día 1 vs. hoy; se confirma ANTES de la clase. (2) Firman pero les da pena: cámara en trípode al fondo, no en la cara; los primeros 5 minutos de la simulación no se graban; tú corriges como siempre y lo encuadras como lo que es: la clase de simulación de siempre, que en Heiiu se graba para el portafolio; cada uno recibe su clip editado para él (LinkedIn, familia). (3) Se traban o hablan mal: no importa; la pieza vende el entrenamiento, no la fluidez; el momento "Again. Louder." ES el anuncio; lo que no sirve es gente callada. (4) Nadie coopera: se graba todo lo que no necesita estudiantes (pasos 1 y 2 de esta hoja, la corrección del día tú sola en el tablero, El Pacto, y las piezas de Jacqueline) y las de estudiantes se reprograman la semana siguiente con otro grupo, avisando con dos días. Nunca se paga a un estudiante por salir ni se presiona al que dijo que no.</w:t>
       </w:r>
     </w:p>
     <w:p>
@@ -1478,7 +1478,7 @@
           <w:color w:val="666666"/>
           <w:sz w:val="19"/>
         </w:rPr>
-        <w:t>Nota: Solo estudiantes con cláusula de imagen firmada y avisados ese día. Sin nombres en pantalla. Nunca poner cuánto tiempo lleva si no es el dato real del estudiante.</w:t>
+        <w:t>Nota: Autorización de imagen: en el contrato de matrícula (verificada por coordinación); grupo avisado ese día. Sin nombres en pantalla. Nunca poner cuánto tiempo lleva si no es el dato real del estudiante.</w:t>
       </w:r>
     </w:p>
     <w:p>
@@ -2314,7 +2314,7 @@
           <w:i w:val="0"/>
           <w:sz w:val="21"/>
         </w:rPr>
-        <w:t xml:space="preserve"> Uno de los 3 estudiantes del grupo que empezó de cero en Heiiu (cláusula de imagen + autorización escrita para usar sus dos videos): 5 segundos de su video de entrada en A1 (día 1) y 5 segundos hablando hoy en B1 (grabado mañana o de su portafolio reciente). Luego el profe a cámara.   ·   </w:t>
+        <w:t xml:space="preserve"> Uno de los 3 estudiantes del grupo que empezó de cero en Heiiu (autorización de imagen en el contrato, verificada por coordinación; avisado de que se usa su video de entrada): 5 segundos de su video de entrada en A1 (día 1) y 5 segundos hablando hoy en B1 (grabado mañana o de su portafolio reciente). Luego el profe a cámara.   ·   </w:t>
       </w:r>
       <w:r>
         <w:rPr>
@@ -2459,7 +2459,7 @@
           <w:color w:val="666666"/>
           <w:sz w:val="19"/>
         </w:rPr>
-        <w:t>Nota: Solo con autorización escrita del estudiante para usar sus dos videos. Si se puede, grabar los 3 (tres piezas distintas con el mismo guion: Meta premia conceptos y caras distintas).</w:t>
+        <w:t>Nota: Avisar al estudiante que se usa su video de entrada; si no quiere, otro de los 3. Si se puede, grabar los 3 (tres piezas distintas con el mismo guion: Meta premia conceptos y caras distintas).</w:t>
       </w:r>
     </w:p>
     <w:p>
@@ -3224,7 +3224,7 @@
           <w:i w:val="0"/>
           <w:sz w:val="21"/>
         </w:rPr>
-        <w:t>• DATOS A CONFIRMAR ANTES DE PUBLICAR (no se inventan): meses y horas reales de cada uno de los 3 estudiantes que empezaron de cero (guiones 2, 4, 6); que el agente de WhatsApp recibe audios y alguien los responde en menos de 24 h (cierres de reciprocidad); el error real del error paper (guion 9).</w:t>
+        <w:t>• DATOS A CONFIRMAR ANTES DE PUBLICAR (no se inventan): meses y horas reales de cada uno de los 3 estudiantes que empezaron de cero (guiones 2, 4, 6); que el agente de WhatsApp recibe audios y alguien los responde en menos de 24 h (cierres de reciprocidad); el error real del error paper (guion 9); que la cláusula de imagen del contrato cubre uso publicitario.</w:t>
       </w:r>
     </w:p>
     <w:p>
@@ -3250,7 +3250,7 @@
           <w:i w:val="0"/>
           <w:sz w:val="21"/>
         </w:rPr>
-        <w:t>• Cláusula de imagen firmada por cada estudiante que aparezca; avisarles antes de la clase. Sin nombres en pantalla.</w:t>
+        <w:t>• La autorización de imagen está en el contrato de matrícula que todos firmaron (coordinación verifica que cubre publicidad); avisar al grupo antes de la clase y respetar a quien pida no salir. Sin nombres en pantalla.</w:t>
       </w:r>
     </w:p>
     <w:p>

</xml_diff>

<commit_message>
Grabacion 09/10: sin espacios en blanco (un salon, un profe, Isaac 45 min antes; entrega por Drive)
Co-Authored-By: Claude Fable 5.1 <noreply@anthropic.com>
</commit_message>
<xml_diff>
--- a/recursos/comercial/campañas/GUIONES_GRABACION_2026-10-09.docx
+++ b/recursos/comercial/campañas/GUIONES_GRABACION_2026-10-09.docx
@@ -57,7 +57,7 @@
           <w:i w:val="0"/>
           <w:sz w:val="21"/>
         </w:rPr>
-        <w:t xml:space="preserve"> jueves 09/10/2026, sede Heiiu. </w:t>
+        <w:t xml:space="preserve"> jueves 09/10/2026, sede Heiiu, el salón de clase. </w:t>
       </w:r>
       <w:r>
         <w:rPr>
@@ -65,7 +65,7 @@
           <w:i w:val="0"/>
           <w:sz w:val="21"/>
         </w:rPr>
-        <w:t>Hora de llegada del equipo:</w:t>
+        <w:t>Grupo:</w:t>
       </w:r>
       <w:r>
         <w:rPr>
@@ -73,7 +73,7 @@
           <w:i w:val="0"/>
           <w:sz w:val="21"/>
         </w:rPr>
-        <w:t xml:space="preserve"> 45 minutos antes de la clase. </w:t>
+        <w:t xml:space="preserve"> el B1/B2 que tiene clase ese día, con su profe. </w:t>
       </w:r>
       <w:r>
         <w:rPr>
@@ -81,7 +81,7 @@
           <w:i w:val="0"/>
           <w:sz w:val="21"/>
         </w:rPr>
-        <w:t>Hora de la clase del grupo B1/B2:</w:t>
+        <w:t>Hora:</w:t>
       </w:r>
       <w:r>
         <w:rPr>
@@ -89,39 +89,7 @@
           <w:i w:val="0"/>
           <w:sz w:val="21"/>
         </w:rPr>
-        <w:t xml:space="preserve"> ______ (llenar). </w:t>
-      </w:r>
-      <w:r>
-        <w:rPr>
-          <w:b/>
-          <w:i w:val="0"/>
-          <w:sz w:val="21"/>
-        </w:rPr>
-        <w:t>Profe:</w:t>
-      </w:r>
-      <w:r>
-        <w:rPr>
-          <w:b w:val="0"/>
-          <w:i w:val="0"/>
-          <w:sz w:val="21"/>
-        </w:rPr>
-        <w:t xml:space="preserve"> ______ (llenar). </w:t>
-      </w:r>
-      <w:r>
-        <w:rPr>
-          <w:b/>
-          <w:i w:val="0"/>
-          <w:sz w:val="21"/>
-        </w:rPr>
-        <w:t>Salón:</w:t>
-      </w:r>
-      <w:r>
-        <w:rPr>
-          <w:b w:val="0"/>
-          <w:i w:val="0"/>
-          <w:sz w:val="21"/>
-        </w:rPr>
-        <w:t xml:space="preserve"> ______ (llenar).</w:t>
+        <w:t xml:space="preserve"> Isaac llega 45 minutos antes de la clase para las tomas con el salón vacío; la profe lo espera ahí.</w:t>
       </w:r>
     </w:p>
     <w:p>
@@ -218,7 +186,7 @@
           <w:i w:val="0"/>
           <w:sz w:val="21"/>
         </w:rPr>
-        <w:t>Qué entrega Isaac (lunes 12/10, a la carpeta ______ (llenar), y aviso a Brian, que monta la pauta el 15):</w:t>
+        <w:t>Qué entrega Isaac (lunes 12/10, subidos a un Google Drive compartido con gerencia y con Brian, que monta la pauta el 15; nada por WhatsApp porque se comprime):</w:t>
       </w:r>
       <w:r>
         <w:rPr>

</xml_diff>

<commit_message>
Grabacion 09/10: se graban los 9, nada opcional
Co-Authored-By: Claude Fable 5.1 <noreply@anthropic.com>
</commit_message>
<xml_diff>
--- a/recursos/comercial/campañas/GUIONES_GRABACION_2026-10-09.docx
+++ b/recursos/comercial/campañas/GUIONES_GRABACION_2026-10-09.docx
@@ -173,7 +173,7 @@
           <w:i w:val="0"/>
           <w:sz w:val="21"/>
         </w:rPr>
-        <w:t xml:space="preserve"> (1) antes de la clase, con el salón vacío: guion 3 "Siete meses" (profe + tablero), guion 4 "La vacante" (profe), tomas de la fachada y la recepción; (2) durante la clase, con el grupo: guion 7 "La corrección del día" al abrir (usa el error paper real), guion 2 "Esto es una clase" (simulación de entrevista o reclamo, 10 minutos de pie), guion 5 "El pasaporte" (simulación de entrevista con familia/empleador, 10 minutos), guion 1 "El video de hoy" (cada uno de los 3 que empezó de cero: 5 s hablando en inglés + 3 s de la confesión en español); (3) después de la clase: guion 6 "Te lo firmamos" (Jacqueline con el contrato impreso), guion 9 "Su hijo a los 18" (Jacqueline en recepción) y, si queda tiempo, guion 8 "El Pacto" (profe). Total estimado: 3 horas.</w:t>
+        <w:t xml:space="preserve"> (1) antes de la clase, con el salón vacío: guion 3 "Siete meses" (profe + tablero), guion 4 "La vacante" (profe), tomas de la fachada y la recepción; (2) durante la clase, con el grupo: guion 7 "La corrección del día" al abrir (usa el error paper real), guion 2 "Esto es una clase" (simulación de entrevista o reclamo, 10 minutos de pie), guion 5 "El pasaporte" (simulación de entrevista con familia/empleador, 10 minutos), guion 1 "El video de hoy" (cada uno de los 3 que empezó de cero: 5 s hablando en inglés + 3 s de la confesión en español); (3) después de la clase: guion 6 "Te lo firmamos" (Jacqueline con el contrato impreso), guion 9 "Su hijo a los 18" (Jacqueline en recepción) y guion 8 "El Pacto" (profe, 5 minutos, a solas). Se graban los 9; ninguno es opcional. Total estimado: 3 horas.</w:t>
       </w:r>
     </w:p>
     <w:p>
@@ -377,7 +377,7 @@
           <w:i w:val="0"/>
           <w:sz w:val="21"/>
         </w:rPr>
-        <w:t>Si sobra tiempo al final (opcional, 5 min, a solas):</w:t>
+        <w:t>8. Después de la clase (5 min, a solas, se graba sí o sí):</w:t>
       </w:r>
       <w:r>
         <w:rPr>
@@ -975,7 +975,7 @@
           <w:i w:val="0"/>
           <w:sz w:val="21"/>
         </w:rPr>
-        <w:t>7. Si hay tiempo: GUION 5 "El Pacto" (filtro, poco volumen), GUION 7 "Su hijo a los 18".</w:t>
+        <w:t>7. GUION 5 "El Pacto" (filtro, poco volumen) y GUION 7 "Su hijo a los 18". Se graban los 9; el orden es de prioridad por si algo falla, no una lista opcional.</w:t>
       </w:r>
     </w:p>
     <w:p>
@@ -1956,7 +1956,7 @@
           <w:color w:val="E54C09"/>
           <w:sz w:val="25"/>
         </w:rPr>
-        <w:t>GUION 5 — EL PACTO   [ALTERNO]   · anuncio V7_NOESFACIL</w:t>
+        <w:t>GUION 5 — EL PACTO   [SE GRABA]   · anuncio V7_NOESFACIL</w:t>
       </w:r>
     </w:p>
     <w:p>
@@ -2440,7 +2440,7 @@
           <w:color w:val="E54C09"/>
           <w:sz w:val="25"/>
         </w:rPr>
-        <w:t>GUION 7 — SU HIJO A LOS 18   [ALTERNO (para el grupo de la tarde y el sabatino)]   · anuncio V8_PADRES</w:t>
+        <w:t>GUION 7 — SU HIJO A LOS 18   [SE GRABA (para el grupo de la tarde y el sabatino)]   · anuncio V8_PADRES</w:t>
       </w:r>
     </w:p>
     <w:p>

</xml_diff>

<commit_message>
Grabacion 09/10: aplicados los 12 comentarios de Diana (MCE y dos jornadas, vacante clara, error provisto, simulaciones con escenario/roles/rotacion, solo Au Pair, 'llegue sin una palabra' sin video de entrada, firmado, sin reprogramar)
Co-Authored-By: Claude Fable 5.1 <noreply@anthropic.com>
</commit_message>
<xml_diff>
--- a/recursos/comercial/campañas/GUIONES_GRABACION_2026-10-09.docx
+++ b/recursos/comercial/campañas/GUIONES_GRABACION_2026-10-09.docx
@@ -23,7 +23,7 @@
           <w:color w:val="666666"/>
           <w:sz w:val="19"/>
         </w:rPr>
-        <w:t>Venden el SERVICIO, no el producto: garantía por escrito, profesor que entrena (coach), acompañamiento diario, y un plan con fecha de llegada. Reglas del calendario: gancho de destino, sin precio ni nombre del programa, nunca "fácil", "rápido" ni "gratis"; caras de profes, estudiantes con cláusula de imagen y coordinación; nunca gerencia. Verticales (9:16), 20-30 segundos, subtítulos grandes. Cada guion abre con un GANCHO de 2 segundos (imagen + texto grande) que es lo que detiene el dedo; la clase, el profe o el contrato son la prueba que viene después. Cierre siempre a WhatsApp. GRUPO DISPONIBLE EL 09/10: un grupo de B1/B2 de 5 estudiantes; 3 de ellos empezaron de cero (A1) en Heiiu y tienen video de entrada en el portafolio: son los protagonistas de los guiones 2 y 6.</w:t>
+        <w:t>Venden el SERVICIO, no el producto: garantía por escrito, profesor que entrena (coach), acompañamiento diario, y un plan con fecha de llegada. Reglas del calendario: gancho de destino, sin precio ni nombre del programa, nunca "fácil", "rápido" ni "gratis"; caras de profes, estudiantes con cláusula de imagen y coordinación; nunca gerencia. Verticales (9:16), 20-30 segundos, subtítulos grandes. Cada guion abre con un GANCHO de 2 segundos (imagen + texto grande) que es lo que detiene el dedo; la clase, el profe o el contrato son la prueba que viene después. Cierre siempre a WhatsApp. GRUPO DISPONIBLE EL 09/10: un grupo de B1/B2 de 5 estudiantes; 3 de ellos empezaron de cero (A1) en Heiiu (no hay video de entrada de ellos; la prueba es su confesión con el dato real y su inglés de hoy): son los protagonistas de los guiones 2 y 6.</w:t>
       </w:r>
     </w:p>
     <w:p>
@@ -89,7 +89,7 @@
           <w:i w:val="0"/>
           <w:sz w:val="21"/>
         </w:rPr>
-        <w:t xml:space="preserve"> Isaac llega 45 minutos antes de la clase para las tomas con el salón vacío; la profe lo espera ahí.</w:t>
+        <w:t xml:space="preserve"> Isaac coordina su llegada con la profe; las tomas con el salón vacío se hacen antes de la clase y las de Jacqueline después.</w:t>
       </w:r>
     </w:p>
     <w:p>
@@ -144,7 +144,7 @@
           <w:i w:val="0"/>
           <w:sz w:val="21"/>
         </w:rPr>
-        <w:t>Permisos (ANTES de encender la cámara):</w:t>
+        <w:t>Permisos:</w:t>
       </w:r>
       <w:r>
         <w:rPr>
@@ -152,7 +152,7 @@
           <w:i w:val="0"/>
           <w:sz w:val="21"/>
         </w:rPr>
-        <w:t xml:space="preserve"> todos los estudiantes firmaron el contrato de matrícula, que incluye la autorización de uso de imagen; coordinación verifica que la cláusula cubre uso publicitario (redes y anuncios) y avisa al grupo que la clase se graba. Quien pida no salir, queda fuera de plano (la autorización se puede revocar; no se discute). Fecha de matrícula de los 3 que empezaron de cero (para los "___ meses · ___ horas" en pantalla). Sin nombres de estudiantes en pantalla.</w:t>
+        <w:t xml:space="preserve"> todos los estudiantes tienen firmada la autorización de imagen en su contrato de matrícula. La profe avisa al grupo que la clase se graba; si alguien dice voluntariamente que no quiere salir, queda fuera de plano. Coordinación entrega la fecha de matrícula de los 3 que empezaron de cero (para "hace ___ meses" en pantalla). Sin nombres de estudiantes en pantalla.</w:t>
       </w:r>
     </w:p>
     <w:p>
@@ -173,7 +173,7 @@
           <w:i w:val="0"/>
           <w:sz w:val="21"/>
         </w:rPr>
-        <w:t xml:space="preserve"> (1) antes de la clase, con el salón vacío: guion 3 "Siete meses" (profe + tablero), guion 4 "La vacante" (profe), tomas de la fachada y la recepción; (2) durante la clase, con el grupo: guion 7 "La corrección del día" al abrir (usa el error paper real), guion 2 "Esto es una clase" (simulación de entrevista o reclamo, 10 minutos de pie), guion 5 "El pasaporte" (simulación de entrevista con familia/empleador, 10 minutos), guion 1 "El video de hoy" (cada uno de los 3 que empezó de cero: 5 s hablando en inglés + 3 s de la confesión en español); (3) después de la clase: guion 6 "Te lo firmamos" (Jacqueline con el contrato impreso), guion 9 "Su hijo a los 18" (Jacqueline en recepción) y guion 8 "El Pacto" (profe, 5 minutos, a solas). Se graban los 9; ninguno es opcional. Total estimado: 3 horas.</w:t>
+        <w:t xml:space="preserve"> (1) antes de la clase, con el salón vacío: guion 3 "Siete meses" (profe + tablero), guion 4 "La vacante" (profe), tomas de la fachada y la recepción; (2) durante la clase, con el grupo: guion 7 "La corrección del día" al abrir (usa el error paper real), guion 2 "Esto es una clase" (simulación de entrevista o reclamo, 10 minutos de pie), guion 5 "El pasaporte" (simulación de entrevista con familia/empleador, 10 minutos), guion 1 "Llegué sin una palabra" (cada uno de los 3 que empezó de cero: la frase en español con su dato real + 10 s en inglés); (3) después de la clase: guion 6 "Te lo firmamos" (Jacqueline con el contrato impreso), guion 9 "Su hijo a los 18" (Jacqueline en recepción) y guion 8 "El Pacto" (profe, 5 minutos, a solas). Se graban los 9; ninguno es opcional. Total estimado: 3 horas.</w:t>
       </w:r>
     </w:p>
     <w:p>
@@ -260,7 +260,7 @@
           <w:i w:val="0"/>
           <w:sz w:val="21"/>
         </w:rPr>
-        <w:t>20 min ANTES de la clase, salón vacío (10 min):</w:t>
+        <w:t>ANTES de la clase, salón vacío (10 min, cuando Isaac llegue):</w:t>
       </w:r>
     </w:p>
     <w:p>
@@ -273,7 +273,7 @@
           <w:i w:val="0"/>
           <w:sz w:val="21"/>
         </w:rPr>
-        <w:t xml:space="preserve">  1. Escribe en el tablero un "5 AÑOS" grande y táchalo. A CÁMARA: "Llegar a B2 son unas quinientas setenta y cinco horas de clase. En cualquier academia. A dos horas por semana, eso son cinco años. Aquí son cuatro horas al día, de lunes a viernes: siete meses. No es fácil. Es rápido porque es intenso. Lo que firmamos: si cumples y no avanzas, te devolvemos el nivel." Mientras hablas, escribe "575 h" y "7 meses". (2 tomas.)</w:t>
+        <w:t xml:space="preserve">  1. Escribe en el tablero un "5 AÑOS" grande y táchalo. A CÁMARA: "El Marco Común Europeo calcula entre quinientas y seiscientas horas de clase para llegar a B2. En Heiiu son quinientas setenta y cinco. A dos horas por semana, eso son cinco años. Aquí son cuatro horas al día: siete meses. O dos horas cada noche: catorce meses. No es fácil. Es rápido porque es intenso. Lo que firmamos: si cumples y no avanzas, te devolvemos el nivel." Mientras hablas, escribe "575 h", "7 meses" y "14 meses". (2 tomas.)</w:t>
       </w:r>
     </w:p>
     <w:p>
@@ -286,7 +286,7 @@
           <w:i w:val="0"/>
           <w:sz w:val="21"/>
         </w:rPr>
-        <w:t xml:space="preserve">  2. Sentada en el borde del escritorio, A CÁMARA, seria: "Hay vacantes que dicen inglés intermedio. Ese renglón deja a mucha gente por fuera. El inglés no da el puesto. Quita el requisito que lo cierra. En clase ensayamos esa pregunta: Tell me about yourself. Hasta que se contesta sin pensar." (2 tomas.)</w:t>
+        <w:t xml:space="preserve">  2. Sentada en el borde del escritorio, A CÁMARA, seria: "Hay vacantes que dicen inglés intermedio. Ese renglón deja a mucha gente por fuera. El inglés no te da el puesto. Pero sin inglés, ese puesto ni se abre. En clase ensayamos la entrevista completa, pregunta por pregunta, hasta que se contesta sin pensar." (2 tomas.)</w:t>
       </w:r>
     </w:p>
     <w:p>
@@ -299,7 +299,7 @@
           <w:i w:val="0"/>
           <w:sz w:val="21"/>
         </w:rPr>
-        <w:t>EN LA CLASE:</w:t>
+        <w:t>EN LA CLASE (la cámara graba estos 35-40 minutos; después sigue tu clase normal y se acabó la jornada):</w:t>
       </w:r>
     </w:p>
     <w:p>
@@ -312,7 +312,7 @@
           <w:i w:val="0"/>
           <w:sz w:val="21"/>
         </w:rPr>
-        <w:t xml:space="preserve">  3. Minuto 0-7 · Corrección del día: con el grupo de pie, escribe en el tablero el error más repetido del error paper de la semana (real). Dilo, táchalo, escribe la forma correcta y di: "This is the mistake I hear the most. This is how we fix it. Repeat." Todos la repiten dos veces; pide a uno de los 3 que empezó de cero que la use en una frase propia. Al final, A CÁMARA, en español: "Mándanos un audio diciéndola y te la corregimos."</w:t>
+        <w:t xml:space="preserve">  3. Minuto 0-7 · Corrección del día. Si el grupo tiene error paper, usa el error más repetido. Si no, usa UNO de estos tres, típicos de hispanohablantes en B1/B2 (elige el que más oyes en el grupo): (a) "I am agree" → "I agree"; (b) "It depends of the company" → "It depends on the company"; (c) "People is waiting" → "People are waiting". Con el grupo de pie: escribe la frase con el error, táchala, escribe la correcta y di "Repeat". Todos la repiten dos veces; pide a uno de los 3 que empezó de cero que la use en una frase propia. Tu voz en inglés es mínima (el contenido va escrito en el tablero; el acento no importa, lo que se ve es la corrección). Al final, A CÁMARA, en español: "Mándanos un audio diciéndola y te la corregimos."</w:t>
       </w:r>
     </w:p>
     <w:p>
@@ -325,7 +325,7 @@
           <w:i w:val="0"/>
           <w:sz w:val="21"/>
         </w:rPr>
-        <w:t xml:space="preserve">  4. Minuto 7-19 · Simulación 1, entrevista de trabajo: un estudiante es el candidato (uno de los 3 que empezó de cero), otro el entrevistador, los demás observan de pie y anotan. Preguntas: "Tell me about yourself", "Why should we hire you?", "Describe a problem you solved." Corrige en voz alta, en el momento: "Again. Louder. Look at her, not at me." Rota el candidato cada 4 minutos. Al terminar, A CÁMARA: "Aquí nadie copia del tablero. Desde la primera clase hablas, te equivocas, te corregimos y lo vuelves a decir. Así se entrena un idioma."</w:t>
+        <w:t xml:space="preserve">  4. Minuto 7-19 · Simulación 1, entrevista de trabajo. ESCENARIO (lo dices antes de empezar y lo escribes en el tablero): "Una empresa de Bucaramanga busca asistente de servicio al cliente bilingüe. Hoy es la entrevista." Las 3 preguntas van escritas en el tablero: "Tell me about yourself." / "Why should we hire you?" / "Tell me about a problem you solved at work." ROLES: 1 candidato (empieza el más seguro del grupo, no el más tímido), 1 entrevistador (lee las preguntas del tablero), los otros 3 son observadores de pie con su error paper: anotan UNA cosa que el candidato hizo bien y UN error que oyeron. ROTACIÓN: cada 4 minutos cambia candidato y entrevistador; en 12 minutos pasan los 5 (3 candidatos). CORRECCIÓN EN CÁMARA: corrige lo seguro y visible (volumen, mirar al entrevistador, repetir la frase completa, pronunciación de una palabra): "Again. Louder. Look at her, not at me." La gramática la corriges después, fuera de cámara, con lo que anotaron los observadores. PÁNICO: si alguien se bloquea, el entrevistador repite la pregunta más despacio y el candidato contesta con una sola frase; eso también sirve. Al terminar, A CÁMARA: "Aquí nadie copia del tablero. Desde la primera clase hablas, te equivocas, te corregimos y lo vuelves a decir. Así se entrena un idioma."</w:t>
       </w:r>
     </w:p>
     <w:p>
@@ -338,7 +338,7 @@
           <w:i w:val="0"/>
           <w:sz w:val="21"/>
         </w:rPr>
-        <w:t xml:space="preserve">  5. Minuto 19-29 · Simulación 2, entrevista con una familia o un empleador del exterior: "Tell me about yourself. Why do you want to live with a family abroad? What would you do if the child refuses to eat?" Mismo formato. Al terminar, A CÁMARA: "Au Pair, Work and Travel, Europa: ninguno te recibe por querer irte. Te reciben porque pasas la entrevista. Y la entrevista es en inglés. Sin la entrevista en inglés, el proceso se detiene ahí. Aquí la ensayamos hasta que la contestas sin pensar."</w:t>
+        <w:t xml:space="preserve">  5. Minuto 19-29 · Simulación 2, entrevista de Au Pair (solo Au Pair: es el programa donde la familia sí entrevista en inglés antes de elegir). ESCENARIO en el tablero: "Una familia en Estados Unidos entrevista por videollamada a su candidata a Au Pair." ROLES: el hombre del grupo hace de papá de la familia (lee las preguntas del tablero), las mujeres son las candidatas, una a la vez, 3 minutos cada una; las que no están en turno observan y anotan. Preguntas en el tablero: "Tell me about yourself." / "Why do you want to live with a family abroad?" / "What would you do if the child refuses to eat?" Misma corrección que en la simulación 1. Al terminar, A CÁMARA: "En Au Pair, la familia te entrevista en inglés antes de elegirte. Sin esa entrevista, no hay familia. Aquí la ensayamos hasta que la contestas sin pensar."</w:t>
       </w:r>
     </w:p>
     <w:p>
@@ -351,7 +351,7 @@
           <w:i w:val="0"/>
           <w:sz w:val="21"/>
         </w:rPr>
-        <w:t xml:space="preserve">  6. Minuto 29-37 · Los 3 que empezaron de cero, uno por uno, de pie frente a la cámara: (a) 10 segundos hablando en inglés de algo suyo (su trabajo, su plan); (b) luego en español, 3 segundos: "Mi video del día 1 me da vergüenza. Mírenlo." Después tú, A CÁMARA: "Esto no pasa solo por venir a clase. Pasa porque todos los días graba un minuto, me lo manda, y yo le digo exactamente qué corregir. Al día siguiente, otra vez. Un profesor que te acompaña todos los días. Eso es lo que compras aquí." Y la variante de cierre: "Mándanos un audio de 30 segundos y te decimos tu nivel."</w:t>
+        <w:t xml:space="preserve">  6. Minuto 29-37 · Los 3 que empezaron de cero en Heiiu, uno por uno, de pie frente a la cámara: (a) en español, una frase: "Llegué el primer día sin hablar una palabra de inglés. Hace ___ meses." (cada uno dice su dato real); (b) luego 10 segundos hablando en inglés de algo suyo (su trabajo, su plan). Después tú, A CÁMARA: "Esto no pasa por venir a clase a copiar. Pasa porque desde el primer día hablan, se equivocan, los corregimos y lo vuelven a decir. Eso es lo que compras aquí." Y una segunda versión del cierre: "Mándanos un audio de 30 segundos y te decimos tu nivel."</w:t>
       </w:r>
     </w:p>
     <w:p>
@@ -364,7 +364,7 @@
           <w:i w:val="0"/>
           <w:sz w:val="21"/>
         </w:rPr>
-        <w:t xml:space="preserve">  7. El resto de la clase sigue normal (Bloque 4, ticket de salida, tarea). La cámara se apaga.</w:t>
+        <w:t xml:space="preserve">  7. Se apaga la cámara. Sigues tu clase normal (Bloque 4, ticket de salida, tarea). La grabación en clase terminó.</w:t>
       </w:r>
     </w:p>
     <w:p>
@@ -377,7 +377,7 @@
           <w:i w:val="0"/>
           <w:sz w:val="21"/>
         </w:rPr>
-        <w:t>8. Después de la clase (5 min, a solas, se graba sí o sí):</w:t>
+        <w:t>8. Después de la clase (5 min, a solas):</w:t>
       </w:r>
       <w:r>
         <w:rPr>
@@ -385,7 +385,7 @@
           <w:i w:val="0"/>
           <w:sz w:val="21"/>
         </w:rPr>
-        <w:t xml:space="preserve"> muy cerca de la cámara, hablando bajo: "Te voy a decir lo que no te prometemos: que sea fácil, ni que te guste todos los días. Vas a tener clases pesadas y días de no querer venir. Lo que sí te prometemos: que hablas desde el primer día, que alguien revisa tu práctica todos los días, y que si cumples y no avanzas, te devolvemos la plata. Por escrito. Si buscas que sea divertido, no somos tu academia. Si buscas hablar inglés, sí."</w:t>
+        <w:t xml:space="preserve"> muy cerca de la cámara, hablando bajo: "Te voy a decir lo que no te prometemos: que sea fácil, ni que te guste todos los días. Vas a tener clases pesadas y días de no querer venir. Lo que sí te prometemos: que hablas desde el primer día, que te corrigen todos los días, y que si cumples y no avanzas, te devolvemos la plata. Te lo entregamos firmado. Si buscas que sea divertido, no somos tu academia. Si buscas hablar inglés, sí."</w:t>
       </w:r>
     </w:p>
     <w:p>
@@ -419,7 +419,7 @@
           <w:i w:val="0"/>
           <w:sz w:val="21"/>
         </w:rPr>
-        <w:t>Antes de empezar, confirma con Jacqueline:</w:t>
+        <w:t>Los estudiantes:</w:t>
       </w:r>
       <w:r>
         <w:rPr>
@@ -427,7 +427,7 @@
           <w:i w:val="0"/>
           <w:sz w:val="21"/>
         </w:rPr>
-        <w:t xml:space="preserve"> que la cláusula de imagen del contrato cubre publicidad (todos la firmaron), que el grupo ya sabe que se graba, y quién pidió no salir (lo ubicas fuera de plano).</w:t>
+        <w:t xml:space="preserve"> todos tienen firmada la autorización de imagen en su contrato. Al empezar la clase les dices: "Hoy la clase de simulación se graba; es la misma clase de siempre, con cámara; cada uno recibe su clip." Si alguien dice voluntariamente que no quiere salir, lo ubicas fuera de plano y sigue participando desde ahí como observador. No se discute ni se insiste.</w:t>
       </w:r>
     </w:p>
     <w:p>
@@ -440,7 +440,7 @@
           <w:i w:val="0"/>
           <w:sz w:val="21"/>
         </w:rPr>
-        <w:t>PLAN B SI LOS ESTUDIANTES NO COOPERAN:</w:t>
+        <w:t>Si algo falla:</w:t>
       </w:r>
       <w:r>
         <w:rPr>
@@ -448,7 +448,7 @@
           <w:i w:val="0"/>
           <w:sz w:val="21"/>
         </w:rPr>
-        <w:t xml:space="preserve"> (1) Alguien pide no salir: queda fuera de plano, sin discusión; se necesitan mínimo 2 que sí para las simulaciones y 1 de los 3 "de cero" para el día 1 vs. hoy; se confirma ANTES de la clase. (2) Firman pero les da pena: cámara en trípode al fondo, no en la cara; los primeros 5 minutos de la simulación no se graban; tú corriges como siempre y lo encuadras como lo que es: la clase de simulación de siempre, que en Heiiu se graba para el portafolio; cada uno recibe su clip editado para él (LinkedIn, familia). (3) Se traban o hablan mal: no importa; la pieza vende el entrenamiento, no la fluidez; el momento "Again. Louder." ES el anuncio; lo que no sirve es gente callada. (4) Nadie coopera: se graba todo lo que no necesita estudiantes (pasos 1 y 2 de esta hoja, la corrección del día tú sola en el tablero, El Pacto, y las piezas de Jacqueline) y las de estudiantes se reprograman la semana siguiente con otro grupo, avisando con dos días. Nunca se paga a un estudiante por salir ni se presiona al que dijo que no.</w:t>
+        <w:t xml:space="preserve"> si uno de los 3 "de cero" no quiere salir, el paso 6 se hace con los que sí. Si alguien se bloquea, una sola frase basta. Si una toma sale mal, se repite. Todo queda grabado mañana; nada se reprograma.</w:t>
       </w:r>
     </w:p>
     <w:p>
@@ -548,7 +548,7 @@
                 <w:b/>
                 <w:sz w:val="18"/>
               </w:rPr>
-              <w:t>6 "El video de hoy" + 2 "Esto es una clase"</w:t>
+              <w:t>6 "Llegué sin una palabra" + 2 "Esto es una clase"</w:t>
             </w:r>
           </w:p>
         </w:tc>
@@ -897,7 +897,7 @@
           <w:i w:val="0"/>
           <w:sz w:val="21"/>
         </w:rPr>
-        <w:t>1. GUION 6 "El video de hoy" (los 3 que empezaron de cero: día 1 vs. hoy) y GUION 2 "Esto es una clase": estudiantes reales hablando. Es la prueba que más convierte en compras caras (investigación 08/10) y lo que ningún avatar ni competidor puede mostrar.</w:t>
+        <w:t>1. GUION 6 "Llegué sin una palabra" (los 3 que empezaron de cero: confesión + inglés de hoy) y GUION 2 "Esto es una clase": estudiantes reales hablando. Es la prueba que más convierte en compras caras (investigación 08/10) y lo que ningún avatar ni competidor puede mostrar.</w:t>
       </w:r>
     </w:p>
     <w:p>
@@ -1135,7 +1135,7 @@
           <w:i/>
           <w:sz w:val="21"/>
         </w:rPr>
-        <w:t>"Todas las academias te prometen que vas a aprender inglés. Nosotros te lo firmamos."</w:t>
+        <w:t>"Todas las academias te prometen que vas a aprender inglés. Nosotros te lo entregamos firmado."</w:t>
       </w:r>
     </w:p>
     <w:p>
@@ -1314,7 +1314,7 @@
           <w:i w:val="0"/>
           <w:sz w:val="21"/>
         </w:rPr>
-        <w:t xml:space="preserve"> Nadie a cámara: se graba la simulación real del grupo B1/B2 (entrevista de trabajo o reclamo a un proveedor), estudiantes de pie; protagonista uno de los 3 que empezó de cero en Heiiu. Voz del profe corrigiendo en vivo. Al final, el profe dice UNA frase a cámara.   ·   </w:t>
+        <w:t xml:space="preserve"> Nadie a cámara: se graba la simulación real del grupo B1/B2: entrevista de trabajo (escenario: una empresa de Bucaramanga busca asistente de servicio al cliente bilingüe; 3 preguntas en el tablero; 1 candidato, 1 entrevistador, 3 observadores de pie; rotan cada 4 minutos). La profe corrige en vivo lo visible (volumen, mirada, repetir la frase completa, pronunciación). Al final, la profe dice UNA frase a cámara. Todo esto está en la hoja de la profe; Isaac solo graba.   ·   </w:t>
       </w:r>
       <w:r>
         <w:rPr>
@@ -1446,7 +1446,7 @@
           <w:color w:val="666666"/>
           <w:sz w:val="19"/>
         </w:rPr>
-        <w:t>Nota: Autorización de imagen: en el contrato de matrícula (verificada por coordinación); grupo avisado ese día. Sin nombres en pantalla. Nunca poner cuánto tiempo lleva si no es el dato real del estudiante.</w:t>
+        <w:t>Nota: Autorización de imagen: en el contrato de matrícula; grupo avisado ese día por la profe. Sin nombres en pantalla. Nunca poner cuánto tiempo lleva si no es el dato real del estudiante.</w:t>
       </w:r>
     </w:p>
     <w:p>
@@ -1619,7 +1619,7 @@
           <w:i/>
           <w:sz w:val="21"/>
         </w:rPr>
-        <w:t>"El inglés no da el puesto. Quita el requisito que lo cierra."</w:t>
+        <w:t>"El inglés no te da el puesto. Pero sin inglés, ese puesto ni se abre."</w:t>
       </w:r>
     </w:p>
     <w:p>
@@ -1632,7 +1632,7 @@
           <w:i/>
           <w:sz w:val="21"/>
         </w:rPr>
-        <w:t>"En clase ensayamos esa pregunta: "Tell me about yourself". Hasta que se contesta sin pensar."</w:t>
+        <w:t>"En clase ensayamos la entrevista completa, pregunta por pregunta, hasta que se contesta sin pensar."</w:t>
       </w:r>
     </w:p>
     <w:p>
@@ -1764,7 +1764,7 @@
           <w:i w:val="0"/>
           <w:sz w:val="21"/>
         </w:rPr>
-        <w:t xml:space="preserve"> Velocidad con número: 575 h (estándar Cambridge para B2) en 7 meses. Es el único "rápido" verificable del mercado; los demás dicen "2x" o "10 meses" sin publicar horas.</w:t>
+        <w:t xml:space="preserve"> Velocidad con número: el Marco Común Europeo estima 500-600 h guiadas para B2 (rango; varía por academia); Heiiu son 575 h en 7 meses (4 h/día) o 14 (2 h/noche). Es el único "rápido" verificable del mercado; los demás no publican horas.</w:t>
       </w:r>
     </w:p>
     <w:p>
@@ -1848,7 +1848,7 @@
           <w:i/>
           <w:sz w:val="21"/>
         </w:rPr>
-        <w:t>"Llegar a B2 son unas quinientas setenta y cinco horas de clase. En cualquier academia."</w:t>
+        <w:t>"El Marco Común Europeo calcula entre quinientas y seiscientas horas de clase para llegar a B2. En Heiiu son quinientas setenta y cinco."</w:t>
       </w:r>
     </w:p>
     <w:p>
@@ -1861,7 +1861,7 @@
           <w:i/>
           <w:sz w:val="21"/>
         </w:rPr>
-        <w:t>"A dos horas por semana, eso son cinco años. Aquí son cuatro horas al día, de lunes a viernes: siete meses."</w:t>
+        <w:t>"A dos horas por semana, eso son cinco años. Aquí son cuatro horas al día: siete meses. O dos horas cada noche: catorce meses."</w:t>
       </w:r>
     </w:p>
     <w:p>
@@ -1908,7 +1908,7 @@
           <w:i w:val="0"/>
           <w:sz w:val="21"/>
         </w:rPr>
-        <w:t xml:space="preserve"> "B2 = 575 horas" · "2 h/semana = 5 años" · "Aquí: 7 meses"</w:t>
+        <w:t xml:space="preserve"> "B2 = 500-600 h (Marco Común Europeo)" · "2 h/semana = 5 años" · "Aquí: 7 meses · noche: 14"</w:t>
       </w:r>
     </w:p>
     <w:p>
@@ -1943,7 +1943,7 @@
           <w:color w:val="666666"/>
           <w:sz w:val="19"/>
         </w:rPr>
-        <w:t>Nota: El "7 meses" aplica al súper intensivo de 4 h; en la noche son ~14 meses: no mezclar. Sin precio. Versión nocturna del cierre: "dos horas cada noche, catorce meses".</w:t>
+        <w:t>Nota: Las dos jornadas van en la misma pieza (4 h/día = 7 meses; 2 h/noche = 14 meses) para no dejar por fuera al nocturno. Sin precio.</w:t>
       </w:r>
     </w:p>
     <w:p>
@@ -2116,7 +2116,7 @@
           <w:i/>
           <w:sz w:val="21"/>
         </w:rPr>
-        <w:t>"Lo que sí te prometemos: que hablas desde el primer día, que alguien revisa tu práctica todos los días, y que si cumples y no avanzas, te devolvemos la plata. Por escrito."</w:t>
+        <w:t>"Lo que sí te prometemos: que hablas desde el primer día, que te corrigen todos los días, y que si cumples y no avanzas, te devolvemos la plata. Te lo entregamos firmado."</w:t>
       </w:r>
     </w:p>
     <w:p>
@@ -2198,7 +2198,7 @@
           <w:color w:val="E54C09"/>
           <w:sz w:val="25"/>
         </w:rPr>
-        <w:t>GUION 6 — EL VIDEO DE HOY   [PRIORITARIO]   · anuncio V1_VIDEODEHOY</w:t>
+        <w:t>GUION 6 — LLEGUÉ SIN UNA PALABRA   [PRIORITARIO]   · anuncio V1_VIDEODEHOY</w:t>
       </w:r>
     </w:p>
     <w:p>
@@ -2240,7 +2240,7 @@
           <w:i w:val="0"/>
           <w:sz w:val="21"/>
         </w:rPr>
-        <w:t xml:space="preserve"> Segundo 0: su video de entrada, nervioso, sin poder terminar la frase. Texto grande: "Día 1." Corte seco al de hoy hablando de corrido: "Hoy." VERSIÓN B (formato CONFESIÓN, top 5 de ganchos por tasa de acierto en Motion 2026): el mismo estudiante a cámara, en español, 3 segundos: "Mi video del día 1 me da vergüenza. Mírenlo." → corte a su video de entrada → corte a él hoy en inglés. En pantalla los datos exactos: "___ meses · ___ horas de clase" (de la ficha del estudiante; el antes/después vago ya no convence).</w:t>
+        <w:t xml:space="preserve"> Segundo 0: el estudiante a cámara, en español: "Llegué el primer día sin hablar una palabra de inglés." (formato CONFESIÓN, top 5 de ganchos por tasa de acierto en Motion 2026). Corte seco a él hablando en inglés. En pantalla el dato exacto: "Hace ___ meses" (de la ficha del estudiante; sin dato real no se publica).</w:t>
       </w:r>
     </w:p>
     <w:p>
@@ -2261,7 +2261,7 @@
           <w:i w:val="0"/>
           <w:sz w:val="21"/>
         </w:rPr>
-        <w:t xml:space="preserve"> El acompañamiento diario: cada estudiante graba un video corto todos los días y el profe le dice qué mejorar. Antes y después real.</w:t>
+        <w:t xml:space="preserve"> Prueba real: tres estudiantes que entraron a Heiiu sin hablar inglés y hoy hablan. Confesión en español + 10 s en inglés. (No hay video de entrada de este grupo; la prueba es su palabra con el dato real y su inglés de hoy.)</w:t>
       </w:r>
     </w:p>
     <w:p>
@@ -2282,7 +2282,7 @@
           <w:i w:val="0"/>
           <w:sz w:val="21"/>
         </w:rPr>
-        <w:t xml:space="preserve"> Uno de los 3 estudiantes del grupo que empezó de cero en Heiiu (autorización de imagen en el contrato, verificada por coordinación; avisado de que se usa su video de entrada): 5 segundos de su video de entrada en A1 (día 1) y 5 segundos hablando hoy en B1 (grabado mañana o de su portafolio reciente). Luego el profe a cámara.   ·   </w:t>
+        <w:t xml:space="preserve"> Cada uno de los 3 que empezó de cero en Heiiu, de pie frente a la cámara, en el salón: (a) en español: "Llegué el primer día sin hablar una palabra de inglés. Hace ___ meses." (dato real de cada uno); (b) 10 segundos en inglés sobre algo suyo. Luego la profe a cámara. Son 3 piezas (una por estudiante) con la misma estructura.   ·   </w:t>
       </w:r>
       <w:r>
         <w:rPr>
@@ -2319,7 +2319,7 @@
           <w:i w:val="0"/>
           <w:sz w:val="21"/>
         </w:rPr>
-        <w:t xml:space="preserve"> Pantalla partida o corte seco: "Día 1" / "Hoy" (con el dato real: "hace ___ meses", se llena con la fecha de matrícula del estudiante). Luego el profe, con el celular en la mano, mostrando (sin que se lea el nombre) el chat donde manda la corrección.</w:t>
+        <w:t xml:space="preserve"> Plano medio fijo del estudiante. Texto grande con su frase en español mientras la dice; corte a él hablando en inglés con el texto "Hoy". Luego la profe a cámara.</w:t>
       </w:r>
     </w:p>
     <w:p>
@@ -2345,7 +2345,7 @@
           <w:i/>
           <w:sz w:val="21"/>
         </w:rPr>
-        <w:t>"(video día 1 en A1, 5 s) (video de hoy en B1, 5 s)"</w:t>
+        <w:t>"Estudiante, en español: "Llegué el primer día sin hablar una palabra de inglés. Hace ___ meses." (luego 10 s en inglés)"</w:t>
       </w:r>
     </w:p>
     <w:p>
@@ -2358,7 +2358,7 @@
           <w:i/>
           <w:sz w:val="21"/>
         </w:rPr>
-        <w:t>"Profe: Esto no pasa solo por venir a clase. Pasa porque todos los días graba un minuto, me lo manda, y yo le digo exactamente qué corregir. Al día siguiente, otra vez."</w:t>
+        <w:t>"Profe: Esto no pasa por venir a clase a copiar. Pasa porque desde el primer día hablan, se equivocan, los corregimos y lo vuelven a decir."</w:t>
       </w:r>
     </w:p>
     <w:p>
@@ -2371,7 +2371,7 @@
           <w:i/>
           <w:sz w:val="21"/>
         </w:rPr>
-        <w:t>"Un profesor que te acompaña todos los días. Eso es lo que compras aquí."</w:t>
+        <w:t>"Eso es lo que compras aquí."</w:t>
       </w:r>
     </w:p>
     <w:p>
@@ -2392,7 +2392,7 @@
           <w:i w:val="0"/>
           <w:sz w:val="21"/>
         </w:rPr>
-        <w:t xml:space="preserve"> "Día 1" · "Hoy: ___ meses, ___ horas de clase" (datos reales de la ficha) · "Un video al día. Un profesor que lo revisa."</w:t>
+        <w:t xml:space="preserve"> "Llegó sin una palabra de inglés" · "Hace ___ meses" (dato real) · "Hoy"</w:t>
       </w:r>
     </w:p>
     <w:p>
@@ -2427,7 +2427,7 @@
           <w:color w:val="666666"/>
           <w:sz w:val="19"/>
         </w:rPr>
-        <w:t>Nota: Avisar al estudiante que se usa su video de entrada; si no quiere, otro de los 3. Si se puede, grabar los 3 (tres piezas distintas con el mismo guion: Meta premia conceptos y caras distintas).</w:t>
+        <w:t>Nota: Grabar a los 3: tres piezas distintas con el mismo guion (Meta premia caras y conceptos distintos). Si uno no quiere salir, se hace con los que sí.</w:t>
       </w:r>
     </w:p>
     <w:p>
@@ -2724,7 +2724,7 @@
           <w:i w:val="0"/>
           <w:sz w:val="21"/>
         </w:rPr>
-        <w:t xml:space="preserve"> Estudiante a cámara, en inglés, respondiendo "Tell me about yourself". Texto grande: "La familia te entrevista en inglés antes de elegirte." Texto del anuncio (no del video), primera línea obligatoria: "No somos agencia: te preparamos en inglés para la entrevista de Au Pair o de trabajo en el exterior. El trámite lo haces con la agencia que elijas."</w:t>
+        <w:t xml:space="preserve"> Estudiante a cámara, en inglés, respondiendo "Tell me about yourself". Texto grande: "La familia te entrevista en inglés antes de elegirte." Texto del anuncio (no del video), primera línea obligatoria: "No somos agencia: te preparamos en inglés para la entrevista de Au Pair. El trámite lo haces con la agencia que elijas."</w:t>
       </w:r>
     </w:p>
     <w:p>
@@ -2745,7 +2745,7 @@
           <w:i w:val="0"/>
           <w:sz w:val="21"/>
         </w:rPr>
-        <w:t xml:space="preserve"> El destino #2 de la base: Au Pair, Work and Travel, Europa. Sin prometer familia, visa ni empleo: la entrevista es en inglés y aquí se ensaya.</w:t>
+        <w:t xml:space="preserve"> El destino #2 de la base: Au Pair (solo Au Pair: es el programa donde la familia sí entrevista en inglés antes de elegir; Work and Travel y Europa no siempre exigen inglés, así que no se afirman). Sin prometer familia, visa ni empleo.</w:t>
       </w:r>
     </w:p>
     <w:p>
@@ -2766,7 +2766,7 @@
           <w:i w:val="0"/>
           <w:sz w:val="21"/>
         </w:rPr>
-        <w:t xml:space="preserve"> Simulación real del grupo B1/B2: entrevista con una familia o un empleador del exterior, un estudiante responde, otro hace de entrevistador. Luego un profe a cámara.   ·   </w:t>
+        <w:t xml:space="preserve"> Simulación real del grupo B1/B2: una familia de Estados Unidos entrevista por videollamada a su candidata a Au Pair. El hombre del grupo hace de papá de la familia (lee las preguntas del tablero); las mujeres son las candidatas, una a la vez. Luego la profe a cámara.   ·   </w:t>
       </w:r>
       <w:r>
         <w:rPr>
@@ -2829,7 +2829,7 @@
           <w:i/>
           <w:sz w:val="21"/>
         </w:rPr>
-        <w:t>"(simulación: "Tell me about yourself. Why do you want to live with a family abroad?")"</w:t>
+        <w:t>"(simulación: "Tell me about yourself. Why do you want to live with a family abroad? What would you do if the child refuses to eat?")"</w:t>
       </w:r>
     </w:p>
     <w:p>
@@ -2842,7 +2842,7 @@
           <w:i/>
           <w:sz w:val="21"/>
         </w:rPr>
-        <w:t>"Profe: Au Pair, Work and Travel, Europa: ninguno te recibe por querer irte. Te reciben porque pasas la entrevista. Y la entrevista es en inglés."</w:t>
+        <w:t>"Profe: En Au Pair, la familia te entrevista en inglés antes de elegirte. Sin esa entrevista, no hay familia."</w:t>
       </w:r>
     </w:p>
     <w:p>
@@ -2855,7 +2855,7 @@
           <w:i/>
           <w:sz w:val="21"/>
         </w:rPr>
-        <w:t>"Sin la entrevista en inglés, el proceso se detiene ahí. Aquí la ensayamos hasta que la contestas sin pensar."</w:t>
+        <w:t>"Aquí la ensayamos hasta que la contestas sin pensar."</w:t>
       </w:r>
     </w:p>
     <w:p>
@@ -2911,7 +2911,7 @@
           <w:color w:val="666666"/>
           <w:sz w:val="19"/>
         </w:rPr>
-        <w:t>Nota: Prohibido: "te conseguimos la familia / la visa / el empleo", nombres de agencias, países con salario prometido. Es preparación para la entrevista, no colocación. Prueba la hipótesis destino "irse" contra destino "trabajo aquí" (guion 3).</w:t>
+        <w:t>Nota: Prohibido: "te conseguimos la familia / la visa / el empleo", nombres de agencias, países con salario prometido, y afirmar que Work and Travel o Europa exigen inglés (no siempre). Es preparación para la entrevista, no colocación. Prueba la hipótesis destino "irse" contra destino "trabajo aquí" (guion 3).</w:t>
       </w:r>
     </w:p>
     <w:p>
@@ -3008,7 +3008,7 @@
           <w:i w:val="0"/>
           <w:sz w:val="21"/>
         </w:rPr>
-        <w:t xml:space="preserve"> El profe en el tablero con el grupo B1/B2 de pie. El error sale del ERROR PAPER real del grupo (anónimo); no se inventa.   ·   </w:t>
+        <w:t xml:space="preserve"> La profe en el tablero con el grupo B1/B2 de pie. El error sale del error paper del grupo si existe; si no, uno de los tres típicos de hispanohablantes que trae la hoja de la profe ("I am agree" → "I agree"; "depends of" → "depends on"; "people is" → "people are"). La voz de la profe en inglés es mínima: el contenido va escrito.   ·   </w:t>
       </w:r>
       <w:r>
         <w:rPr>
@@ -3153,7 +3153,7 @@
           <w:color w:val="666666"/>
           <w:sz w:val="19"/>
         </w:rPr>
-        <w:t>Nota: Sin la palabra "gratis". Es la pieza que prueba la hipótesis de dar valor primero (Freedman y Fraser 1966: un pedido pequeño sube la aceptación del grande).</w:t>
+        <w:t>Nota: Sin la palabra "gratis". El acento de la profe no es tema: la pieza muestra la corrección escrita, no una clase de pronunciación. Es la pieza que prueba la hipótesis de dar valor primero (Freedman y Fraser 1966).</w:t>
       </w:r>
     </w:p>
     <w:p>
@@ -3192,7 +3192,7 @@
           <w:i w:val="0"/>
           <w:sz w:val="21"/>
         </w:rPr>
-        <w:t>• DATOS A CONFIRMAR ANTES DE PUBLICAR (no se inventan): meses y horas reales de cada uno de los 3 estudiantes que empezaron de cero (guiones 2, 4, 6); que el agente de WhatsApp recibe audios y alguien los responde en menos de 24 h (cierres de reciprocidad); el error real del error paper (guion 9); que la cláusula de imagen del contrato cubre uso publicitario.</w:t>
+        <w:t>• DATOS A CONFIRMAR ANTES DE PUBLICAR (no se inventan): meses reales desde la matrícula de cada uno de los 3 que empezaron de cero (guiones 2 y 6); que el agente de WhatsApp recibe audios y alguien los responde en menos de 24 h (cierres de reciprocidad).</w:t>
       </w:r>
     </w:p>
     <w:p>
@@ -3218,7 +3218,7 @@
           <w:i w:val="0"/>
           <w:sz w:val="21"/>
         </w:rPr>
-        <w:t>• La autorización de imagen está en el contrato de matrícula que todos firmaron (coordinación verifica que cubre publicidad); avisar al grupo antes de la clase y respetar a quien pida no salir. Sin nombres en pantalla.</w:t>
+        <w:t>• La autorización de imagen está en el contrato de matrícula que todos firmaron; la profe avisa al grupo y quien diga voluntariamente que no, queda fuera de plano. Sin nombres en pantalla.</w:t>
       </w:r>
     </w:p>
     <w:p>

</xml_diff>

<commit_message>
Grabacion 09/10: segunda ronda de comentarios (compromiso al avisar, siete meses corto, todo en ingles en clase, CTA en todas las piezas, toma 2 del cierre, audio con frase propia)
Co-Authored-By: Claude Opus 5.5 <noreply@anthropic.com>
</commit_message>
<xml_diff>
--- a/recursos/comercial/campañas/GUIONES_GRABACION_2026-10-09.docx
+++ b/recursos/comercial/campañas/GUIONES_GRABACION_2026-10-09.docx
@@ -152,7 +152,7 @@
           <w:i w:val="0"/>
           <w:sz w:val="21"/>
         </w:rPr>
-        <w:t xml:space="preserve"> todos los estudiantes tienen firmada la autorización de imagen en su contrato de matrícula. La profe avisa al grupo que la clase se graba; si alguien dice voluntariamente que no quiere salir, queda fuera de plano. Coordinación entrega la fecha de matrícula de los 3 que empezaron de cero (para "hace ___ meses" en pantalla). Sin nombres de estudiantes en pantalla.</w:t>
+        <w:t xml:space="preserve"> todos los estudiantes tienen firmada la autorización de imagen en su contrato de matrícula. La profe les pregunta si están contentos con la clase y les pide ayuda: "parte de mi trabajo es grabar contenido"; si alguien dice voluntariamente que no quiere salir, queda fuera de plano. Coordinación entrega la fecha de matrícula de los 3 que empezaron de cero (para "hace ___ meses" en pantalla). Sin nombres de estudiantes en pantalla.</w:t>
       </w:r>
     </w:p>
     <w:p>
@@ -260,33 +260,75 @@
           <w:i w:val="0"/>
           <w:sz w:val="21"/>
         </w:rPr>
-        <w:t>ANTES de la clase, salón vacío (10 min, cuando Isaac llegue):</w:t>
+        <w:t>Al empezar la clase (antes de prender la cámara):</w:t>
       </w:r>
-    </w:p>
-    <w:p>
-      <w:pPr>
-        <w:spacing w:after="60"/>
-      </w:pPr>
       <w:r>
         <w:rPr>
           <w:b w:val="0"/>
           <w:i w:val="0"/>
           <w:sz w:val="21"/>
         </w:rPr>
-        <w:t xml:space="preserve">  1. Escribe en el tablero un "5 AÑOS" grande y táchalo. A CÁMARA: "El Marco Común Europeo calcula entre quinientas y seiscientas horas de clase para llegar a B2. En Heiiu son quinientas setenta y cinco. A dos horas por semana, eso son cinco años. Aquí son cuatro horas al día: siete meses. O dos horas cada noche: catorce meses. No es fácil. Es rápido porque es intenso. Lo que firmamos: si cumples y no avanzas, te devolvemos el nivel." Mientras hablas, escribe "575 h", "7 meses" y "14 meses". (2 tomas.)</w:t>
+        <w:t xml:space="preserve"> pregúntales si están contentos con la clase. Cuando digan que sí: "Parte de mi trabajo es grabar contenido de la academia, y hoy me ayudarían mucho: la clase de simulación se graba. Es la misma clase de siempre, con cámara." Con ánimo, como algo normal. Si alguien dice voluntariamente que no quiere salir, lo ubicas fuera de plano y participa desde ahí como observador; no se discute ni se insiste. (Todos tienen firmada la autorización de imagen en su contrato.)</w:t>
       </w:r>
     </w:p>
     <w:p>
       <w:pPr>
         <w:spacing w:after="60"/>
       </w:pPr>
+      <w:r>
+        <w:rPr>
+          <w:b/>
+          <w:i w:val="0"/>
+          <w:sz w:val="21"/>
+        </w:rPr>
+        <w:t>Dentro de la clase todo va en inglés</w:t>
+      </w:r>
       <w:r>
         <w:rPr>
           <w:b w:val="0"/>
           <w:i w:val="0"/>
           <w:sz w:val="21"/>
         </w:rPr>
-        <w:t xml:space="preserve">  2. Sentada en el borde del escritorio, A CÁMARA, seria: "Hay vacantes que dicen inglés intermedio. Ese renglón deja a mucha gente por fuera. El inglés no te da el puesto. Pero sin inglés, ese puesto ni se abre. En clase ensayamos la entrevista completa, pregunta por pregunta, hasta que se contesta sin pensar." (2 tomas.)</w:t>
+        <w:t xml:space="preserve"> (es un grupo B2): escenario, preguntas, instrucciones y correcciones. Solo las frases marcadas A CÁMARA se dicen en español: son para el anuncio.</w:t>
+      </w:r>
+    </w:p>
+    <w:p>
+      <w:pPr>
+        <w:spacing w:after="60"/>
+      </w:pPr>
+      <w:r>
+        <w:rPr>
+          <w:b/>
+          <w:i w:val="0"/>
+          <w:sz w:val="21"/>
+        </w:rPr>
+        <w:t>ANTES de la clase, salón vacío (10 min, cuando Isaac llegue):</w:t>
+      </w:r>
+    </w:p>
+    <w:p>
+      <w:pPr>
+        <w:spacing w:after="60"/>
+      </w:pPr>
+      <w:r>
+        <w:rPr>
+          <w:b w:val="0"/>
+          <w:i w:val="0"/>
+          <w:sz w:val="21"/>
+        </w:rPr>
+        <w:t xml:space="preserve">  1. Escribe en el tablero un "5 AÑOS" grande y táchalo. A CÁMARA: "El Marco Común Europeo calcula entre quinientas y seiscientas horas de clase para llegar a B2. Si estudias dos horas por semana, son cinco años. Aquí: cuatro horas al día, siete meses. O si trabajas, dos horas cada noche: catorce. No es fácil. Es rápido porque es intenso." Mientras hablas, escribe "575 h", "7 meses" y "14 meses". CIERRE: "Pregúntanos qué fecha te queda. Escríbenos." (2 tomas.)</w:t>
+      </w:r>
+    </w:p>
+    <w:p>
+      <w:pPr>
+        <w:spacing w:after="60"/>
+      </w:pPr>
+      <w:r>
+        <w:rPr>
+          <w:b w:val="0"/>
+          <w:i w:val="0"/>
+          <w:sz w:val="21"/>
+        </w:rPr>
+        <w:t xml:space="preserve">  2. Sentada en el borde del escritorio, A CÁMARA, seria: "Hay vacantes que dicen inglés intermedio. Ese renglón deja a mucha gente sin poder aplicar. El inglés no te da el puesto. Pero sin inglés, ese puesto ni se abre. Aquí la entrevista se ensaya en clase, pregunta por pregunta, hasta que se contesta sin pensar." CIERRE: "Cuéntanos para qué necesitas el inglés y te decimos por dónde empezar. Escríbenos." (2 tomas.)</w:t>
       </w:r>
     </w:p>
     <w:p>
@@ -312,7 +354,7 @@
           <w:i w:val="0"/>
           <w:sz w:val="21"/>
         </w:rPr>
-        <w:t xml:space="preserve">  3. Minuto 0-7 · Corrección del día. Si el grupo tiene error paper, usa el error más repetido. Si no, usa UNO de estos tres, típicos de hispanohablantes en B1/B2 (elige el que más oyes en el grupo): (a) "I am agree" → "I agree"; (b) "It depends of the company" → "It depends on the company"; (c) "People is waiting" → "People are waiting". Con el grupo de pie: escribe la frase con el error, táchala, escribe la correcta y di "Repeat". Todos la repiten dos veces; pide a uno de los 3 que empezó de cero que la use en una frase propia. Tu voz en inglés es mínima (el contenido va escrito en el tablero; el acento no importa, lo que se ve es la corrección). Al final, A CÁMARA, en español: "Mándanos un audio diciéndola y te la corregimos."</w:t>
+        <w:t xml:space="preserve">  3. Minuto 0-7 · Corrección del día. Si el grupo tiene error paper, usa el error más repetido. Si no, usa UNO de estos tres, típicos de hispanohablantes (elige el que más oyes en el grupo): (a) "I am agree" → "I agree"; (b) "It depends of the company" → "It depends on the company"; (c) "People is waiting" → "People are waiting". Con el grupo de pie: escribe la frase con el error y pregunta "Can anyone tell me why this is wrong?"; deja que uno lo explique; táchala, escribe la correcta y di "Repeat". Todos la repiten dos veces; pide a uno de los 3 que empezó de cero que la use en una frase propia. Tu voz en inglés es corta (el contenido va escrito en el tablero; lo que se ve es la corrección). CIERRE, A CÁMARA, en español: "Mándanos un audio con tu propia frase usando esto, y te la corregimos."</w:t>
       </w:r>
     </w:p>
     <w:p>
@@ -325,7 +367,7 @@
           <w:i w:val="0"/>
           <w:sz w:val="21"/>
         </w:rPr>
-        <w:t xml:space="preserve">  4. Minuto 7-19 · Simulación 1, entrevista de trabajo. ESCENARIO (lo dices antes de empezar y lo escribes en el tablero): "Una empresa de Bucaramanga busca asistente de servicio al cliente bilingüe. Hoy es la entrevista." Las 3 preguntas van escritas en el tablero: "Tell me about yourself." / "Why should we hire you?" / "Tell me about a problem you solved at work." ROLES: 1 candidato (empieza el más seguro del grupo, no el más tímido), 1 entrevistador (lee las preguntas del tablero), los otros 3 son observadores de pie con su error paper: anotan UNA cosa que el candidato hizo bien y UN error que oyeron. ROTACIÓN: cada 4 minutos cambia candidato y entrevistador; en 12 minutos pasan los 5 (3 candidatos). CORRECCIÓN EN CÁMARA: corrige lo seguro y visible (volumen, mirar al entrevistador, repetir la frase completa, pronunciación de una palabra): "Again. Louder. Look at her, not at me." La gramática la corriges después, fuera de cámara, con lo que anotaron los observadores. PÁNICO: si alguien se bloquea, el entrevistador repite la pregunta más despacio y el candidato contesta con una sola frase; eso también sirve. Al terminar, A CÁMARA: "Aquí nadie copia del tablero. Desde la primera clase hablas, te equivocas, te corregimos y lo vuelves a decir. Así se entrena un idioma."</w:t>
+        <w:t xml:space="preserve">  4. Minuto 7-19 · Simulación 1, entrevista de trabajo. ESCENARIO (lo dices en inglés y lo escribes en el tablero): "A company in Bucaramanga is hiring a bilingual customer service assistant. Today is the interview." Las 3 preguntas, en el tablero: "Tell me about yourself." / "Why should we hire you?" / "Tell me about a problem you solved at work." ROLES: 1 candidato (empieza el más seguro del grupo, no el más tímido), 1 entrevistador (lee las preguntas del tablero), los otros 3 son observadores de pie con su error paper: anotan UNA cosa que el candidato hizo bien y UN error que oyeron. ROTACIÓN: cada 4 minutos cambia candidato y entrevistador; en 12 minutos pasan los 5 (3 candidatos). CORRECCIÓN EN CÁMARA: corrige lo seguro y visible (volumen, mirar al entrevistador, repetir la frase completa, pronunciación de una palabra): "Again. Louder. Look at her, not at me." La gramática la corriges después, fuera de cámara, con lo que anotaron los observadores. PÁNICO: si alguien se bloquea, el entrevistador repite la pregunta más despacio y el candidato contesta con una sola frase; eso también sirve. Al terminar, A CÁMARA: "Aquí nadie copia del tablero. Desde la primera clase hablas, te equivocas, te corregimos y lo vuelves a decir. Así se entrena un idioma." CIERRE: "¿Quieres ver una clase así por dentro? Escríbenos."</w:t>
       </w:r>
     </w:p>
     <w:p>
@@ -338,7 +380,7 @@
           <w:i w:val="0"/>
           <w:sz w:val="21"/>
         </w:rPr>
-        <w:t xml:space="preserve">  5. Minuto 19-29 · Simulación 2, entrevista de Au Pair (solo Au Pair: es el programa donde la familia sí entrevista en inglés antes de elegir). ESCENARIO en el tablero: "Una familia en Estados Unidos entrevista por videollamada a su candidata a Au Pair." ROLES: el hombre del grupo hace de papá de la familia (lee las preguntas del tablero), las mujeres son las candidatas, una a la vez, 3 minutos cada una; las que no están en turno observan y anotan. Preguntas en el tablero: "Tell me about yourself." / "Why do you want to live with a family abroad?" / "What would you do if the child refuses to eat?" Misma corrección que en la simulación 1. Al terminar, A CÁMARA: "En Au Pair, la familia te entrevista en inglés antes de elegirte. Sin esa entrevista, no hay familia. Aquí la ensayamos hasta que la contestas sin pensar."</w:t>
+        <w:t xml:space="preserve">  5. Minuto 19-29 · Simulación 2, entrevista de Au Pair (solo Au Pair: es el programa donde la familia sí entrevista en inglés antes de elegir). ESCENARIO en el tablero, en inglés: "A family in the United States is interviewing their Au Pair candidate by video call." ROLES: el hombre del grupo hace de papá de la familia (lee las preguntas del tablero), las mujeres son las candidatas, una a la vez, 3 minutos cada una; las que no están en turno observan y anotan. Preguntas en el tablero: "Tell me about yourself." / "Why do you want to live with a family abroad?" / "What would you do if the child refuses to eat?" Misma corrección que en la simulación 1. Al terminar, A CÁMARA: "En Au Pair, la familia te entrevista en inglés antes de elegirte. Sin esa entrevista, no hay familia. Aquí la ensayamos hasta que la contestas sin pensar." CIERRE: "Cuéntanos a dónde quieres ir y te decimos qué nivel te pide. Escríbenos."</w:t>
       </w:r>
     </w:p>
     <w:p>
@@ -351,7 +393,7 @@
           <w:i w:val="0"/>
           <w:sz w:val="21"/>
         </w:rPr>
-        <w:t xml:space="preserve">  6. Minuto 29-37 · Los 3 que empezaron de cero en Heiiu, uno por uno, de pie frente a la cámara: (a) en español, una frase: "Llegué el primer día sin hablar una palabra de inglés. Hace ___ meses." (cada uno dice su dato real); (b) luego 10 segundos hablando en inglés de algo suyo (su trabajo, su plan). Después tú, A CÁMARA: "Esto no pasa por venir a clase a copiar. Pasa porque desde el primer día hablan, se equivocan, los corregimos y lo vuelven a decir. Eso es lo que compras aquí." Y una segunda versión del cierre: "Mándanos un audio de 30 segundos y te decimos tu nivel."</w:t>
+        <w:t xml:space="preserve">  6. Minuto 29-37 · Los 3 que empezaron de cero en Heiiu, uno por uno, de pie frente a la cámara: (a) en español, una frase: "Llegué el primer día sin hablar una palabra de inglés. Hace ___ meses." (cada uno dice su dato real); (b) luego 10 segundos hablando en inglés de algo suyo (su trabajo, su plan). Después tú, A CÁMARA: "Esto no pasa por venir a clase a copiar. Pasa porque desde el primer día hablan, se equivocan, los corregimos y lo vuelven a decir. Eso es lo que compras aquí." CIERRE: "¿Quieres llegar ahí? Escríbenos." TOMA 2 DEL CIERRE (5 segundos más, se graba adicional): "Mándanos un audio de 30 segundos y te decimos tu nivel."</w:t>
       </w:r>
     </w:p>
     <w:p>
@@ -385,7 +427,7 @@
           <w:i w:val="0"/>
           <w:sz w:val="21"/>
         </w:rPr>
-        <w:t xml:space="preserve"> muy cerca de la cámara, hablando bajo: "Te voy a decir lo que no te prometemos: que sea fácil, ni que te guste todos los días. Vas a tener clases pesadas y días de no querer venir. Lo que sí te prometemos: que hablas desde el primer día, que te corrigen todos los días, y que si cumples y no avanzas, te devolvemos la plata. Te lo entregamos firmado. Si buscas que sea divertido, no somos tu academia. Si buscas hablar inglés, sí."</w:t>
+        <w:t xml:space="preserve"> muy cerca de la cámara, hablando bajo: "Te voy a decir lo que no te prometemos: que sea fácil, ni que te guste todos los días. Vas a tener clases pesadas y días de no querer venir. Lo que sí te prometemos: que hablas desde el primer día, que te corrigen todos los días, y que si cumples y no avanzas, te devolvemos la plata. Te lo entregamos firmado. Si buscas que sea divertido, no somos tu academia. Si buscas hablar inglés, sí." CIERRE: "Si vas en serio, escríbenos."</w:t>
       </w:r>
     </w:p>
     <w:p>
@@ -419,27 +461,6 @@
           <w:i w:val="0"/>
           <w:sz w:val="21"/>
         </w:rPr>
-        <w:t>Los estudiantes:</w:t>
-      </w:r>
-      <w:r>
-        <w:rPr>
-          <w:b w:val="0"/>
-          <w:i w:val="0"/>
-          <w:sz w:val="21"/>
-        </w:rPr>
-        <w:t xml:space="preserve"> todos tienen firmada la autorización de imagen en su contrato. Al empezar la clase les dices: "Hoy la clase de simulación se graba; es la misma clase de siempre, con cámara; cada uno recibe su clip." Si alguien dice voluntariamente que no quiere salir, lo ubicas fuera de plano y sigue participando desde ahí como observador. No se discute ni se insiste.</w:t>
-      </w:r>
-    </w:p>
-    <w:p>
-      <w:pPr>
-        <w:spacing w:after="60"/>
-      </w:pPr>
-      <w:r>
-        <w:rPr>
-          <w:b/>
-          <w:i w:val="0"/>
-          <w:sz w:val="21"/>
-        </w:rPr>
         <w:t>Si algo falla:</w:t>
       </w:r>
       <w:r>
@@ -448,7 +469,7 @@
           <w:i w:val="0"/>
           <w:sz w:val="21"/>
         </w:rPr>
-        <w:t xml:space="preserve"> si uno de los 3 "de cero" no quiere salir, el paso 6 se hace con los que sí. Si alguien se bloquea, una sola frase basta. Si una toma sale mal, se repite. Todo queda grabado mañana; nada se reprograma.</w:t>
+        <w:t xml:space="preserve"> si uno de los 3 "de cero" no quiere salir, el paso 6 se hace con los que sí. Si alguien se bloquea, una sola frase basta. Si una toma sale mal, se repite. Todo queda grabado hoy.</w:t>
       </w:r>
     </w:p>
     <w:p>
@@ -1314,7 +1335,7 @@
           <w:i w:val="0"/>
           <w:sz w:val="21"/>
         </w:rPr>
-        <w:t xml:space="preserve"> Nadie a cámara: se graba la simulación real del grupo B1/B2: entrevista de trabajo (escenario: una empresa de Bucaramanga busca asistente de servicio al cliente bilingüe; 3 preguntas en el tablero; 1 candidato, 1 entrevistador, 3 observadores de pie; rotan cada 4 minutos). La profe corrige en vivo lo visible (volumen, mirada, repetir la frase completa, pronunciación). Al final, la profe dice UNA frase a cámara. Todo esto está en la hoja de la profe; Isaac solo graba.   ·   </w:t>
+        <w:t xml:space="preserve"> Nadie a cámara: se graba la simulación real del grupo B2, toda en inglés: entrevista de trabajo (escenario en el tablero: "A company in Bucaramanga is hiring a bilingual customer service assistant"; 3 preguntas en el tablero; 1 candidato, 1 entrevistador, 3 observadores de pie; rotan cada 4 minutos). La profe corrige en vivo lo visible (volumen, mirada, repetir la frase completa, pronunciación). Al final, la profe dice UNA frase a cámara. Todo esto está en la hoja de la profe; Isaac solo graba.   ·   </w:t>
       </w:r>
       <w:r>
         <w:rPr>
@@ -1606,7 +1627,7 @@
           <w:i/>
           <w:sz w:val="21"/>
         </w:rPr>
-        <w:t>"Hay vacantes que dicen "inglés intermedio". Ese renglón deja a mucha gente por fuera."</w:t>
+        <w:t>"Hay vacantes que dicen "inglés intermedio". Ese renglón deja a mucha gente sin poder aplicar."</w:t>
       </w:r>
     </w:p>
     <w:p>
@@ -1632,7 +1653,7 @@
           <w:i/>
           <w:sz w:val="21"/>
         </w:rPr>
-        <w:t>"En clase ensayamos la entrevista completa, pregunta por pregunta, hasta que se contesta sin pensar."</w:t>
+        <w:t>"Aquí la entrevista se ensaya en clase, pregunta por pregunta, hasta que se contesta sin pensar."</w:t>
       </w:r>
     </w:p>
     <w:p>
@@ -1848,7 +1869,7 @@
           <w:i/>
           <w:sz w:val="21"/>
         </w:rPr>
-        <w:t>"El Marco Común Europeo calcula entre quinientas y seiscientas horas de clase para llegar a B2. En Heiiu son quinientas setenta y cinco."</w:t>
+        <w:t>"El Marco Común Europeo calcula entre quinientas y seiscientas horas de clase para llegar a B2."</w:t>
       </w:r>
     </w:p>
     <w:p>
@@ -1861,7 +1882,7 @@
           <w:i/>
           <w:sz w:val="21"/>
         </w:rPr>
-        <w:t>"A dos horas por semana, eso son cinco años. Aquí son cuatro horas al día: siete meses. O dos horas cada noche: catorce meses."</w:t>
+        <w:t>"Si estudias dos horas por semana, son cinco años. Aquí: cuatro horas al día, siete meses. O si trabajas, dos horas cada noche: catorce."</w:t>
       </w:r>
     </w:p>
     <w:p>
@@ -1875,19 +1896,6 @@
           <w:sz w:val="21"/>
         </w:rPr>
         <w:t>"No es fácil. Es rápido porque es intenso."</w:t>
-      </w:r>
-    </w:p>
-    <w:p>
-      <w:pPr>
-        <w:spacing w:after="40"/>
-      </w:pPr>
-      <w:r>
-        <w:rPr>
-          <w:b w:val="0"/>
-          <w:i/>
-          <w:sz w:val="21"/>
-        </w:rPr>
-        <w:t>"Lo que firmamos: si cumples y no avanzas, te devolvemos el nivel."</w:t>
       </w:r>
     </w:p>
     <w:p>
@@ -1908,7 +1916,7 @@
           <w:i w:val="0"/>
           <w:sz w:val="21"/>
         </w:rPr>
-        <w:t xml:space="preserve"> "B2 = 500-600 h (Marco Común Europeo)" · "2 h/semana = 5 años" · "Aquí: 7 meses · noche: 14"</w:t>
+        <w:t xml:space="preserve"> "B2 = 500-600 h (Marco Común Europeo)" · "2 h/semana = 5 años" · "Aquí: 7 meses · noche: 14" · al final: "Garantía por escrito"</w:t>
       </w:r>
     </w:p>
     <w:p>
@@ -2413,7 +2421,7 @@
           <w:i w:val="0"/>
           <w:sz w:val="21"/>
         </w:rPr>
-        <w:t xml:space="preserve"> "¿Quieres que te acompañen así? Escríbenos." Botón: WhatsApp. VARIANTE DE CIERRE (grabar también, 5 s del profe): "Mándanos un audio de 30 segundos y te decimos tu nivel." Solo se publica si el agente recibe audios y alguien los responde en menos de 24 h; si no, "te decimos tu nivel en la cita".</w:t>
+        <w:t xml:space="preserve"> "¿Quieres llegar ahí? Escríbenos." Botón: WhatsApp. TOMA 2 DEL CIERRE (se graba adicional, 5 s de la profe): "Mándanos un audio de 30 segundos y te decimos tu nivel." Solo se publica si el agente recibe audios y alguien los responde en menos de 24 h; si no, "te decimos tu nivel en la cita".</w:t>
       </w:r>
     </w:p>
     <w:p>
@@ -3084,7 +3092,7 @@
           <w:i/>
           <w:sz w:val="21"/>
         </w:rPr>
-        <w:t>"Profe: Este es el error que más oigo. Así se corrige. Repeat."</w:t>
+        <w:t>"Profe (en inglés): "Can anyone tell me why this is wrong?" → lo tacha, escribe la correcta → "Repeat.""</w:t>
       </w:r>
     </w:p>
     <w:p>
@@ -3097,7 +3105,7 @@
           <w:i/>
           <w:sz w:val="21"/>
         </w:rPr>
-        <w:t>"Profe a cámara: Mándanos un audio diciéndola y te la corregimos."</w:t>
+        <w:t>"Profe a cámara, en español: Mándanos un audio con tu propia frase usando esto, y te la corregimos."</w:t>
       </w:r>
     </w:p>
     <w:p>
@@ -3139,7 +3147,7 @@
           <w:i w:val="0"/>
           <w:sz w:val="21"/>
         </w:rPr>
-        <w:t xml:space="preserve"> "Mándanos un audio diciéndola y te la corregimos." Botón: WhatsApp. (Si el agente no recibe audios: "Escríbenos y te decimos tu nivel en la cita".)</w:t>
+        <w:t xml:space="preserve"> "Mándanos un audio con tu propia frase usando esto, y te la corregimos." Botón: WhatsApp. (Si el agente no recibe audios: "Escríbenos y te decimos tu nivel en la cita".)</w:t>
       </w:r>
     </w:p>
     <w:p>
@@ -3218,7 +3226,7 @@
           <w:i w:val="0"/>
           <w:sz w:val="21"/>
         </w:rPr>
-        <w:t>• La autorización de imagen está en el contrato de matrícula que todos firmaron; la profe avisa al grupo y quien diga voluntariamente que no, queda fuera de plano. Sin nombres en pantalla.</w:t>
+        <w:t>• La autorización de imagen está en el contrato de matrícula que todos firmaron; la profe lo plantea como ayuda a su trabajo y quien diga voluntariamente que no, queda fuera de plano. Sin nombres en pantalla.</w:t>
       </w:r>
     </w:p>
     <w:p>

</xml_diff>

<commit_message>
Grabacion 09/10: comentarios de coordinacion (anexo de garantia en vez de contrato, motivacion + coach, padres sin video diario y con IA, sin reporte)
Co-Authored-By: Claude Opus 5.5 <noreply@anthropic.com>
</commit_message>
<xml_diff>
--- a/recursos/comercial/campañas/GUIONES_GRABACION_2026-10-09.docx
+++ b/recursos/comercial/campañas/GUIONES_GRABACION_2026-10-09.docx
@@ -173,7 +173,7 @@
           <w:i w:val="0"/>
           <w:sz w:val="21"/>
         </w:rPr>
-        <w:t xml:space="preserve"> (1) antes de la clase, con el salón vacío: guion 3 "Siete meses" (profe + tablero), guion 4 "La vacante" (profe), tomas de la fachada y la recepción; (2) durante la clase, con el grupo: guion 7 "La corrección del día" al abrir (usa el error paper real), guion 2 "Esto es una clase" (simulación de entrevista o reclamo, 10 minutos de pie), guion 5 "El pasaporte" (simulación de entrevista con familia/empleador, 10 minutos), guion 1 "Llegué sin una palabra" (cada uno de los 3 que empezó de cero: la frase en español con su dato real + 10 s en inglés); (3) después de la clase: guion 6 "Te lo firmamos" (Jacqueline con el contrato impreso), guion 9 "Su hijo a los 18" (Jacqueline en recepción) y guion 8 "El Pacto" (profe, 5 minutos, a solas). Se graban los 9; ninguno es opcional. Total estimado: 3 horas.</w:t>
+        <w:t xml:space="preserve"> (1) antes de la clase, con el salón vacío: guion 3 "Siete meses" (profe + tablero), guion 4 "La vacante" (profe), tomas de la fachada y la recepción; (2) durante la clase, con el grupo: guion 7 "La corrección del día" al abrir (usa el error paper real), guion 2 "Esto es una clase" (simulación de entrevista o reclamo, 10 minutos de pie), guion 5 "El pasaporte" (simulación de entrevista con familia/empleador, 10 minutos), guion 1 "Llegué sin una palabra" (cada uno de los 3 que empezó de cero: la frase en español con su dato real + 10 s en inglés); (3) después de la clase: guion 1 "Te acompañamos" (Jacqueline con el anexo de garantía impreso), guion 9 "Su hijo a los 18" (Jacqueline en recepción) y guion 8 "El Pacto" (profe, 5 minutos, a solas). Se graban los 9; ninguno es opcional. Total estimado: 3 horas.</w:t>
       </w:r>
     </w:p>
     <w:p>
@@ -745,7 +745,7 @@
                 <w:b/>
                 <w:sz w:val="18"/>
               </w:rPr>
-              <w:t>1 "Te lo firmamos"</w:t>
+              <w:t>1 "Te acompañamos (y te lo firmamos)"</w:t>
             </w:r>
           </w:p>
         </w:tc>
@@ -957,7 +957,7 @@
           <w:i w:val="0"/>
           <w:sz w:val="21"/>
         </w:rPr>
-        <w:t>4. GUION 1 "Te lo firmamos": la garantía va DESPUÉS del precio (bot, cita, retargeting), no como gancho de alcance. Se graba igual.</w:t>
+        <w:t>4. GUION 1 "Te acompañamos": la garantía va DESPUÉS del precio (bot, cita, retargeting), no como gancho de alcance. Se graba igual.</w:t>
       </w:r>
     </w:p>
     <w:p>
@@ -1009,7 +1009,7 @@
           <w:color w:val="E54C09"/>
           <w:sz w:val="25"/>
         </w:rPr>
-        <w:t>GUION 1 — TE LO FIRMAMOS   [PRIORITARIO]   · anuncio V6_GARANTIA</w:t>
+        <w:t>GUION 1 — TE ACOMPAÑAMOS (Y TE LO FIRMAMOS)   [PRIORITARIO]   · anuncio V6_GARANTIA</w:t>
       </w:r>
     </w:p>
     <w:p>
@@ -1030,7 +1030,7 @@
           <w:i w:val="0"/>
           <w:sz w:val="21"/>
         </w:rPr>
-        <w:t xml:space="preserve"> "Hola, vi el video de la garantía (V6). ¿Me muestran el contrato?"</w:t>
+        <w:t xml:space="preserve"> "Hola, vi el video del acompañamiento (V6). ¿Me muestran la garantía?"</w:t>
       </w:r>
     </w:p>
     <w:p>
@@ -1051,7 +1051,7 @@
           <w:i w:val="0"/>
           <w:sz w:val="21"/>
         </w:rPr>
-        <w:t xml:space="preserve"> Jacqueline levanta el contrato a cámara. Texto grande: "Si cumples y no avanzas, te devolvemos el 100%. Firmado."</w:t>
+        <w:t xml:space="preserve"> Jacqueline a cámara, sin papel todavía: "Tienes las ganas. Pero a veces te falla la motivación." Texto grande: "Las ganas no bastan."</w:t>
       </w:r>
     </w:p>
     <w:p>
@@ -1072,7 +1072,7 @@
           <w:i w:val="0"/>
           <w:sz w:val="21"/>
         </w:rPr>
-        <w:t xml:space="preserve"> La garantía por escrito, legible y fácil de cobrar. OJO: siempre "única academia PRESENCIAL de Bucaramanga" (las plataformas online E4CC y EF sí tienen garantía escrita; Wall Street ya no opera en la ciudad). Y la nuestra cabe en 3 líneas.</w:t>
+        <w:t xml:space="preserve"> La motivación que falla y el acompañamiento que la sostiene (el profe como coach), cerrado con la garantía por escrito. OJO: siempre "única academia PRESENCIAL de Bucaramanga" (las plataformas online E4CC y EF sí tienen garantía escrita).</w:t>
       </w:r>
     </w:p>
     <w:p>
@@ -1093,7 +1093,7 @@
           <w:i w:val="0"/>
           <w:sz w:val="21"/>
         </w:rPr>
-        <w:t xml:space="preserve"> Coordinación (Jacqueline), de pie, con el contrato impreso en la mano. Fondo: la recepción o un aula vacía con el tablero.   ·   </w:t>
+        <w:t xml:space="preserve"> Coordinación (Jacqueline), de pie, con el ANEXO DE GARANTÍA impreso en la mano (el documento que se firma con la matrícula; la garantía no está en el contrato de 24 cláusulas). Fondo: la recepción o un aula vacía con el tablero.   ·   </w:t>
       </w:r>
       <w:r>
         <w:rPr>
@@ -1109,7 +1109,7 @@
           <w:i w:val="0"/>
           <w:sz w:val="21"/>
         </w:rPr>
-        <w:t xml:space="preserve"> 20-25 s</w:t>
+        <w:t xml:space="preserve"> 25-30 s</w:t>
       </w:r>
     </w:p>
     <w:p>
@@ -1130,7 +1130,7 @@
           <w:i w:val="0"/>
           <w:sz w:val="21"/>
         </w:rPr>
-        <w:t xml:space="preserve"> Plano medio. Al decir "aquí", muestra la hoja a cámara y señala la cláusula con el dedo. Al final, la firma de la academia en la hoja.</w:t>
+        <w:t xml:space="preserve"> Plano medio. En la última frase, muestra el anexo a cámara y señala la garantía con el dedo. Cierre sobre la hoja, legible.</w:t>
       </w:r>
     </w:p>
     <w:p>
@@ -1156,7 +1156,7 @@
           <w:i/>
           <w:sz w:val="21"/>
         </w:rPr>
-        <w:t>"Todas las academias te prometen que vas a aprender inglés. Nosotros te lo entregamos firmado."</w:t>
+        <w:t>"Tienes las ganas de aprender inglés. Pero a veces te falla la motivación. Eso no solo pasa con el inglés: pasa con todo."</w:t>
       </w:r>
     </w:p>
     <w:p>
@@ -1169,7 +1169,7 @@
           <w:i/>
           <w:sz w:val="21"/>
         </w:rPr>
-        <w:t>"Aquí, en tu contrato, dice: si cumples con tu asistencia, tus tareas y tus evaluaciones, y no avanzas, te devolvemos el cien por ciento del nivel."</w:t>
+        <w:t>"Por eso aquí no solo te enseñan. Te acompañan: tu profe es tu coach. Te corrige todos los días, te pide cuentas y no te deja soltar."</w:t>
       </w:r>
     </w:p>
     <w:p>
@@ -1182,7 +1182,7 @@
           <w:i/>
           <w:sz w:val="21"/>
         </w:rPr>
-        <w:t>"Si cumples y no avanzas, el que pierde plata somos nosotros. No te pedimos que nos creas: te pedimos que leas."</w:t>
+        <w:t>"Y si cumples y no avanzas, te devolvemos el cien por ciento del nivel. Te lo entregamos firmado."</w:t>
       </w:r>
     </w:p>
     <w:p>
@@ -1203,7 +1203,7 @@
           <w:i w:val="0"/>
           <w:sz w:val="21"/>
         </w:rPr>
-        <w:t xml:space="preserve"> "GARANTÍA DE APRENDIZAJE POR ESCRITO" · "Única academia presencial de Bucaramanga que la firma · sin letra pequeña"</w:t>
+        <w:t xml:space="preserve"> "Las ganas no bastan" · "Tu profe es tu coach" · "Garantía de aprendizaje por escrito · única academia presencial de Bucaramanga que la firma"</w:t>
       </w:r>
     </w:p>
     <w:p>
@@ -1224,7 +1224,7 @@
           <w:i w:val="0"/>
           <w:sz w:val="21"/>
         </w:rPr>
-        <w:t xml:space="preserve"> "Escríbenos y te mostramos el contrato antes de que decidas." Botón: WhatsApp.</w:t>
+        <w:t xml:space="preserve"> "Escríbenos y te mostramos la garantía antes de que decidas." Botón: WhatsApp.</w:t>
       </w:r>
     </w:p>
     <w:p>
@@ -1238,7 +1238,7 @@
           <w:color w:val="666666"/>
           <w:sz w:val="19"/>
         </w:rPr>
-        <w:t>Nota: Que el contrato real se vea legible en el plano cerrado (cláusula de garantía). Sin cifras de precio en cuadro. Esta pieza se usa en retargeting (quien ya vio otro anuncio o preguntó precio): ahí es donde la garantía decide.</w:t>
+        <w:t>Nota: El anexo real se ve legible en el plano final. Sin cifras de precio en cuadro. Esta pieza se usa en retargeting (quien ya vio otro anuncio o preguntó precio).</w:t>
       </w:r>
     </w:p>
     <w:p>
@@ -2548,7 +2548,7 @@
           <w:i w:val="0"/>
           <w:sz w:val="21"/>
         </w:rPr>
-        <w:t xml:space="preserve"> 25 s</w:t>
+        <w:t xml:space="preserve"> 25-30 s</w:t>
       </w:r>
     </w:p>
     <w:p>
@@ -2608,7 +2608,20 @@
           <w:i/>
           <w:sz w:val="21"/>
         </w:rPr>
-        <w:t>"Y algo que los papás nos agradecen más que el inglés: aquí se entrena constancia. Un video al día, asistencia, tareas. Lo que aprende de cumplir le sirve para todo."</w:t>
+        <w:t>"Y algo que los papás nos agradecen más que el inglés: aquí se entrena constancia. Asistencia, tareas, cumplir. Y cumplir no es solo para aprender inglés: es para la vida."</w:t>
+      </w:r>
+    </w:p>
+    <w:p>
+      <w:pPr>
+        <w:spacing w:after="40"/>
+      </w:pPr>
+      <w:r>
+        <w:rPr>
+          <w:b w:val="0"/>
+          <w:i/>
+          <w:sz w:val="21"/>
+        </w:rPr>
+        <w:t>"En un mundo con inteligencia artificial, el que se sabe comunicar y cumple es el que avanza. Su hijo se lo va a agradecer."</w:t>
       </w:r>
     </w:p>
     <w:p>
@@ -3278,7 +3291,7 @@
           <w:i w:val="0"/>
           <w:sz w:val="21"/>
         </w:rPr>
-        <w:t>• Tomas de apoyo (10 minutos): estudiantes de pie en simulación, el tablero con la Frase del Día, el contrato de garantía en primer plano, la fachada y la recepción.</w:t>
+        <w:t>• Tomas de apoyo (10 minutos): estudiantes de pie en simulación, el tablero con la Frase del Día, el anexo de garantía en primer plano, la fachada y la recepción.</w:t>
       </w:r>
     </w:p>
     <w:p>

</xml_diff>

<commit_message>
Grabacion 09/10: meses desde la primera clase, no desde la matricula
Co-Authored-By: Claude Opus 5.5 <noreply@anthropic.com>
</commit_message>
<xml_diff>
--- a/recursos/comercial/campañas/GUIONES_GRABACION_2026-10-09.docx
+++ b/recursos/comercial/campañas/GUIONES_GRABACION_2026-10-09.docx
@@ -152,7 +152,7 @@
           <w:i w:val="0"/>
           <w:sz w:val="21"/>
         </w:rPr>
-        <w:t xml:space="preserve"> todos los estudiantes tienen firmada la autorización de imagen en su contrato de matrícula. La profe les pregunta si están contentos con la clase y les pide ayuda: "parte de mi trabajo es grabar contenido"; si alguien dice voluntariamente que no quiere salir, queda fuera de plano. Coordinación entrega la fecha de matrícula de los 3 que empezaron de cero (para "hace ___ meses" en pantalla). Sin nombres de estudiantes en pantalla.</w:t>
+        <w:t xml:space="preserve"> todos los estudiantes tienen firmada la autorización de imagen en su contrato de matrícula. La profe les pregunta si están contentos con la clase y les pide ayuda: "parte de mi trabajo es grabar contenido"; si alguien dice voluntariamente que no quiere salir, queda fuera de plano. Coordinación le confirma a cada uno de los 3 que empezaron de cero cuántos meses lleva desde su PRIMERA CLASE (no desde la matrícula: a veces el grupo arrancó hasta dos meses después), para "hace ___ meses". Sin nombres de estudiantes en pantalla.</w:t>
       </w:r>
     </w:p>
     <w:p>
@@ -3213,7 +3213,7 @@
           <w:i w:val="0"/>
           <w:sz w:val="21"/>
         </w:rPr>
-        <w:t>• DATOS A CONFIRMAR ANTES DE PUBLICAR (no se inventan): meses reales desde la matrícula de cada uno de los 3 que empezaron de cero (guiones 2 y 6); que el agente de WhatsApp recibe audios y alguien los responde en menos de 24 h (cierres de reciprocidad).</w:t>
+        <w:t>• DATOS A CONFIRMAR ANTES DE PUBLICAR (no se inventan): meses reales desde la PRIMERA CLASE (no desde la matrícula) de cada uno de los 3 que empezaron de cero (guiones 2 y 6); que el agente de WhatsApp recibe audios y alguien los responde en menos de 24 h (cierres de reciprocidad).</w:t>
       </w:r>
     </w:p>
     <w:p>

</xml_diff>

<commit_message>
Grabacion 09/10: coordinacion ronda 2 (acompanamos en primera persona, trabajo en equipo, nuevo cierre; padres de jovenes que salieron del colegio)
Co-Authored-By: Claude Opus 5.5 <noreply@anthropic.com>
</commit_message>
<xml_diff>
--- a/recursos/comercial/campañas/GUIONES_GRABACION_2026-10-09.docx
+++ b/recursos/comercial/campañas/GUIONES_GRABACION_2026-10-09.docx
@@ -173,7 +173,7 @@
           <w:i w:val="0"/>
           <w:sz w:val="21"/>
         </w:rPr>
-        <w:t xml:space="preserve"> (1) antes de la clase, con el salón vacío: guion 3 "Siete meses" (profe + tablero), guion 4 "La vacante" (profe), tomas de la fachada y la recepción; (2) durante la clase, con el grupo: guion 7 "La corrección del día" al abrir (usa el error paper real), guion 2 "Esto es una clase" (simulación de entrevista o reclamo, 10 minutos de pie), guion 5 "El pasaporte" (simulación de entrevista con familia/empleador, 10 minutos), guion 1 "Llegué sin una palabra" (cada uno de los 3 que empezó de cero: la frase en español con su dato real + 10 s en inglés); (3) después de la clase: guion 1 "Te acompañamos" (Jacqueline con el anexo de garantía impreso), guion 9 "Su hijo a los 18" (Jacqueline en recepción) y guion 8 "El Pacto" (profe, 5 minutos, a solas). Se graban los 9; ninguno es opcional. Total estimado: 3 horas.</w:t>
+        <w:t xml:space="preserve"> (1) antes de la clase, con el salón vacío: guion 3 "Siete meses" (profe + tablero), guion 4 "La vacante" (profe), tomas de la fachada y la recepción; (2) durante la clase, con el grupo: guion 7 "La corrección del día" al abrir (usa el error paper real), guion 2 "Esto es una clase" (simulación de entrevista o reclamo, 10 minutos de pie), guion 5 "El pasaporte" (simulación de entrevista con familia/empleador, 10 minutos), guion 1 "Llegué sin una palabra" (cada uno de los 3 que empezó de cero: la frase en español con su dato real + 10 s en inglés); (3) después de la clase: guion 1 "Te acompañamos" (Jacqueline con el anexo de garantía impreso), guion 7 "El año después del colegio" (Jacqueline en recepción) y guion 8 "El Pacto" (profe, 5 minutos, a solas). Se graban los 9; ninguno es opcional. Total estimado: 3 horas.</w:t>
       </w:r>
     </w:p>
     <w:p>
@@ -833,7 +833,7 @@
                 <w:b/>
                 <w:sz w:val="18"/>
               </w:rPr>
-              <w:t>7 "Su hijo a los 18"</w:t>
+              <w:t>7 "El año después del colegio"</w:t>
             </w:r>
           </w:p>
         </w:tc>
@@ -847,7 +847,7 @@
                 <w:b w:val="0"/>
                 <w:sz w:val="18"/>
               </w:rPr>
-              <w:t>PADRES: abre el grupo de la tarde y el sabatino con un comprador distinto (el acudiente).</w:t>
+              <w:t>PADRES de jóvenes que salieron del colegio y no han entrado a la U: un comprador distinto (el acudiente) para tarde, noche y sábados.</w:t>
             </w:r>
           </w:p>
         </w:tc>
@@ -861,7 +861,7 @@
                 <w:b w:val="0"/>
                 <w:sz w:val="18"/>
               </w:rPr>
-              <w:t>Citas con acudiente para la franja 1:30-6:00.</w:t>
+              <w:t>Citas con acudiente de jóvenes de 17-20 años.</w:t>
             </w:r>
           </w:p>
         </w:tc>
@@ -996,7 +996,7 @@
           <w:i w:val="0"/>
           <w:sz w:val="21"/>
         </w:rPr>
-        <w:t>7. GUION 5 "El Pacto" (filtro, poco volumen) y GUION 7 "Su hijo a los 18". Se graban los 9; el orden es de prioridad por si algo falla, no una lista opcional.</w:t>
+        <w:t>7. GUION 5 "El Pacto" (filtro, poco volumen) y GUION 7 "El año después del colegio". Se graban los 9; el orden es de prioridad por si algo falla, no una lista opcional.</w:t>
       </w:r>
     </w:p>
     <w:p>
@@ -1169,7 +1169,7 @@
           <w:i/>
           <w:sz w:val="21"/>
         </w:rPr>
-        <w:t>"Por eso aquí no solo te enseñan. Te acompañan: tu profe es tu coach. Te corrige todos los días, te pide cuentas y no te deja soltar."</w:t>
+        <w:t>"Por eso aquí no solo te enseñamos. Te acompañamos: tu profe es tu coach. Te corrige, te pide cuentas y no te suelta."</w:t>
       </w:r>
     </w:p>
     <w:p>
@@ -1182,7 +1182,7 @@
           <w:i/>
           <w:sz w:val="21"/>
         </w:rPr>
-        <w:t>"Y si cumples y no avanzas, te devolvemos el cien por ciento del nivel. Te lo entregamos firmado."</w:t>
+        <w:t>"Es un trabajo en equipo: tú pones tu parte y, si no aprendes, te devolvemos el cien por ciento del nivel. Te lo entregamos firmado."</w:t>
       </w:r>
     </w:p>
     <w:p>
@@ -1224,7 +1224,7 @@
           <w:i w:val="0"/>
           <w:sz w:val="21"/>
         </w:rPr>
-        <w:t xml:space="preserve"> "Escríbenos y te mostramos la garantía antes de que decidas." Botón: WhatsApp.</w:t>
+        <w:t xml:space="preserve"> "Escríbenos y te mostramos cómo lo hacemos, antes de decidir algo fácil que no te lleve a los resultados que necesitas." Botón: WhatsApp.</w:t>
       </w:r>
     </w:p>
     <w:p>
@@ -2448,7 +2448,7 @@
           <w:color w:val="E54C09"/>
           <w:sz w:val="25"/>
         </w:rPr>
-        <w:t>GUION 7 — SU HIJO A LOS 18   [SE GRABA (para el grupo de la tarde y el sabatino)]   · anuncio V8_PADRES</w:t>
+        <w:t>GUION 7 — EL AÑO DESPUÉS DEL COLEGIO   [SE GRABA (padres de jóvenes de 17-20 años)]   · anuncio V8_PADRES</w:t>
       </w:r>
     </w:p>
     <w:p>
@@ -2469,7 +2469,7 @@
           <w:i w:val="0"/>
           <w:sz w:val="21"/>
         </w:rPr>
-        <w:t xml:space="preserve"> "Hola, vi el video para padres (V8). Es para mi hijo/a."</w:t>
+        <w:t xml:space="preserve"> "Hola, vi el video del año después del colegio (V8). Es para mi hijo/a."</w:t>
       </w:r>
     </w:p>
     <w:p>
@@ -2490,7 +2490,7 @@
           <w:i w:val="0"/>
           <w:sz w:val="21"/>
         </w:rPr>
-        <w:t xml:space="preserve"> Texto grande sobre jóvenes en clase: "A los 18, con el inglés resuelto."</w:t>
+        <w:t xml:space="preserve"> Texto grande sobre jóvenes en clase: "Salió del colegio. ¿Y ahora qué?"</w:t>
       </w:r>
     </w:p>
     <w:p>
@@ -2511,7 +2511,7 @@
           <w:i w:val="0"/>
           <w:sz w:val="21"/>
         </w:rPr>
-        <w:t xml:space="preserve"> Padres: el inglés resuelto antes de la universidad, y la disciplina que se entrena aquí.</w:t>
+        <w:t xml:space="preserve"> Padres de jóvenes que ya salieron del colegio y no han entrado a la universidad (no saben qué estudiar o todavía no alcanza la plata): ese año resuelve el inglés. Más la constancia que se entrena aquí.</w:t>
       </w:r>
     </w:p>
     <w:p>
@@ -2532,7 +2532,7 @@
           <w:i w:val="0"/>
           <w:sz w:val="21"/>
         </w:rPr>
-        <w:t xml:space="preserve"> Coordinación (Jacqueline) a cámara, en la recepción, hablando a un papá o mamá. Si hay un padre voluntario con cláusula, mejor él.   ·   </w:t>
+        <w:t xml:space="preserve"> Coordinación (Jacqueline) a cámara, en la recepción, hablando a un papá o mamá. Si hay un padre voluntario, mejor él.   ·   </w:t>
       </w:r>
       <w:r>
         <w:rPr>
@@ -2569,7 +2569,7 @@
           <w:i w:val="0"/>
           <w:sz w:val="21"/>
         </w:rPr>
-        <w:t xml:space="preserve"> Plano medio fijo; corte de 3 segundos a jóvenes de 15-17 en clase (de espaldas o con autorización).</w:t>
+        <w:t xml:space="preserve"> Plano medio fijo; corte de 3 segundos a jóvenes del grupo en clase (de espaldas o con autorización).</w:t>
       </w:r>
     </w:p>
     <w:p>
@@ -2595,7 +2595,20 @@
           <w:i/>
           <w:sz w:val="21"/>
         </w:rPr>
-        <w:t>"En grado once, el Saber 11 ya le evalúa inglés. Imagínese a su hijo a los dieciocho con eso resuelto: la universidad o la beca sin ese requisito pendiente."</w:t>
+        <w:t>"Su hijo ya salió del colegio y todavía no ha entrado a la universidad. No sabe qué estudiar, o todavía no alcanza la plata."</w:t>
+      </w:r>
+    </w:p>
+    <w:p>
+      <w:pPr>
+        <w:spacing w:after="40"/>
+      </w:pPr>
+      <w:r>
+        <w:rPr>
+          <w:b w:val="0"/>
+          <w:i/>
+          <w:sz w:val="21"/>
+        </w:rPr>
+        <w:t>"Ese año no tiene que perderse: puede ser el año en que resuelve el inglés, y llega a la universidad o a su primer trabajo con eso listo."</w:t>
       </w:r>
     </w:p>
     <w:p>
@@ -2621,20 +2634,7 @@
           <w:i/>
           <w:sz w:val="21"/>
         </w:rPr>
-        <w:t>"En un mundo con inteligencia artificial, el que se sabe comunicar y cumple es el que avanza. Su hijo se lo va a agradecer."</w:t>
-      </w:r>
-    </w:p>
-    <w:p>
-      <w:pPr>
-        <w:spacing w:after="40"/>
-      </w:pPr>
-      <w:r>
-        <w:rPr>
-          <w:b w:val="0"/>
-          <w:i/>
-          <w:sz w:val="21"/>
-        </w:rPr>
-        <w:t>"Desde los doce años, en la tarde, en la noche o los sábados."</w:t>
+        <w:t>"En un mundo con inteligencia artificial, el que se sabe comunicar y cumple es el que avanza. Su hijo se lo va a agradecer. En la tarde, en la noche o los sábados."</w:t>
       </w:r>
     </w:p>
     <w:p>
@@ -2655,7 +2655,7 @@
           <w:i w:val="0"/>
           <w:sz w:val="21"/>
         </w:rPr>
-        <w:t xml:space="preserve"> "Desde los 12 años" · "Tarde · noche · sábados" · "Garantía por escrito"</w:t>
+        <w:t xml:space="preserve"> "Salió del colegio. ¿Y ahora qué?" · "El año en que resuelve el inglés" · "Tarde · noche · sábados"</w:t>
       </w:r>
     </w:p>
     <w:p>
@@ -2676,7 +2676,7 @@
           <w:i w:val="0"/>
           <w:sz w:val="21"/>
         </w:rPr>
-        <w:t xml:space="preserve"> "Pregúntenos qué horario le sirve a su hijo. Escríbanos." Botón: WhatsApp.</w:t>
+        <w:t xml:space="preserve"> "Pregúntenos qué horario le sirve. Escríbanos." Botón: WhatsApp.</w:t>
       </w:r>
     </w:p>
     <w:p>
@@ -2690,7 +2690,7 @@
           <w:color w:val="666666"/>
           <w:sz w:val="19"/>
         </w:rPr>
-        <w:t>Nota: El grupo de la tarde está "en apertura": el anuncio no promete horario fijo; el agente captura la franja.</w:t>
+        <w:t>Nota: Nada de Saber 11 ni de niños de colegio: el público son los que ya salieron. Sin precio.</w:t>
       </w:r>
     </w:p>
     <w:p>

</xml_diff>

<commit_message>
Guiones Isaac: version de 15 s por guion (corte exacto), sin seccion estrategica
Co-Authored-By: Claude Opus 5.5 <noreply@anthropic.com>
</commit_message>
<xml_diff>
--- a/recursos/comercial/campañas/GUIONES_GRABACION_2026-10-09.docx
+++ b/recursos/comercial/campañas/GUIONES_GRABACION_2026-10-09.docx
@@ -487,12 +487,12 @@
           <w:color w:val="E54C09"/>
           <w:sz w:val="24"/>
         </w:rPr>
-        <w:t>QUÉ VAMOS A LOGRAR CON ESTOS VIDEOS</w:t>
+        <w:t>ORDEN DE GRABACIÓN (prioridad)</w:t>
       </w:r>
     </w:p>
     <w:p>
       <w:pPr>
-        <w:spacing w:after="80"/>
+        <w:spacing w:after="40"/>
       </w:pPr>
       <w:r>
         <w:rPr>
@@ -500,376 +500,339 @@
           <w:i w:val="0"/>
           <w:sz w:val="21"/>
         </w:rPr>
-        <w:t>Una sola pregunta: ¿qué hace que un desconocido en Bucaramanga pida cita por una academia que no vende fácil? Cada pieza es una hipótesis distinta; del 15 al 31/10 corren con el mismo presupuesto, cada una en su propio conjunto de anuncios, y se miden tres números por pieza: costo por conversación, costo por cita atendida y citas. La que gane se queda con la pauta de noviembre y define el mensaje de todo (agente, flyers, asesoras); las demás se apagan.</w:t>
+        <w:t>1. GUION 6 "Llegué sin una palabra" (los 3 que empezaron de cero: confesión + inglés de hoy) y GUION 2 "Esto es una clase": estudiantes reales hablando. Es la prueba que más convierte en compras caras (investigación 08/10) y lo que ningún avatar ni competidor puede mostrar.</w:t>
       </w:r>
     </w:p>
-    <w:tbl>
-      <w:tblPr>
-        <w:tblStyle w:val="TableGrid"/>
-        <w:tblW w:type="auto" w:w="0"/>
-        <w:tblLook w:firstColumn="1" w:firstRow="1" w:lastColumn="0" w:lastRow="0" w:noHBand="0" w:noVBand="1" w:val="04A0"/>
-      </w:tblPr>
-      <w:tblGrid>
-        <w:gridCol w:w="3280"/>
-        <w:gridCol w:w="3280"/>
-        <w:gridCol w:w="3280"/>
-      </w:tblGrid>
-      <w:tr>
-        <w:tc>
-          <w:tcPr>
-            <w:tcW w:type="dxa" w:w="3280"/>
-          </w:tcPr>
-          <w:p>
-            <w:r>
-              <w:rPr>
-                <w:b/>
-                <w:sz w:val="18"/>
-              </w:rPr>
-              <w:t>Pieza</w:t>
-            </w:r>
-          </w:p>
-        </w:tc>
-        <w:tc>
-          <w:tcPr>
-            <w:tcW w:type="dxa" w:w="3280"/>
-          </w:tcPr>
-          <w:p>
-            <w:r>
-              <w:rPr>
-                <w:b/>
-                <w:sz w:val="18"/>
-              </w:rPr>
-              <w:t>Hipótesis que prueba</w:t>
-            </w:r>
-          </w:p>
-        </w:tc>
-        <w:tc>
-          <w:tcPr>
-            <w:tcW w:type="dxa" w:w="3280"/>
-          </w:tcPr>
-          <w:p>
-            <w:r>
-              <w:rPr>
-                <w:b/>
-                <w:sz w:val="18"/>
-              </w:rPr>
-              <w:t>Gana si…</w:t>
-            </w:r>
-          </w:p>
-        </w:tc>
-      </w:tr>
-      <w:tr>
-        <w:tc>
-          <w:tcPr>
-            <w:tcW w:type="dxa" w:w="3280"/>
-          </w:tcPr>
-          <w:p>
-            <w:r>
-              <w:rPr>
-                <w:b/>
-                <w:sz w:val="18"/>
-              </w:rPr>
-              <w:t>6 "Llegué sin una palabra" + 2 "Esto es una clase"</w:t>
-            </w:r>
-          </w:p>
-        </w:tc>
-        <w:tc>
-          <w:tcPr>
-            <w:tcW w:type="dxa" w:w="3280"/>
-          </w:tcPr>
-          <w:p>
-            <w:r>
-              <w:rPr>
-                <w:b w:val="0"/>
-                <w:sz w:val="18"/>
-              </w:rPr>
-              <w:t>PRUEBA: ver gente real hablando convierte más que cualquier promesa (lo que dice el cliente que compró en otra parte: "no me importa la garantía si veo que los que muestran hablan").</w:t>
-            </w:r>
-          </w:p>
-        </w:tc>
-        <w:tc>
-          <w:tcPr>
-            <w:tcW w:type="dxa" w:w="3280"/>
-          </w:tcPr>
-          <w:p>
-            <w:r>
-              <w:rPr>
-                <w:b w:val="0"/>
-                <w:sz w:val="18"/>
-              </w:rPr>
-              <w:t>Menor costo por cita de todas.</w:t>
-            </w:r>
-          </w:p>
-        </w:tc>
-      </w:tr>
-      <w:tr>
-        <w:tc>
-          <w:tcPr>
-            <w:tcW w:type="dxa" w:w="3280"/>
-          </w:tcPr>
-          <w:p>
-            <w:r>
-              <w:rPr>
-                <w:b/>
-                <w:sz w:val="18"/>
-              </w:rPr>
-              <w:t>4 "Siete meses"</w:t>
-            </w:r>
-          </w:p>
-        </w:tc>
-        <w:tc>
-          <w:tcPr>
-            <w:tcW w:type="dxa" w:w="3280"/>
-          </w:tcPr>
-          <w:p>
-            <w:r>
-              <w:rPr>
-                <w:b w:val="0"/>
-                <w:sz w:val="18"/>
-              </w:rPr>
-              <w:t>VELOCIDAD CON NÚMERO: "7 meses, 575 horas" compite con el "rápido" de Open English y E4CC sin mentir; nadie más publica horas.</w:t>
-            </w:r>
-          </w:p>
-        </w:tc>
-        <w:tc>
-          <w:tcPr>
-            <w:tcW w:type="dxa" w:w="3280"/>
-          </w:tcPr>
-          <w:p>
-            <w:r>
-              <w:rPr>
-                <w:b w:val="0"/>
-                <w:sz w:val="18"/>
-              </w:rPr>
-              <w:t>Costo por cita igual o menor que las de prueba, y leads que ya no preguntan "¿cuánto dura?".</w:t>
-            </w:r>
-          </w:p>
-        </w:tc>
-      </w:tr>
-      <w:tr>
-        <w:tc>
-          <w:tcPr>
-            <w:tcW w:type="dxa" w:w="3280"/>
-          </w:tcPr>
-          <w:p>
-            <w:r>
-              <w:rPr>
-                <w:b/>
-                <w:sz w:val="18"/>
-              </w:rPr>
-              <w:t>3 "La vacante"</w:t>
-            </w:r>
-          </w:p>
-        </w:tc>
-        <w:tc>
-          <w:tcPr>
-            <w:tcW w:type="dxa" w:w="3280"/>
-          </w:tcPr>
-          <w:p>
-            <w:r>
-              <w:rPr>
-                <w:b w:val="0"/>
-                <w:sz w:val="18"/>
-              </w:rPr>
-              <w:t>DESTINO TRABAJO AQUÍ: el gancho de empleo trae las conversaciones más baratas (dato propio: destino cuesta la mitad que producto).</w:t>
-            </w:r>
-          </w:p>
-        </w:tc>
-        <w:tc>
-          <w:tcPr>
-            <w:tcW w:type="dxa" w:w="3280"/>
-          </w:tcPr>
-          <w:p>
-            <w:r>
-              <w:rPr>
-                <w:b w:val="0"/>
-                <w:sz w:val="18"/>
-              </w:rPr>
-              <w:t>Más conversaciones baratas, aunque conviertan menos a cita.</w:t>
-            </w:r>
-          </w:p>
-        </w:tc>
-      </w:tr>
-      <w:tr>
-        <w:tc>
-          <w:tcPr>
-            <w:tcW w:type="dxa" w:w="3280"/>
-          </w:tcPr>
-          <w:p>
-            <w:r>
-              <w:rPr>
-                <w:b/>
-                <w:sz w:val="18"/>
-              </w:rPr>
-              <w:t>8 "El pasaporte"</w:t>
-            </w:r>
-          </w:p>
-        </w:tc>
-        <w:tc>
-          <w:tcPr>
-            <w:tcW w:type="dxa" w:w="3280"/>
-          </w:tcPr>
-          <w:p>
-            <w:r>
-              <w:rPr>
-                <w:b w:val="0"/>
-                <w:sz w:val="18"/>
-              </w:rPr>
-              <w:t>DESTINO IRSE (Au Pair, Work and Travel, Europa): la conversación más barata de la base, sin confundirse con agencia de empleo.</w:t>
-            </w:r>
-          </w:p>
-        </w:tc>
-        <w:tc>
-          <w:tcPr>
-            <w:tcW w:type="dxa" w:w="3280"/>
-          </w:tcPr>
-          <w:p>
-            <w:r>
-              <w:rPr>
-                <w:b w:val="0"/>
-                <w:sz w:val="18"/>
-              </w:rPr>
-              <w:t>Conversaciones baratas que SÍ contestan al agente (hoy 3 de 5 creen que es una agencia).</w:t>
-            </w:r>
-          </w:p>
-        </w:tc>
-      </w:tr>
-      <w:tr>
-        <w:tc>
-          <w:tcPr>
-            <w:tcW w:type="dxa" w:w="3280"/>
-          </w:tcPr>
-          <w:p>
-            <w:r>
-              <w:rPr>
-                <w:b/>
-                <w:sz w:val="18"/>
-              </w:rPr>
-              <w:t>1 "Te acompañamos (y te lo firmamos)"</w:t>
-            </w:r>
-          </w:p>
-        </w:tc>
-        <w:tc>
-          <w:tcPr>
-            <w:tcW w:type="dxa" w:w="3280"/>
-          </w:tcPr>
-          <w:p>
-            <w:r>
-              <w:rPr>
-                <w:b w:val="0"/>
-                <w:sz w:val="18"/>
-              </w:rPr>
-              <w:t>GARANTÍA COMO CIERRE, no como gancho: en retargeting (quien ya vio otra pieza o preguntó precio) sube la tasa de cita. Es donde está la rotura real: 284 preguntaron precio, 21 agendaron.</w:t>
-            </w:r>
-          </w:p>
-        </w:tc>
-        <w:tc>
-          <w:tcPr>
-            <w:tcW w:type="dxa" w:w="3280"/>
-          </w:tcPr>
-          <w:p>
-            <w:r>
-              <w:rPr>
-                <w:b w:val="0"/>
-                <w:sz w:val="18"/>
-              </w:rPr>
-              <w:t>Entre los que ya preguntaron precio, más citas que sin ella.</w:t>
-            </w:r>
-          </w:p>
-        </w:tc>
-      </w:tr>
-      <w:tr>
-        <w:tc>
-          <w:tcPr>
-            <w:tcW w:type="dxa" w:w="3280"/>
-          </w:tcPr>
-          <w:p>
-            <w:r>
-              <w:rPr>
-                <w:b/>
-                <w:sz w:val="18"/>
-              </w:rPr>
-              <w:t>5 "El Pacto"</w:t>
-            </w:r>
-          </w:p>
-        </w:tc>
-        <w:tc>
-          <w:tcPr>
-            <w:tcW w:type="dxa" w:w="3280"/>
-          </w:tcPr>
-          <w:p>
-            <w:r>
-              <w:rPr>
-                <w:b w:val="0"/>
-                <w:sz w:val="18"/>
-              </w:rPr>
-              <w:t>FILTRO: decir "no es fácil" trae menos leads pero más citas atendidas (menos "no contesta").</w:t>
-            </w:r>
-          </w:p>
-        </w:tc>
-        <w:tc>
-          <w:tcPr>
-            <w:tcW w:type="dxa" w:w="3280"/>
-          </w:tcPr>
-          <w:p>
-            <w:r>
-              <w:rPr>
-                <w:b w:val="0"/>
-                <w:sz w:val="18"/>
-              </w:rPr>
-              <w:t>Menos leads, mayor % que contesta y asiste a la cita.</w:t>
-            </w:r>
-          </w:p>
-        </w:tc>
-      </w:tr>
-      <w:tr>
-        <w:tc>
-          <w:tcPr>
-            <w:tcW w:type="dxa" w:w="3280"/>
-          </w:tcPr>
-          <w:p>
-            <w:r>
-              <w:rPr>
-                <w:b/>
-                <w:sz w:val="18"/>
-              </w:rPr>
-              <w:t>7 "El año después del colegio"</w:t>
-            </w:r>
-          </w:p>
-        </w:tc>
-        <w:tc>
-          <w:tcPr>
-            <w:tcW w:type="dxa" w:w="3280"/>
-          </w:tcPr>
-          <w:p>
-            <w:r>
-              <w:rPr>
-                <w:b w:val="0"/>
-                <w:sz w:val="18"/>
-              </w:rPr>
-              <w:t>PADRES de jóvenes que salieron del colegio y no han entrado a la U: un comprador distinto (el acudiente) para tarde, noche y sábados.</w:t>
-            </w:r>
-          </w:p>
-        </w:tc>
-        <w:tc>
-          <w:tcPr>
-            <w:tcW w:type="dxa" w:w="3280"/>
-          </w:tcPr>
-          <w:p>
-            <w:r>
-              <w:rPr>
-                <w:b w:val="0"/>
-                <w:sz w:val="18"/>
-              </w:rPr>
-              <w:t>Citas con acudiente de jóvenes de 17-20 años.</w:t>
-            </w:r>
-          </w:p>
-        </w:tc>
-      </w:tr>
-    </w:tbl>
     <w:p>
       <w:pPr>
         <w:spacing w:after="40"/>
+      </w:pPr>
+      <w:r>
+        <w:rPr>
+          <w:b w:val="0"/>
+          <w:i w:val="0"/>
+          <w:sz w:val="21"/>
+        </w:rPr>
+        <w:t>2. GUION 4 "Siete meses": velocidad con número (575 h, 7 meses). Ningún competidor publica sus horas.</w:t>
+      </w:r>
+    </w:p>
+    <w:p>
+      <w:pPr>
+        <w:spacing w:after="40"/>
+      </w:pPr>
+      <w:r>
+        <w:rPr>
+          <w:b w:val="0"/>
+          <w:i w:val="0"/>
+          <w:sz w:val="21"/>
+        </w:rPr>
+        <w:t>3. GUION 3 "La vacante": el destino #1 de la base.</w:t>
+      </w:r>
+    </w:p>
+    <w:p>
+      <w:pPr>
+        <w:spacing w:after="40"/>
+      </w:pPr>
+      <w:r>
+        <w:rPr>
+          <w:b w:val="0"/>
+          <w:i w:val="0"/>
+          <w:sz w:val="21"/>
+        </w:rPr>
+        <w:t>4. GUION 1 "Te acompañamos": la garantía va DESPUÉS del precio (bot, cita, retargeting), no como gancho de alcance. Se graba igual.</w:t>
+      </w:r>
+    </w:p>
+    <w:p>
+      <w:pPr>
+        <w:spacing w:after="40"/>
+      </w:pPr>
+      <w:r>
+        <w:rPr>
+          <w:b w:val="0"/>
+          <w:i w:val="0"/>
+          <w:sz w:val="21"/>
+        </w:rPr>
+        <w:t>5. GUION 8 "El pasaporte": el destino de irse (Au Pair / Work and Travel / Europa), la conversación más barata.</w:t>
+      </w:r>
+    </w:p>
+    <w:p>
+      <w:pPr>
+        <w:spacing w:after="40"/>
+      </w:pPr>
+      <w:r>
+        <w:rPr>
+          <w:b w:val="0"/>
+          <w:i w:val="0"/>
+          <w:sz w:val="21"/>
+        </w:rPr>
+        <w:t>6. GUION 9 "La corrección del día": 10 minutos, el único que da algo antes de pedir (reciprocidad).</w:t>
+      </w:r>
+    </w:p>
+    <w:p>
+      <w:pPr>
+        <w:spacing w:after="40"/>
+      </w:pPr>
+      <w:r>
+        <w:rPr>
+          <w:b w:val="0"/>
+          <w:i w:val="0"/>
+          <w:sz w:val="21"/>
+        </w:rPr>
+        <w:t>7. GUION 5 "El Pacto" (filtro, poco volumen) y GUION 7 "El año después del colegio". Se graban los 9; el orden es de prioridad por si algo falla, no una lista opcional.</w:t>
+      </w:r>
+    </w:p>
+    <w:p>
+      <w:pPr>
+        <w:spacing w:before="280" w:after="80"/>
+      </w:pPr>
+      <w:r>
+        <w:rPr>
+          <w:b/>
+          <w:color w:val="E54C09"/>
+          <w:sz w:val="25"/>
+        </w:rPr>
+        <w:t>GUION 1 — TE ACOMPAÑAMOS (Y TE LO FIRMAMOS)   [PRIORITARIO]   · anuncio V6_GARANTIA</w:t>
+      </w:r>
+    </w:p>
+    <w:p>
+      <w:pPr>
+        <w:spacing w:after="40"/>
+      </w:pPr>
+      <w:r>
+        <w:rPr>
+          <w:b/>
+          <w:i w:val="0"/>
+          <w:sz w:val="21"/>
+        </w:rPr>
+        <w:t>Mensaje prellenado del botón de WhatsApp:</w:t>
+      </w:r>
+      <w:r>
+        <w:rPr>
+          <w:b w:val="0"/>
+          <w:i w:val="0"/>
+          <w:sz w:val="21"/>
+        </w:rPr>
+        <w:t xml:space="preserve"> "Hola, vi el video del acompañamiento (V6). ¿Me muestran la garantía?"</w:t>
+      </w:r>
+    </w:p>
+    <w:p>
+      <w:pPr>
+        <w:spacing w:after="40"/>
+      </w:pPr>
+      <w:r>
+        <w:rPr>
+          <w:b/>
+          <w:i w:val="0"/>
+          <w:sz w:val="21"/>
+        </w:rPr>
+        <w:t>GANCHO (segundos 0-2, lo que para el dedo):</w:t>
+      </w:r>
+      <w:r>
+        <w:rPr>
+          <w:b w:val="0"/>
+          <w:i w:val="0"/>
+          <w:sz w:val="21"/>
+        </w:rPr>
+        <w:t xml:space="preserve"> Jacqueline a cámara, sin papel todavía: "Tienes las ganas. Pero a veces te falla la motivación." Texto grande: "Las ganas no bastan."</w:t>
+      </w:r>
+    </w:p>
+    <w:p>
+      <w:pPr>
+        <w:spacing w:after="40"/>
+      </w:pPr>
+      <w:r>
+        <w:rPr>
+          <w:b/>
+          <w:i w:val="0"/>
+          <w:sz w:val="21"/>
+        </w:rPr>
+        <w:t>Qué vende:</w:t>
+      </w:r>
+      <w:r>
+        <w:rPr>
+          <w:b w:val="0"/>
+          <w:i w:val="0"/>
+          <w:sz w:val="21"/>
+        </w:rPr>
+        <w:t xml:space="preserve"> La motivación que falla y el acompañamiento que la sostiene (el profe como coach), cerrado con la garantía por escrito. OJO: siempre "única academia PRESENCIAL de Bucaramanga" (las plataformas online E4CC y EF sí tienen garantía escrita).</w:t>
+      </w:r>
+    </w:p>
+    <w:p>
+      <w:pPr>
+        <w:spacing w:after="40"/>
+      </w:pPr>
+      <w:r>
+        <w:rPr>
+          <w:b/>
+          <w:i w:val="0"/>
+          <w:sz w:val="21"/>
+        </w:rPr>
+        <w:t>Quién habla:</w:t>
+      </w:r>
+      <w:r>
+        <w:rPr>
+          <w:b w:val="0"/>
+          <w:i w:val="0"/>
+          <w:sz w:val="21"/>
+        </w:rPr>
+        <w:t xml:space="preserve"> Coordinación (Jacqueline), de pie, con el ANEXO DE GARANTÍA impreso en la mano (el documento que se firma con la matrícula; la garantía no está en el contrato de 24 cláusulas). Fondo: la recepción o un aula vacía con el tablero.   ·   </w:t>
+      </w:r>
+      <w:r>
+        <w:rPr>
+          <w:b/>
+          <w:i w:val="0"/>
+          <w:sz w:val="21"/>
+        </w:rPr>
+        <w:t>Duración:</w:t>
+      </w:r>
+      <w:r>
+        <w:rPr>
+          <w:b w:val="0"/>
+          <w:i w:val="0"/>
+          <w:sz w:val="21"/>
+        </w:rPr>
+        <w:t xml:space="preserve"> 25-30 s</w:t>
+      </w:r>
+    </w:p>
+    <w:p>
+      <w:pPr>
+        <w:spacing w:after="80"/>
+      </w:pPr>
+      <w:r>
+        <w:rPr>
+          <w:b/>
+          <w:i w:val="0"/>
+          <w:sz w:val="21"/>
+        </w:rPr>
+        <w:t>Qué se ve:</w:t>
+      </w:r>
+      <w:r>
+        <w:rPr>
+          <w:b w:val="0"/>
+          <w:i w:val="0"/>
+          <w:sz w:val="21"/>
+        </w:rPr>
+        <w:t xml:space="preserve"> Plano medio. En la última frase, muestra el anexo a cámara y señala la garantía con el dedo. Cierre sobre la hoja, legible.</w:t>
+      </w:r>
+    </w:p>
+    <w:p>
+      <w:pPr>
+        <w:spacing w:after="20"/>
+      </w:pPr>
+      <w:r>
+        <w:rPr>
+          <w:b/>
+          <w:i w:val="0"/>
+          <w:sz w:val="21"/>
+        </w:rPr>
+        <w:t>Texto (se dice tal cual, con subtítulos):</w:t>
+      </w:r>
+    </w:p>
+    <w:p>
+      <w:pPr>
+        <w:spacing w:after="40"/>
+      </w:pPr>
+      <w:r>
+        <w:rPr>
+          <w:b w:val="0"/>
+          <w:i/>
+          <w:sz w:val="21"/>
+        </w:rPr>
+        <w:t>"Tienes las ganas de aprender inglés. Pero a veces te falla la motivación. Eso no solo pasa con el inglés: pasa con todo."</w:t>
+      </w:r>
+    </w:p>
+    <w:p>
+      <w:pPr>
+        <w:spacing w:after="40"/>
+      </w:pPr>
+      <w:r>
+        <w:rPr>
+          <w:b w:val="0"/>
+          <w:i/>
+          <w:sz w:val="21"/>
+        </w:rPr>
+        <w:t>"Por eso aquí no solo te enseñamos. Te acompañamos: tu profe es tu coach. Te corrige, te pide cuentas y no te suelta."</w:t>
+      </w:r>
+    </w:p>
+    <w:p>
+      <w:pPr>
+        <w:spacing w:after="40"/>
+      </w:pPr>
+      <w:r>
+        <w:rPr>
+          <w:b w:val="0"/>
+          <w:i/>
+          <w:sz w:val="21"/>
+        </w:rPr>
+        <w:t>"Es un trabajo en equipo: tú pones tu parte y, si no aprendes, te devolvemos el cien por ciento del nivel. Te lo entregamos firmado."</w:t>
+      </w:r>
+    </w:p>
+    <w:p>
+      <w:pPr>
+        <w:spacing w:after="40"/>
+      </w:pPr>
+      <w:r>
+        <w:rPr>
+          <w:b/>
+          <w:i w:val="0"/>
+          <w:sz w:val="21"/>
+        </w:rPr>
+        <w:t>Texto en pantalla:</w:t>
+      </w:r>
+      <w:r>
+        <w:rPr>
+          <w:b w:val="0"/>
+          <w:i w:val="0"/>
+          <w:sz w:val="21"/>
+        </w:rPr>
+        <w:t xml:space="preserve"> "Las ganas no bastan" · "Tu profe es tu coach" · "Garantía de aprendizaje por escrito · única academia presencial de Bucaramanga que la firma"</w:t>
+      </w:r>
+    </w:p>
+    <w:p>
+      <w:pPr>
+        <w:spacing w:after="40"/>
+      </w:pPr>
+      <w:r>
+        <w:rPr>
+          <w:b/>
+          <w:i w:val="0"/>
+          <w:sz w:val="21"/>
+        </w:rPr>
+        <w:t>Cierre:</w:t>
+      </w:r>
+      <w:r>
+        <w:rPr>
+          <w:b w:val="0"/>
+          <w:i w:val="0"/>
+          <w:sz w:val="21"/>
+        </w:rPr>
+        <w:t xml:space="preserve"> "Escríbenos y te mostramos cómo lo hacemos, antes de decidir algo fácil que no te lleve a los resultados que necesitas." Botón: WhatsApp.</w:t>
+      </w:r>
+    </w:p>
+    <w:p>
+      <w:pPr>
+        <w:spacing w:after="40"/>
+      </w:pPr>
+      <w:r>
+        <w:rPr>
+          <w:b/>
+          <w:i w:val="0"/>
+          <w:sz w:val="21"/>
+        </w:rPr>
+        <w:t>VERSIÓN DE 15 SEGUNDOS (se corta en edición del mismo material; no se graba aparte):</w:t>
+      </w:r>
+      <w:r>
+        <w:rPr>
+          <w:b w:val="0"/>
+          <w:i w:val="0"/>
+          <w:sz w:val="21"/>
+        </w:rPr>
+        <w:t xml:space="preserve"> 0-3 s Jacqueline: "Tienes las ganas. Pero a veces te falla la motivación." (texto: "Las ganas no bastan") → 3-11 s: "Aquí tu profe es tu coach: te corrige, te pide cuentas y no te suelta. Tú pones tu parte y, si no aprendes, te devolvemos el nivel." (levanta el anexo) → 11-15 s cierre: "Escríbenos."</w:t>
+      </w:r>
+    </w:p>
+    <w:p>
+      <w:pPr>
+        <w:spacing w:after="80"/>
       </w:pPr>
       <w:r>
         <w:rPr>
@@ -878,12 +841,248 @@
           <w:color w:val="666666"/>
           <w:sz w:val="19"/>
         </w:rPr>
-        <w:t>Cómo se lee (investigación Meta 08/10): con ~75 conversaciones en 17 días, el costo por cita por video no va a ser estadísticamente sólido; la lectura temprana se hace con tasa de gancho (vistas de 3 s ÷ impresiones), reproducción completa, CTR y costo por conversación. Ningún video se declara ganador con menos de 5 citas, y ninguno se apaga antes del corte del 22/10.</w:t>
+        <w:t>Nota: El anexo real se ve legible en el plano final. Sin cifras de precio en cuadro. Esta pieza se usa en retargeting (quien ya vio otro anuncio o preguntó precio).</w:t>
       </w:r>
     </w:p>
     <w:p>
       <w:pPr>
-        <w:spacing w:after="160"/>
+        <w:spacing w:before="280" w:after="80"/>
+      </w:pPr>
+      <w:r>
+        <w:rPr>
+          <w:b/>
+          <w:color w:val="E54C09"/>
+          <w:sz w:val="25"/>
+        </w:rPr>
+        <w:t>GUION 2 — ESTO ES UNA CLASE   [PRIORITARIO]   · anuncio V2_CLASE</w:t>
+      </w:r>
+    </w:p>
+    <w:p>
+      <w:pPr>
+        <w:spacing w:after="40"/>
+      </w:pPr>
+      <w:r>
+        <w:rPr>
+          <w:b/>
+          <w:i w:val="0"/>
+          <w:sz w:val="21"/>
+        </w:rPr>
+        <w:t>Mensaje prellenado del botón de WhatsApp:</w:t>
+      </w:r>
+      <w:r>
+        <w:rPr>
+          <w:b w:val="0"/>
+          <w:i w:val="0"/>
+          <w:sz w:val="21"/>
+        </w:rPr>
+        <w:t xml:space="preserve"> "Hola, vi el video de la clase (V2). Quiero ver una por dentro."</w:t>
+      </w:r>
+    </w:p>
+    <w:p>
+      <w:pPr>
+        <w:spacing w:after="40"/>
+      </w:pPr>
+      <w:r>
+        <w:rPr>
+          <w:b/>
+          <w:i w:val="0"/>
+          <w:sz w:val="21"/>
+        </w:rPr>
+        <w:t>GANCHO (segundos 0-2, lo que para el dedo):</w:t>
+      </w:r>
+      <w:r>
+        <w:rPr>
+          <w:b w:val="0"/>
+          <w:i w:val="0"/>
+          <w:sz w:val="21"/>
+        </w:rPr>
+        <w:t xml:space="preserve"> Segundo 0: el estudiante de pie, a mitad de una frase en inglés, con el profe diciendo "Again. Louder." Texto grande: "Empezó de cero aquí. Escúchalo." (Nunca ganchos que le atribuyan una carencia al que mira: política de Meta.)</w:t>
+      </w:r>
+    </w:p>
+    <w:p>
+      <w:pPr>
+        <w:spacing w:after="40"/>
+      </w:pPr>
+      <w:r>
+        <w:rPr>
+          <w:b/>
+          <w:i w:val="0"/>
+          <w:sz w:val="21"/>
+        </w:rPr>
+        <w:t>Qué vende:</w:t>
+      </w:r>
+      <w:r>
+        <w:rPr>
+          <w:b w:val="0"/>
+          <w:i w:val="0"/>
+          <w:sz w:val="21"/>
+        </w:rPr>
+        <w:t xml:space="preserve"> El método visto: estudiantes hablando desde la primera clase, el profesor como coach, no como conferencista.</w:t>
+      </w:r>
+    </w:p>
+    <w:p>
+      <w:pPr>
+        <w:spacing w:after="40"/>
+      </w:pPr>
+      <w:r>
+        <w:rPr>
+          <w:b/>
+          <w:i w:val="0"/>
+          <w:sz w:val="21"/>
+        </w:rPr>
+        <w:t>Quién habla:</w:t>
+      </w:r>
+      <w:r>
+        <w:rPr>
+          <w:b w:val="0"/>
+          <w:i w:val="0"/>
+          <w:sz w:val="21"/>
+        </w:rPr>
+        <w:t xml:space="preserve"> Nadie a cámara: se graba la simulación real del grupo B2, toda en inglés: entrevista de trabajo (escenario en el tablero: "A company in Bucaramanga is hiring a bilingual customer service assistant"; 3 preguntas en el tablero; 1 candidato, 1 entrevistador, 3 observadores de pie; rotan cada 4 minutos). La profe corrige en vivo lo visible (volumen, mirada, repetir la frase completa, pronunciación). Al final, la profe dice UNA frase a cámara. Todo esto está en la hoja de la profe; Isaac solo graba.   ·   </w:t>
+      </w:r>
+      <w:r>
+        <w:rPr>
+          <w:b/>
+          <w:i w:val="0"/>
+          <w:sz w:val="21"/>
+        </w:rPr>
+        <w:t>Duración:</w:t>
+      </w:r>
+      <w:r>
+        <w:rPr>
+          <w:b w:val="0"/>
+          <w:i w:val="0"/>
+          <w:sz w:val="21"/>
+        </w:rPr>
+        <w:t xml:space="preserve"> 25-30 s</w:t>
+      </w:r>
+    </w:p>
+    <w:p>
+      <w:pPr>
+        <w:spacing w:after="80"/>
+      </w:pPr>
+      <w:r>
+        <w:rPr>
+          <w:b/>
+          <w:i w:val="0"/>
+          <w:sz w:val="21"/>
+        </w:rPr>
+        <w:t>Qué se ve:</w:t>
+      </w:r>
+      <w:r>
+        <w:rPr>
+          <w:b w:val="0"/>
+          <w:i w:val="0"/>
+          <w:sz w:val="21"/>
+        </w:rPr>
+        <w:t xml:space="preserve"> Cámara desde atrás del grupo, luego desde el lado; se ve el tablero con la Frase del Día. Audio ambiente real. Corte final: profe a cámara.</w:t>
+      </w:r>
+    </w:p>
+    <w:p>
+      <w:pPr>
+        <w:spacing w:after="20"/>
+      </w:pPr>
+      <w:r>
+        <w:rPr>
+          <w:b/>
+          <w:i w:val="0"/>
+          <w:sz w:val="21"/>
+        </w:rPr>
+        <w:t>Texto (se dice tal cual, con subtítulos):</w:t>
+      </w:r>
+    </w:p>
+    <w:p>
+      <w:pPr>
+        <w:spacing w:after="40"/>
+      </w:pPr>
+      <w:r>
+        <w:rPr>
+          <w:b w:val="0"/>
+          <w:i/>
+          <w:sz w:val="21"/>
+        </w:rPr>
+        <w:t>"(ambiente: estudiantes hablando en inglés, el profe corrige: "Again. Louder. Look at her, not at me.")"</w:t>
+      </w:r>
+    </w:p>
+    <w:p>
+      <w:pPr>
+        <w:spacing w:after="40"/>
+      </w:pPr>
+      <w:r>
+        <w:rPr>
+          <w:b w:val="0"/>
+          <w:i/>
+          <w:sz w:val="21"/>
+        </w:rPr>
+        <w:t>"Profe a cámara: Aquí nadie copia del tablero. Desde la primera clase hablas, te equivocas, te corregimos y lo vuelves a decir. Así se entrena un idioma."</w:t>
+      </w:r>
+    </w:p>
+    <w:p>
+      <w:pPr>
+        <w:spacing w:after="40"/>
+      </w:pPr>
+      <w:r>
+        <w:rPr>
+          <w:b/>
+          <w:i w:val="0"/>
+          <w:sz w:val="21"/>
+        </w:rPr>
+        <w:t>Texto en pantalla:</w:t>
+      </w:r>
+      <w:r>
+        <w:rPr>
+          <w:b w:val="0"/>
+          <w:i w:val="0"/>
+          <w:sz w:val="21"/>
+        </w:rPr>
+        <w:t xml:space="preserve"> "Empezó de cero en Heiiu" (solo sobre los 3 que sí) · "Clase de B1, 7:00 PM" (nivel y hora reales) · "Hablas desde el primer día"</w:t>
+      </w:r>
+    </w:p>
+    <w:p>
+      <w:pPr>
+        <w:spacing w:after="40"/>
+      </w:pPr>
+      <w:r>
+        <w:rPr>
+          <w:b/>
+          <w:i w:val="0"/>
+          <w:sz w:val="21"/>
+        </w:rPr>
+        <w:t>Cierre:</w:t>
+      </w:r>
+      <w:r>
+        <w:rPr>
+          <w:b w:val="0"/>
+          <w:i w:val="0"/>
+          <w:sz w:val="21"/>
+        </w:rPr>
+        <w:t xml:space="preserve"> "¿Quieres ver una clase así por dentro? Escríbenos." Botón: WhatsApp. VARIANTE DE CIERRE (grabar también): "Mándanos un audio de 30 segundos y te decimos tu nivel." (misma condición que el guion 6).</w:t>
+      </w:r>
+    </w:p>
+    <w:p>
+      <w:pPr>
+        <w:spacing w:after="40"/>
+      </w:pPr>
+      <w:r>
+        <w:rPr>
+          <w:b/>
+          <w:i w:val="0"/>
+          <w:sz w:val="21"/>
+        </w:rPr>
+        <w:t>VERSIÓN DE 15 SEGUNDOS (se corta en edición del mismo material; no se graba aparte):</w:t>
+      </w:r>
+      <w:r>
+        <w:rPr>
+          <w:b w:val="0"/>
+          <w:i w:val="0"/>
+          <w:sz w:val="21"/>
+        </w:rPr>
+        <w:t xml:space="preserve"> 0-3 s estudiante a mitad de frase + profe "Again. Louder." (texto: "Empezó de cero aquí. Escúchalo.") → 3-10 s la misma frase dicha bien + 3 s más de simulación → 10-15 s profe a cámara: "Aquí nadie copia del tablero. Hablas, te equivocas, te corregimos." + "Escríbenos."</w:t>
+      </w:r>
+    </w:p>
+    <w:p>
+      <w:pPr>
+        <w:spacing w:after="80"/>
       </w:pPr>
       <w:r>
         <w:rPr>
@@ -892,124 +1091,214 @@
           <w:color w:val="666666"/>
           <w:sz w:val="19"/>
         </w:rPr>
-        <w:t>Lo que NO se prueba porque ya se sabe que no diferencia: "fácil", "gratis", descuento, nombre del programa, miedo ("¿te congelas?"), profesores nativos.</w:t>
+        <w:t>Nota: Autorización de imagen: en el contrato de matrícula; grupo avisado ese día por la profe. Sin nombres en pantalla. Nunca poner cuánto tiempo lleva si no es el dato real del estudiante.</w:t>
       </w:r>
     </w:p>
     <w:p>
       <w:pPr>
-        <w:spacing w:before="200" w:after="80"/>
+        <w:spacing w:before="280" w:after="80"/>
       </w:pPr>
       <w:r>
         <w:rPr>
           <w:b/>
           <w:color w:val="E54C09"/>
-          <w:sz w:val="24"/>
-        </w:rPr>
-        <w:t>ORDEN DE GRABACIÓN (prioridad)</w:t>
+          <w:sz w:val="25"/>
+        </w:rPr>
+        <w:t>GUION 3 — LA VACANTE   [PRIORITARIO]   · anuncio V4_VACANTE</w:t>
       </w:r>
     </w:p>
     <w:p>
       <w:pPr>
         <w:spacing w:after="40"/>
       </w:pPr>
+      <w:r>
+        <w:rPr>
+          <w:b/>
+          <w:i w:val="0"/>
+          <w:sz w:val="21"/>
+        </w:rPr>
+        <w:t>Mensaje prellenado del botón de WhatsApp:</w:t>
+      </w:r>
       <w:r>
         <w:rPr>
           <w:b w:val="0"/>
           <w:i w:val="0"/>
           <w:sz w:val="21"/>
         </w:rPr>
-        <w:t>1. GUION 6 "Llegué sin una palabra" (los 3 que empezaron de cero: confesión + inglés de hoy) y GUION 2 "Esto es una clase": estudiantes reales hablando. Es la prueba que más convierte en compras caras (investigación 08/10) y lo que ningún avatar ni competidor puede mostrar.</w:t>
+        <w:t xml:space="preserve"> "Hola, vi el video de la vacante (V4). Necesito el inglés para el trabajo."</w:t>
       </w:r>
     </w:p>
     <w:p>
       <w:pPr>
         <w:spacing w:after="40"/>
       </w:pPr>
+      <w:r>
+        <w:rPr>
+          <w:b/>
+          <w:i w:val="0"/>
+          <w:sz w:val="21"/>
+        </w:rPr>
+        <w:t>GANCHO (segundos 0-2, lo que para el dedo):</w:t>
+      </w:r>
       <w:r>
         <w:rPr>
           <w:b w:val="0"/>
           <w:i w:val="0"/>
           <w:sz w:val="21"/>
         </w:rPr>
-        <w:t>2. GUION 4 "Siete meses": velocidad con número (575 h, 7 meses). Ningún competidor publica sus horas.</w:t>
+        <w:t xml:space="preserve"> Texto grande sobre el profe mirando a cámara en silencio 1 segundo: "La vacante decía: inglés intermedio." (En tercera persona, no "tú no sabes": política de atributos personales de Meta.)</w:t>
       </w:r>
     </w:p>
     <w:p>
       <w:pPr>
         <w:spacing w:after="40"/>
       </w:pPr>
+      <w:r>
+        <w:rPr>
+          <w:b/>
+          <w:i w:val="0"/>
+          <w:sz w:val="21"/>
+        </w:rPr>
+        <w:t>Qué vende:</w:t>
+      </w:r>
       <w:r>
         <w:rPr>
           <w:b w:val="0"/>
           <w:i w:val="0"/>
           <w:sz w:val="21"/>
         </w:rPr>
-        <w:t>3. GUION 3 "La vacante": el destino #1 de la base.</w:t>
+        <w:t xml:space="preserve"> El destino #1 de la base: trabajo. Sin prometer empleo: el inglés quita la excusa.</w:t>
       </w:r>
     </w:p>
     <w:p>
       <w:pPr>
         <w:spacing w:after="40"/>
       </w:pPr>
+      <w:r>
+        <w:rPr>
+          <w:b/>
+          <w:i w:val="0"/>
+          <w:sz w:val="21"/>
+        </w:rPr>
+        <w:t>Quién habla:</w:t>
+      </w:r>
       <w:r>
         <w:rPr>
           <w:b w:val="0"/>
           <w:i w:val="0"/>
           <w:sz w:val="21"/>
         </w:rPr>
-        <w:t>4. GUION 1 "Te acompañamos": la garantía va DESPUÉS del precio (bot, cita, retargeting), no como gancho de alcance. Se graba igual.</w:t>
-      </w:r>
-    </w:p>
-    <w:p>
-      <w:pPr>
-        <w:spacing w:after="40"/>
-      </w:pPr>
+        <w:t xml:space="preserve"> Un profe (Tomás o Juan Diego), a cámara, en el aula, sentado en el borde del escritorio. Tono directo, sin sonrisa de comercial.   ·   </w:t>
+      </w:r>
+      <w:r>
+        <w:rPr>
+          <w:b/>
+          <w:i w:val="0"/>
+          <w:sz w:val="21"/>
+        </w:rPr>
+        <w:t>Duración:</w:t>
+      </w:r>
       <w:r>
         <w:rPr>
           <w:b w:val="0"/>
           <w:i w:val="0"/>
           <w:sz w:val="21"/>
         </w:rPr>
-        <w:t>5. GUION 8 "El pasaporte": el destino de irse (Au Pair / Work and Travel / Europa), la conversación más barata.</w:t>
+        <w:t xml:space="preserve"> 20 s</w:t>
       </w:r>
     </w:p>
     <w:p>
       <w:pPr>
-        <w:spacing w:after="40"/>
-      </w:pPr>
+        <w:spacing w:after="80"/>
+      </w:pPr>
+      <w:r>
+        <w:rPr>
+          <w:b/>
+          <w:i w:val="0"/>
+          <w:sz w:val="21"/>
+        </w:rPr>
+        <w:t>Qué se ve:</w:t>
+      </w:r>
       <w:r>
         <w:rPr>
           <w:b w:val="0"/>
           <w:i w:val="0"/>
           <w:sz w:val="21"/>
         </w:rPr>
-        <w:t>6. GUION 9 "La corrección del día": 10 minutos, el único que da algo antes de pedir (reciprocidad).</w:t>
+        <w:t xml:space="preserve"> Abre con 1 segundo de la fachada y el texto "Aquí, en Bucaramanga" (lo que Open English, Platzi y E4CC no pueden decir). Plano medio fijo. Al final, corte a 2 segundos de una simulación de entrevista de trabajo en clase.</w:t>
       </w:r>
     </w:p>
     <w:p>
       <w:pPr>
+        <w:spacing w:after="20"/>
+      </w:pPr>
+      <w:r>
+        <w:rPr>
+          <w:b/>
+          <w:i w:val="0"/>
+          <w:sz w:val="21"/>
+        </w:rPr>
+        <w:t>Texto (se dice tal cual, con subtítulos):</w:t>
+      </w:r>
+    </w:p>
+    <w:p>
+      <w:pPr>
         <w:spacing w:after="40"/>
       </w:pPr>
+      <w:r>
+        <w:rPr>
+          <w:b w:val="0"/>
+          <w:i/>
+          <w:sz w:val="21"/>
+        </w:rPr>
+        <w:t>"Hay vacantes que dicen "inglés intermedio". Ese renglón deja a mucha gente sin poder aplicar."</w:t>
+      </w:r>
+    </w:p>
+    <w:p>
+      <w:pPr>
+        <w:spacing w:after="40"/>
+      </w:pPr>
+      <w:r>
+        <w:rPr>
+          <w:b w:val="0"/>
+          <w:i/>
+          <w:sz w:val="21"/>
+        </w:rPr>
+        <w:t>"El inglés no te da el puesto. Pero sin inglés, ese puesto ni se abre."</w:t>
+      </w:r>
+    </w:p>
+    <w:p>
+      <w:pPr>
+        <w:spacing w:after="40"/>
+      </w:pPr>
+      <w:r>
+        <w:rPr>
+          <w:b w:val="0"/>
+          <w:i/>
+          <w:sz w:val="21"/>
+        </w:rPr>
+        <w:t>"Aquí la entrevista se ensaya en clase, pregunta por pregunta, hasta que se contesta sin pensar."</w:t>
+      </w:r>
+    </w:p>
+    <w:p>
+      <w:pPr>
+        <w:spacing w:after="40"/>
+      </w:pPr>
+      <w:r>
+        <w:rPr>
+          <w:b/>
+          <w:i w:val="0"/>
+          <w:sz w:val="21"/>
+        </w:rPr>
+        <w:t>Texto en pantalla:</w:t>
+      </w:r>
       <w:r>
         <w:rPr>
           <w:b w:val="0"/>
           <w:i w:val="0"/>
           <w:sz w:val="21"/>
         </w:rPr>
-        <w:t>7. GUION 5 "El Pacto" (filtro, poco volumen) y GUION 7 "El año después del colegio". Se graban los 9; el orden es de prioridad por si algo falla, no una lista opcional.</w:t>
-      </w:r>
-    </w:p>
-    <w:p>
-      <w:pPr>
-        <w:spacing w:before="280" w:after="80"/>
-      </w:pPr>
-      <w:r>
-        <w:rPr>
-          <w:b/>
-          <w:color w:val="E54C09"/>
-          <w:sz w:val="25"/>
-        </w:rPr>
-        <w:t>GUION 1 — TE ACOMPAÑAMOS (Y TE LO FIRMAMOS)   [PRIORITARIO]   · anuncio V6_GARANTIA</w:t>
+        <w:t xml:space="preserve"> "Aquí, en Bucaramanga" · "La vacante decía: inglés intermedio" · "Entrenamos la entrevista en clase"</w:t>
       </w:r>
     </w:p>
     <w:p>
@@ -1022,7 +1311,7 @@
           <w:i w:val="0"/>
           <w:sz w:val="21"/>
         </w:rPr>
-        <w:t>Mensaje prellenado del botón de WhatsApp:</w:t>
+        <w:t>Cierre:</w:t>
       </w:r>
       <w:r>
         <w:rPr>
@@ -1030,7 +1319,7 @@
           <w:i w:val="0"/>
           <w:sz w:val="21"/>
         </w:rPr>
-        <w:t xml:space="preserve"> "Hola, vi el video del acompañamiento (V6). ¿Me muestran la garantía?"</w:t>
+        <w:t xml:space="preserve"> "Cuéntanos para qué necesitas el inglés y te decimos por dónde empezar. Escríbenos." Botón: WhatsApp. VARIANTE DE CIERRE: "Mándanos un audio de 30 segundos y te decimos tu nivel." (misma condición que el guion 6).</w:t>
       </w:r>
     </w:p>
     <w:p>
@@ -1043,7 +1332,7 @@
           <w:i w:val="0"/>
           <w:sz w:val="21"/>
         </w:rPr>
-        <w:t>GANCHO (segundos 0-2, lo que para el dedo):</w:t>
+        <w:t>VERSIÓN DE 15 SEGUNDOS (se corta en edición del mismo material; no se graba aparte):</w:t>
       </w:r>
       <w:r>
         <w:rPr>
@@ -1051,180 +1340,7 @@
           <w:i w:val="0"/>
           <w:sz w:val="21"/>
         </w:rPr>
-        <w:t xml:space="preserve"> Jacqueline a cámara, sin papel todavía: "Tienes las ganas. Pero a veces te falla la motivación." Texto grande: "Las ganas no bastan."</w:t>
-      </w:r>
-    </w:p>
-    <w:p>
-      <w:pPr>
-        <w:spacing w:after="40"/>
-      </w:pPr>
-      <w:r>
-        <w:rPr>
-          <w:b/>
-          <w:i w:val="0"/>
-          <w:sz w:val="21"/>
-        </w:rPr>
-        <w:t>Qué vende:</w:t>
-      </w:r>
-      <w:r>
-        <w:rPr>
-          <w:b w:val="0"/>
-          <w:i w:val="0"/>
-          <w:sz w:val="21"/>
-        </w:rPr>
-        <w:t xml:space="preserve"> La motivación que falla y el acompañamiento que la sostiene (el profe como coach), cerrado con la garantía por escrito. OJO: siempre "única academia PRESENCIAL de Bucaramanga" (las plataformas online E4CC y EF sí tienen garantía escrita).</w:t>
-      </w:r>
-    </w:p>
-    <w:p>
-      <w:pPr>
-        <w:spacing w:after="40"/>
-      </w:pPr>
-      <w:r>
-        <w:rPr>
-          <w:b/>
-          <w:i w:val="0"/>
-          <w:sz w:val="21"/>
-        </w:rPr>
-        <w:t>Quién habla:</w:t>
-      </w:r>
-      <w:r>
-        <w:rPr>
-          <w:b w:val="0"/>
-          <w:i w:val="0"/>
-          <w:sz w:val="21"/>
-        </w:rPr>
-        <w:t xml:space="preserve"> Coordinación (Jacqueline), de pie, con el ANEXO DE GARANTÍA impreso en la mano (el documento que se firma con la matrícula; la garantía no está en el contrato de 24 cláusulas). Fondo: la recepción o un aula vacía con el tablero.   ·   </w:t>
-      </w:r>
-      <w:r>
-        <w:rPr>
-          <w:b/>
-          <w:i w:val="0"/>
-          <w:sz w:val="21"/>
-        </w:rPr>
-        <w:t>Duración:</w:t>
-      </w:r>
-      <w:r>
-        <w:rPr>
-          <w:b w:val="0"/>
-          <w:i w:val="0"/>
-          <w:sz w:val="21"/>
-        </w:rPr>
-        <w:t xml:space="preserve"> 25-30 s</w:t>
-      </w:r>
-    </w:p>
-    <w:p>
-      <w:pPr>
-        <w:spacing w:after="80"/>
-      </w:pPr>
-      <w:r>
-        <w:rPr>
-          <w:b/>
-          <w:i w:val="0"/>
-          <w:sz w:val="21"/>
-        </w:rPr>
-        <w:t>Qué se ve:</w:t>
-      </w:r>
-      <w:r>
-        <w:rPr>
-          <w:b w:val="0"/>
-          <w:i w:val="0"/>
-          <w:sz w:val="21"/>
-        </w:rPr>
-        <w:t xml:space="preserve"> Plano medio. En la última frase, muestra el anexo a cámara y señala la garantía con el dedo. Cierre sobre la hoja, legible.</w:t>
-      </w:r>
-    </w:p>
-    <w:p>
-      <w:pPr>
-        <w:spacing w:after="20"/>
-      </w:pPr>
-      <w:r>
-        <w:rPr>
-          <w:b/>
-          <w:i w:val="0"/>
-          <w:sz w:val="21"/>
-        </w:rPr>
-        <w:t>Texto (se dice tal cual, con subtítulos):</w:t>
-      </w:r>
-    </w:p>
-    <w:p>
-      <w:pPr>
-        <w:spacing w:after="40"/>
-      </w:pPr>
-      <w:r>
-        <w:rPr>
-          <w:b w:val="0"/>
-          <w:i/>
-          <w:sz w:val="21"/>
-        </w:rPr>
-        <w:t>"Tienes las ganas de aprender inglés. Pero a veces te falla la motivación. Eso no solo pasa con el inglés: pasa con todo."</w:t>
-      </w:r>
-    </w:p>
-    <w:p>
-      <w:pPr>
-        <w:spacing w:after="40"/>
-      </w:pPr>
-      <w:r>
-        <w:rPr>
-          <w:b w:val="0"/>
-          <w:i/>
-          <w:sz w:val="21"/>
-        </w:rPr>
-        <w:t>"Por eso aquí no solo te enseñamos. Te acompañamos: tu profe es tu coach. Te corrige, te pide cuentas y no te suelta."</w:t>
-      </w:r>
-    </w:p>
-    <w:p>
-      <w:pPr>
-        <w:spacing w:after="40"/>
-      </w:pPr>
-      <w:r>
-        <w:rPr>
-          <w:b w:val="0"/>
-          <w:i/>
-          <w:sz w:val="21"/>
-        </w:rPr>
-        <w:t>"Es un trabajo en equipo: tú pones tu parte y, si no aprendes, te devolvemos el cien por ciento del nivel. Te lo entregamos firmado."</w:t>
-      </w:r>
-    </w:p>
-    <w:p>
-      <w:pPr>
-        <w:spacing w:after="40"/>
-      </w:pPr>
-      <w:r>
-        <w:rPr>
-          <w:b/>
-          <w:i w:val="0"/>
-          <w:sz w:val="21"/>
-        </w:rPr>
-        <w:t>Texto en pantalla:</w:t>
-      </w:r>
-      <w:r>
-        <w:rPr>
-          <w:b w:val="0"/>
-          <w:i w:val="0"/>
-          <w:sz w:val="21"/>
-        </w:rPr>
-        <w:t xml:space="preserve"> "Las ganas no bastan" · "Tu profe es tu coach" · "Garantía de aprendizaje por escrito · única academia presencial de Bucaramanga que la firma"</w:t>
-      </w:r>
-    </w:p>
-    <w:p>
-      <w:pPr>
-        <w:spacing w:after="40"/>
-      </w:pPr>
-      <w:r>
-        <w:rPr>
-          <w:b/>
-          <w:i w:val="0"/>
-          <w:sz w:val="21"/>
-        </w:rPr>
-        <w:t>Cierre:</w:t>
-      </w:r>
-      <w:r>
-        <w:rPr>
-          <w:b w:val="0"/>
-          <w:i w:val="0"/>
-          <w:sz w:val="21"/>
-        </w:rPr>
-        <w:t xml:space="preserve"> "Escríbenos y te mostramos cómo lo hacemos, antes de decidir algo fácil que no te lleve a los resultados que necesitas." Botón: WhatsApp.</w:t>
+        <w:t xml:space="preserve"> 0-3 s fachada + texto "La vacante decía: inglés intermedio." → 3-10 s profe: "El inglés no te da el puesto. Pero sin inglés, ese puesto ni se abre." → 10-15 s 2 s de entrevista en clase + "Cuéntanos para qué necesitas el inglés. Escríbenos."</w:t>
       </w:r>
     </w:p>
     <w:p>
@@ -1238,7 +1354,7 @@
           <w:color w:val="666666"/>
           <w:sz w:val="19"/>
         </w:rPr>
-        <w:t>Nota: El anexo real se ve legible en el plano final. Sin cifras de precio en cuadro. Esta pieza se usa en retargeting (quien ya vio otro anuncio o preguntó precio).</w:t>
+        <w:t>Nota: Nunca "consigue trabajo" ni "aplica a vacantes". Es preparación, no empleo.</w:t>
       </w:r>
     </w:p>
     <w:p>
@@ -1251,7 +1367,7 @@
           <w:color w:val="E54C09"/>
           <w:sz w:val="25"/>
         </w:rPr>
-        <w:t>GUION 2 — ESTO ES UNA CLASE   [PRIORITARIO]   · anuncio V2_CLASE</w:t>
+        <w:t>GUION 4 — SIETE MESES   [PRIORITARIO]   · anuncio V3_575H</w:t>
       </w:r>
     </w:p>
     <w:p>
@@ -1272,7 +1388,7 @@
           <w:i w:val="0"/>
           <w:sz w:val="21"/>
         </w:rPr>
-        <w:t xml:space="preserve"> "Hola, vi el video de la clase (V2). Quiero ver una por dentro."</w:t>
+        <w:t xml:space="preserve"> "Hola, vi el video de los 7 meses (V3). ¿Qué jornada me sirve?"</w:t>
       </w:r>
     </w:p>
     <w:p>
@@ -1293,7 +1409,7 @@
           <w:i w:val="0"/>
           <w:sz w:val="21"/>
         </w:rPr>
-        <w:t xml:space="preserve"> Segundo 0: el estudiante de pie, a mitad de una frase en inglés, con el profe diciendo "Again. Louder." Texto grande: "Empezó de cero aquí. Escúchalo." (Nunca ganchos que le atribuyan una carencia al que mira: política de Meta.)</w:t>
+        <w:t xml:space="preserve"> El profe escribe en el tablero un "5 AÑOS" grande y lo tacha. Texto: "Lo que tarda el inglés a 2 horas por semana." Política: "7 meses" es descripción del programa; jamás "garantizado que hablas en 7 meses".</w:t>
       </w:r>
     </w:p>
     <w:p>
@@ -1314,7 +1430,7 @@
           <w:i w:val="0"/>
           <w:sz w:val="21"/>
         </w:rPr>
-        <w:t xml:space="preserve"> El método visto: estudiantes hablando desde la primera clase, el profesor como coach, no como conferencista.</w:t>
+        <w:t xml:space="preserve"> Velocidad con número: el Marco Común Europeo estima 500-600 h guiadas para B2 (rango; varía por academia); Heiiu son 575 h en 7 meses (4 h/día) o 14 (2 h/noche). Es el único "rápido" verificable del mercado; los demás no publican horas.</w:t>
       </w:r>
     </w:p>
     <w:p>
@@ -1335,7 +1451,7 @@
           <w:i w:val="0"/>
           <w:sz w:val="21"/>
         </w:rPr>
-        <w:t xml:space="preserve"> Nadie a cámara: se graba la simulación real del grupo B2, toda en inglés: entrevista de trabajo (escenario en el tablero: "A company in Bucaramanga is hiring a bilingual customer service assistant"; 3 preguntas en el tablero; 1 candidato, 1 entrevistador, 3 observadores de pie; rotan cada 4 minutos). La profe corrige en vivo lo visible (volumen, mirada, repetir la frase completa, pronunciación). Al final, la profe dice UNA frase a cámara. Todo esto está en la hoja de la profe; Isaac solo graba.   ·   </w:t>
+        <w:t xml:space="preserve"> Profe a cámara, con el tablero detrás donde escribe (de verdad, en el momento) "575 h" y "7 meses".   ·   </w:t>
       </w:r>
       <w:r>
         <w:rPr>
@@ -1351,7 +1467,7 @@
           <w:i w:val="0"/>
           <w:sz w:val="21"/>
         </w:rPr>
-        <w:t xml:space="preserve"> 25-30 s</w:t>
+        <w:t xml:space="preserve"> 25 s</w:t>
       </w:r>
     </w:p>
     <w:p>
@@ -1372,7 +1488,7 @@
           <w:i w:val="0"/>
           <w:sz w:val="21"/>
         </w:rPr>
-        <w:t xml:space="preserve"> Cámara desde atrás del grupo, luego desde el lado; se ve el tablero con la Frase del Día. Audio ambiente real. Corte final: profe a cámara.</w:t>
+        <w:t xml:space="preserve"> Plano medio; el profe se voltea y escribe en el tablero mientras habla; vuelve a cámara.</w:t>
       </w:r>
     </w:p>
     <w:p>
@@ -1398,7 +1514,7 @@
           <w:i/>
           <w:sz w:val="21"/>
         </w:rPr>
-        <w:t>"(ambiente: estudiantes hablando en inglés, el profe corrige: "Again. Louder. Look at her, not at me.")"</w:t>
+        <w:t>"El Marco Común Europeo calcula entre quinientas y seiscientas horas de clase para llegar a B2."</w:t>
       </w:r>
     </w:p>
     <w:p>
@@ -1411,7 +1527,20 @@
           <w:i/>
           <w:sz w:val="21"/>
         </w:rPr>
-        <w:t>"Profe a cámara: Aquí nadie copia del tablero. Desde la primera clase hablas, te equivocas, te corregimos y lo vuelves a decir. Así se entrena un idioma."</w:t>
+        <w:t>"Si estudias dos horas por semana, son cinco años. Aquí: cuatro horas al día, siete meses. O si trabajas, dos horas cada noche: catorce."</w:t>
+      </w:r>
+    </w:p>
+    <w:p>
+      <w:pPr>
+        <w:spacing w:after="40"/>
+      </w:pPr>
+      <w:r>
+        <w:rPr>
+          <w:b w:val="0"/>
+          <w:i/>
+          <w:sz w:val="21"/>
+        </w:rPr>
+        <w:t>"No es fácil. Es rápido porque es intenso."</w:t>
       </w:r>
     </w:p>
     <w:p>
@@ -1432,7 +1561,7 @@
           <w:i w:val="0"/>
           <w:sz w:val="21"/>
         </w:rPr>
-        <w:t xml:space="preserve"> "Empezó de cero en Heiiu" (solo sobre los 3 que sí) · "Clase de B1, 7:00 PM" (nivel y hora reales) · "Hablas desde el primer día"</w:t>
+        <w:t xml:space="preserve"> "B2 = 500-600 h (Marco Común Europeo)" · "2 h/semana = 5 años" · "Aquí: 7 meses · noche: 14" · al final: "Garantía por escrito"</w:t>
       </w:r>
     </w:p>
     <w:p>
@@ -1453,7 +1582,28 @@
           <w:i w:val="0"/>
           <w:sz w:val="21"/>
         </w:rPr>
-        <w:t xml:space="preserve"> "¿Quieres ver una clase así por dentro? Escríbenos." Botón: WhatsApp. VARIANTE DE CIERRE (grabar también): "Mándanos un audio de 30 segundos y te decimos tu nivel." (misma condición que el guion 6).</w:t>
+        <w:t xml:space="preserve"> "Pregúntanos qué fecha te queda. Escríbenos." Botón: WhatsApp.</w:t>
+      </w:r>
+    </w:p>
+    <w:p>
+      <w:pPr>
+        <w:spacing w:after="40"/>
+      </w:pPr>
+      <w:r>
+        <w:rPr>
+          <w:b/>
+          <w:i w:val="0"/>
+          <w:sz w:val="21"/>
+        </w:rPr>
+        <w:t>VERSIÓN DE 15 SEGUNDOS (se corta en edición del mismo material; no se graba aparte):</w:t>
+      </w:r>
+      <w:r>
+        <w:rPr>
+          <w:b w:val="0"/>
+          <w:i w:val="0"/>
+          <w:sz w:val="21"/>
+        </w:rPr>
+        <w:t xml:space="preserve"> 0-3 s la profe tacha "5 AÑOS" en el tablero → 3-11 s: "Si estudias dos horas por semana, son cinco años. Aquí: cuatro horas al día, siete meses." (escribe "7 meses") → 11-15 s: "No es fácil. Es intenso. Pregúntanos qué fecha te queda."</w:t>
       </w:r>
     </w:p>
     <w:p>
@@ -1467,7 +1617,7 @@
           <w:color w:val="666666"/>
           <w:sz w:val="19"/>
         </w:rPr>
-        <w:t>Nota: Autorización de imagen: en el contrato de matrícula; grupo avisado ese día por la profe. Sin nombres en pantalla. Nunca poner cuánto tiempo lleva si no es el dato real del estudiante.</w:t>
+        <w:t>Nota: Las dos jornadas van en la misma pieza (4 h/día = 7 meses; 2 h/noche = 14 meses) para no dejar por fuera al nocturno. Sin precio.</w:t>
       </w:r>
     </w:p>
     <w:p>
@@ -1480,7 +1630,7 @@
           <w:color w:val="E54C09"/>
           <w:sz w:val="25"/>
         </w:rPr>
-        <w:t>GUION 3 — LA VACANTE   [PRIORITARIO]   · anuncio V4_VACANTE</w:t>
+        <w:t>GUION 5 — EL PACTO   [SE GRABA]   · anuncio V7_NOESFACIL</w:t>
       </w:r>
     </w:p>
     <w:p>
@@ -1501,7 +1651,7 @@
           <w:i w:val="0"/>
           <w:sz w:val="21"/>
         </w:rPr>
-        <w:t xml:space="preserve"> "Hola, vi el video de la vacante (V4). Necesito el inglés para el trabajo."</w:t>
+        <w:t xml:space="preserve"> "Hola, vi el video de lo que no prometen (V7). Voy en serio."</w:t>
       </w:r>
     </w:p>
     <w:p>
@@ -1522,7 +1672,7 @@
           <w:i w:val="0"/>
           <w:sz w:val="21"/>
         </w:rPr>
-        <w:t xml:space="preserve"> Texto grande sobre el profe mirando a cámara en silencio 1 segundo: "La vacante decía: inglés intermedio." (En tercera persona, no "tú no sabes": política de atributos personales de Meta.)</w:t>
+        <w:t xml:space="preserve"> Profe muy cerca, bajo: "No te voy a decir que es fácil." Texto grande: "Lo que NO te prometemos".</w:t>
       </w:r>
     </w:p>
     <w:p>
@@ -1543,7 +1693,7 @@
           <w:i w:val="0"/>
           <w:sz w:val="21"/>
         </w:rPr>
-        <w:t xml:space="preserve"> El destino #1 de la base: trabajo. Sin prometer empleo: el inglés quita la excusa.</w:t>
+        <w:t xml:space="preserve"> La venta honesta: qué prometemos y qué no. Atrae al que va en serio y espanta al que busca "fácil" (y eso baja los leads que no contestan).</w:t>
       </w:r>
     </w:p>
     <w:p>
@@ -1564,7 +1714,7 @@
           <w:i w:val="0"/>
           <w:sz w:val="21"/>
         </w:rPr>
-        <w:t xml:space="preserve"> Un profe (Tomás o Juan Diego), a cámara, en el aula, sentado en el borde del escritorio. Tono directo, sin sonrisa de comercial.   ·   </w:t>
+        <w:t xml:space="preserve"> Profe (Angie o Cristian) a cámara, en el aula, muy cerca, hablando bajo.   ·   </w:t>
       </w:r>
       <w:r>
         <w:rPr>
@@ -1580,7 +1730,7 @@
           <w:i w:val="0"/>
           <w:sz w:val="21"/>
         </w:rPr>
-        <w:t xml:space="preserve"> 20 s</w:t>
+        <w:t xml:space="preserve"> 25-30 s</w:t>
       </w:r>
     </w:p>
     <w:p>
@@ -1601,7 +1751,7 @@
           <w:i w:val="0"/>
           <w:sz w:val="21"/>
         </w:rPr>
-        <w:t xml:space="preserve"> Abre con 1 segundo de la fachada y el texto "Aquí, en Bucaramanga" (lo que Open English, Platzi y E4CC no pueden decir). Plano medio fijo. Al final, corte a 2 segundos de una simulación de entrevista de trabajo en clase.</w:t>
+        <w:t xml:space="preserve"> Plano cerrado, fijo. Sin música. Subtítulos palabra por palabra.</w:t>
       </w:r>
     </w:p>
     <w:p>
@@ -1627,7 +1777,7 @@
           <w:i/>
           <w:sz w:val="21"/>
         </w:rPr>
-        <w:t>"Hay vacantes que dicen "inglés intermedio". Ese renglón deja a mucha gente sin poder aplicar."</w:t>
+        <w:t>"Te voy a decir lo que no te prometemos: que sea fácil, ni que te guste todos los días. Vas a tener clases pesadas y días de no querer venir."</w:t>
       </w:r>
     </w:p>
     <w:p>
@@ -1640,7 +1790,7 @@
           <w:i/>
           <w:sz w:val="21"/>
         </w:rPr>
-        <w:t>"El inglés no te da el puesto. Pero sin inglés, ese puesto ni se abre."</w:t>
+        <w:t>"Lo que sí te prometemos: que hablas desde el primer día, que te corrigen todos los días, y que si cumples y no avanzas, te devolvemos la plata. Te lo entregamos firmado."</w:t>
       </w:r>
     </w:p>
     <w:p>
@@ -1653,7 +1803,7 @@
           <w:i/>
           <w:sz w:val="21"/>
         </w:rPr>
-        <w:t>"Aquí la entrevista se ensaya en clase, pregunta por pregunta, hasta que se contesta sin pensar."</w:t>
+        <w:t>"Si buscas que sea divertido, no somos tu academia. Si buscas hablar inglés, sí."</w:t>
       </w:r>
     </w:p>
     <w:p>
@@ -1674,7 +1824,7 @@
           <w:i w:val="0"/>
           <w:sz w:val="21"/>
         </w:rPr>
-        <w:t xml:space="preserve"> "Aquí, en Bucaramanga" · "La vacante decía: inglés intermedio" · "Entrenamos la entrevista en clase"</w:t>
+        <w:t xml:space="preserve"> "Lo que NO te prometemos" → "Lo que SÍ te firmamos"</w:t>
       </w:r>
     </w:p>
     <w:p>
@@ -1695,7 +1845,28 @@
           <w:i w:val="0"/>
           <w:sz w:val="21"/>
         </w:rPr>
-        <w:t xml:space="preserve"> "Cuéntanos para qué necesitas el inglés y te decimos por dónde empezar. Escríbenos." Botón: WhatsApp. VARIANTE DE CIERRE: "Mándanos un audio de 30 segundos y te decimos tu nivel." (misma condición que el guion 6).</w:t>
+        <w:t xml:space="preserve"> "Si vas en serio, escríbenos." Botón: WhatsApp.</w:t>
+      </w:r>
+    </w:p>
+    <w:p>
+      <w:pPr>
+        <w:spacing w:after="40"/>
+      </w:pPr>
+      <w:r>
+        <w:rPr>
+          <w:b/>
+          <w:i w:val="0"/>
+          <w:sz w:val="21"/>
+        </w:rPr>
+        <w:t>VERSIÓN DE 15 SEGUNDOS (se corta en edición del mismo material; no se graba aparte):</w:t>
+      </w:r>
+      <w:r>
+        <w:rPr>
+          <w:b w:val="0"/>
+          <w:i w:val="0"/>
+          <w:sz w:val="21"/>
+        </w:rPr>
+        <w:t xml:space="preserve"> 0-3 s profe muy cerca: "No te voy a decir que es fácil." → 3-11 s: "Si buscas que sea divertido, no somos tu academia. Si buscas hablar inglés, sí." → 11-15 s: "Si vas en serio, escríbenos."</w:t>
       </w:r>
     </w:p>
     <w:p>
@@ -1709,7 +1880,7 @@
           <w:color w:val="666666"/>
           <w:sz w:val="19"/>
         </w:rPr>
-        <w:t>Nota: Nunca "consigue trabajo" ni "aplica a vacantes". Es preparación, no empleo.</w:t>
+        <w:t>Nota: Es la pieza que más filtra: menos conversaciones, mejores. Medir costo por CITA, no por lead.</w:t>
       </w:r>
     </w:p>
     <w:p>
@@ -1722,7 +1893,7 @@
           <w:color w:val="E54C09"/>
           <w:sz w:val="25"/>
         </w:rPr>
-        <w:t>GUION 4 — SIETE MESES   [PRIORITARIO]   · anuncio V3_575H</w:t>
+        <w:t>GUION 6 — LLEGUÉ SIN UNA PALABRA   [PRIORITARIO]   · anuncio V1_VIDEODEHOY</w:t>
       </w:r>
     </w:p>
     <w:p>
@@ -1743,7 +1914,7 @@
           <w:i w:val="0"/>
           <w:sz w:val="21"/>
         </w:rPr>
-        <w:t xml:space="preserve"> "Hola, vi el video de los 7 meses (V3). ¿Qué jornada me sirve?"</w:t>
+        <w:t xml:space="preserve"> "Hola, vi el video del antes y después (V1). Quiero saber más."</w:t>
       </w:r>
     </w:p>
     <w:p>
@@ -1764,7 +1935,7 @@
           <w:i w:val="0"/>
           <w:sz w:val="21"/>
         </w:rPr>
-        <w:t xml:space="preserve"> El profe escribe en el tablero un "5 AÑOS" grande y lo tacha. Texto: "Lo que tarda el inglés a 2 horas por semana." Política: "7 meses" es descripción del programa; jamás "garantizado que hablas en 7 meses".</w:t>
+        <w:t xml:space="preserve"> Segundo 0: el estudiante a cámara, en español: "Llegué el primer día sin hablar una palabra de inglés." (formato CONFESIÓN, top 5 de ganchos por tasa de acierto en Motion 2026). Corte seco a él hablando en inglés. En pantalla el dato exacto: "Hace ___ meses" (de la ficha del estudiante; sin dato real no se publica).</w:t>
       </w:r>
     </w:p>
     <w:p>
@@ -1785,7 +1956,7 @@
           <w:i w:val="0"/>
           <w:sz w:val="21"/>
         </w:rPr>
-        <w:t xml:space="preserve"> Velocidad con número: el Marco Común Europeo estima 500-600 h guiadas para B2 (rango; varía por academia); Heiiu son 575 h en 7 meses (4 h/día) o 14 (2 h/noche). Es el único "rápido" verificable del mercado; los demás no publican horas.</w:t>
+        <w:t xml:space="preserve"> Prueba real: tres estudiantes que entraron a Heiiu sin hablar inglés y hoy hablan. Confesión en español + 10 s en inglés. (No hay video de entrada de este grupo; la prueba es su palabra con el dato real y su inglés de hoy.)</w:t>
       </w:r>
     </w:p>
     <w:p>
@@ -1806,7 +1977,7 @@
           <w:i w:val="0"/>
           <w:sz w:val="21"/>
         </w:rPr>
-        <w:t xml:space="preserve"> Profe a cámara, con el tablero detrás donde escribe (de verdad, en el momento) "575 h" y "7 meses".   ·   </w:t>
+        <w:t xml:space="preserve"> Cada uno de los 3 que empezó de cero en Heiiu, de pie frente a la cámara, en el salón: (a) en español: "Llegué el primer día sin hablar una palabra de inglés. Hace ___ meses." (dato real de cada uno); (b) 10 segundos en inglés sobre algo suyo. Luego la profe a cámara. Son 3 piezas (una por estudiante) con la misma estructura.   ·   </w:t>
       </w:r>
       <w:r>
         <w:rPr>
@@ -1822,7 +1993,7 @@
           <w:i w:val="0"/>
           <w:sz w:val="21"/>
         </w:rPr>
-        <w:t xml:space="preserve"> 25 s</w:t>
+        <w:t xml:space="preserve"> 25-30 s</w:t>
       </w:r>
     </w:p>
     <w:p>
@@ -1843,7 +2014,7 @@
           <w:i w:val="0"/>
           <w:sz w:val="21"/>
         </w:rPr>
-        <w:t xml:space="preserve"> Plano medio; el profe se voltea y escribe en el tablero mientras habla; vuelve a cámara.</w:t>
+        <w:t xml:space="preserve"> Plano medio fijo del estudiante. Texto grande con su frase en español mientras la dice; corte a él hablando en inglés con el texto "Hoy". Luego la profe a cámara.</w:t>
       </w:r>
     </w:p>
     <w:p>
@@ -1869,7 +2040,7 @@
           <w:i/>
           <w:sz w:val="21"/>
         </w:rPr>
-        <w:t>"El Marco Común Europeo calcula entre quinientas y seiscientas horas de clase para llegar a B2."</w:t>
+        <w:t>"Estudiante, en español: "Llegué el primer día sin hablar una palabra de inglés. Hace ___ meses." (luego 10 s en inglés)"</w:t>
       </w:r>
     </w:p>
     <w:p>
@@ -1882,7 +2053,7 @@
           <w:i/>
           <w:sz w:val="21"/>
         </w:rPr>
-        <w:t>"Si estudias dos horas por semana, son cinco años. Aquí: cuatro horas al día, siete meses. O si trabajas, dos horas cada noche: catorce."</w:t>
+        <w:t>"Profe: Esto no pasa por venir a clase a copiar. Pasa porque desde el primer día hablan, se equivocan, los corregimos y lo vuelven a decir."</w:t>
       </w:r>
     </w:p>
     <w:p>
@@ -1895,7 +2066,7 @@
           <w:i/>
           <w:sz w:val="21"/>
         </w:rPr>
-        <w:t>"No es fácil. Es rápido porque es intenso."</w:t>
+        <w:t>"Eso es lo que compras aquí."</w:t>
       </w:r>
     </w:p>
     <w:p>
@@ -1916,7 +2087,7 @@
           <w:i w:val="0"/>
           <w:sz w:val="21"/>
         </w:rPr>
-        <w:t xml:space="preserve"> "B2 = 500-600 h (Marco Común Europeo)" · "2 h/semana = 5 años" · "Aquí: 7 meses · noche: 14" · al final: "Garantía por escrito"</w:t>
+        <w:t xml:space="preserve"> "Llegó sin una palabra de inglés" · "Hace ___ meses" (dato real) · "Hoy"</w:t>
       </w:r>
     </w:p>
     <w:p>
@@ -1937,7 +2108,28 @@
           <w:i w:val="0"/>
           <w:sz w:val="21"/>
         </w:rPr>
-        <w:t xml:space="preserve"> "Pregúntanos qué fecha te queda. Escríbenos." Botón: WhatsApp.</w:t>
+        <w:t xml:space="preserve"> "¿Quieres llegar ahí? Escríbenos." Botón: WhatsApp. TOMA 2 DEL CIERRE (se graba adicional, 5 s de la profe): "Mándanos un audio de 30 segundos y te decimos tu nivel." Solo se publica si el agente recibe audios y alguien los responde en menos de 24 h; si no, "te decimos tu nivel en la cita".</w:t>
+      </w:r>
+    </w:p>
+    <w:p>
+      <w:pPr>
+        <w:spacing w:after="40"/>
+      </w:pPr>
+      <w:r>
+        <w:rPr>
+          <w:b/>
+          <w:i w:val="0"/>
+          <w:sz w:val="21"/>
+        </w:rPr>
+        <w:t>VERSIÓN DE 15 SEGUNDOS (se corta en edición del mismo material; no se graba aparte):</w:t>
+      </w:r>
+      <w:r>
+        <w:rPr>
+          <w:b w:val="0"/>
+          <w:i w:val="0"/>
+          <w:sz w:val="21"/>
+        </w:rPr>
+        <w:t xml:space="preserve"> 0-4 s estudiante en español: "Llegué el primer día sin hablar una palabra de inglés. Hace ___ meses." → 4-11 s el mismo estudiante hablando en inglés (texto: "Hoy") → 11-15 s profe: "¿Quieres llegar ahí? Escríbenos." Se arma una versión de 15 s por cada uno de los 3 estudiantes.</w:t>
       </w:r>
     </w:p>
     <w:p>
@@ -1951,7 +2143,7 @@
           <w:color w:val="666666"/>
           <w:sz w:val="19"/>
         </w:rPr>
-        <w:t>Nota: Las dos jornadas van en la misma pieza (4 h/día = 7 meses; 2 h/noche = 14 meses) para no dejar por fuera al nocturno. Sin precio.</w:t>
+        <w:t>Nota: Grabar a los 3: tres piezas distintas con el mismo guion (Meta premia caras y conceptos distintos). Si uno no quiere salir, se hace con los que sí.</w:t>
       </w:r>
     </w:p>
     <w:p>
@@ -1964,7 +2156,7 @@
           <w:color w:val="E54C09"/>
           <w:sz w:val="25"/>
         </w:rPr>
-        <w:t>GUION 5 — EL PACTO   [SE GRABA]   · anuncio V7_NOESFACIL</w:t>
+        <w:t>GUION 7 — EL AÑO DESPUÉS DEL COLEGIO   [SE GRABA (padres de jóvenes de 17-20 años)]   · anuncio V8_PADRES</w:t>
       </w:r>
     </w:p>
     <w:p>
@@ -1985,7 +2177,7 @@
           <w:i w:val="0"/>
           <w:sz w:val="21"/>
         </w:rPr>
-        <w:t xml:space="preserve"> "Hola, vi el video de lo que no prometen (V7). Voy en serio."</w:t>
+        <w:t xml:space="preserve"> "Hola, vi el video del año después del colegio (V8). Es para mi hijo/a."</w:t>
       </w:r>
     </w:p>
     <w:p>
@@ -2006,7 +2198,7 @@
           <w:i w:val="0"/>
           <w:sz w:val="21"/>
         </w:rPr>
-        <w:t xml:space="preserve"> Profe muy cerca, bajo: "No te voy a decir que es fácil." Texto grande: "Lo que NO te prometemos".</w:t>
+        <w:t xml:space="preserve"> Texto grande sobre jóvenes en clase: "Salió del colegio. ¿Y ahora qué?"</w:t>
       </w:r>
     </w:p>
     <w:p>
@@ -2027,7 +2219,7 @@
           <w:i w:val="0"/>
           <w:sz w:val="21"/>
         </w:rPr>
-        <w:t xml:space="preserve"> La venta honesta: qué prometemos y qué no. Atrae al que va en serio y espanta al que busca "fácil" (y eso baja los leads que no contestan).</w:t>
+        <w:t xml:space="preserve"> Padres de jóvenes que ya salieron del colegio y no han entrado a la universidad (no saben qué estudiar o todavía no alcanza la plata): ese año resuelve el inglés. Más la constancia que se entrena aquí.</w:t>
       </w:r>
     </w:p>
     <w:p>
@@ -2048,7 +2240,7 @@
           <w:i w:val="0"/>
           <w:sz w:val="21"/>
         </w:rPr>
-        <w:t xml:space="preserve"> Profe (Angie o Cristian) a cámara, en el aula, muy cerca, hablando bajo.   ·   </w:t>
+        <w:t xml:space="preserve"> Coordinación (Jacqueline) a cámara, en la recepción, hablando a un papá o mamá. Si hay un padre voluntario, mejor él.   ·   </w:t>
       </w:r>
       <w:r>
         <w:rPr>
@@ -2085,7 +2277,7 @@
           <w:i w:val="0"/>
           <w:sz w:val="21"/>
         </w:rPr>
-        <w:t xml:space="preserve"> Plano cerrado, fijo. Sin música. Subtítulos palabra por palabra.</w:t>
+        <w:t xml:space="preserve"> Plano medio fijo; corte de 3 segundos a jóvenes del grupo en clase (de espaldas o con autorización).</w:t>
       </w:r>
     </w:p>
     <w:p>
@@ -2111,7 +2303,7 @@
           <w:i/>
           <w:sz w:val="21"/>
         </w:rPr>
-        <w:t>"Te voy a decir lo que no te prometemos: que sea fácil, ni que te guste todos los días. Vas a tener clases pesadas y días de no querer venir."</w:t>
+        <w:t>"Su hijo ya salió del colegio y todavía no ha entrado a la universidad. No sabe qué estudiar, o todavía no alcanza la plata."</w:t>
       </w:r>
     </w:p>
     <w:p>
@@ -2124,7 +2316,7 @@
           <w:i/>
           <w:sz w:val="21"/>
         </w:rPr>
-        <w:t>"Lo que sí te prometemos: que hablas desde el primer día, que te corrigen todos los días, y que si cumples y no avanzas, te devolvemos la plata. Te lo entregamos firmado."</w:t>
+        <w:t>"Ese año no tiene que perderse: puede ser el año en que resuelve el inglés, y llega a la universidad o a su primer trabajo con eso listo."</w:t>
       </w:r>
     </w:p>
     <w:p>
@@ -2137,7 +2329,20 @@
           <w:i/>
           <w:sz w:val="21"/>
         </w:rPr>
-        <w:t>"Si buscas que sea divertido, no somos tu academia. Si buscas hablar inglés, sí."</w:t>
+        <w:t>"Y algo que los papás nos agradecen más que el inglés: aquí se entrena constancia. Asistencia, tareas, cumplir. Y cumplir no es solo para aprender inglés: es para la vida."</w:t>
+      </w:r>
+    </w:p>
+    <w:p>
+      <w:pPr>
+        <w:spacing w:after="40"/>
+      </w:pPr>
+      <w:r>
+        <w:rPr>
+          <w:b w:val="0"/>
+          <w:i/>
+          <w:sz w:val="21"/>
+        </w:rPr>
+        <w:t>"En un mundo con inteligencia artificial, el que se sabe comunicar y cumple es el que avanza. Su hijo se lo va a agradecer. En la tarde, en la noche o los sábados."</w:t>
       </w:r>
     </w:p>
     <w:p>
@@ -2158,7 +2363,7 @@
           <w:i w:val="0"/>
           <w:sz w:val="21"/>
         </w:rPr>
-        <w:t xml:space="preserve"> "Lo que NO te prometemos" → "Lo que SÍ te firmamos"</w:t>
+        <w:t xml:space="preserve"> "Salió del colegio. ¿Y ahora qué?" · "El año en que resuelve el inglés" · "Tarde · noche · sábados"</w:t>
       </w:r>
     </w:p>
     <w:p>
@@ -2179,7 +2384,28 @@
           <w:i w:val="0"/>
           <w:sz w:val="21"/>
         </w:rPr>
-        <w:t xml:space="preserve"> "Si vas en serio, escríbenos." Botón: WhatsApp.</w:t>
+        <w:t xml:space="preserve"> "Pregúntenos qué horario le sirve. Escríbanos." Botón: WhatsApp.</w:t>
+      </w:r>
+    </w:p>
+    <w:p>
+      <w:pPr>
+        <w:spacing w:after="40"/>
+      </w:pPr>
+      <w:r>
+        <w:rPr>
+          <w:b/>
+          <w:i w:val="0"/>
+          <w:sz w:val="21"/>
+        </w:rPr>
+        <w:t>VERSIÓN DE 15 SEGUNDOS (se corta en edición del mismo material; no se graba aparte):</w:t>
+      </w:r>
+      <w:r>
+        <w:rPr>
+          <w:b w:val="0"/>
+          <w:i w:val="0"/>
+          <w:sz w:val="21"/>
+        </w:rPr>
+        <w:t xml:space="preserve"> 0-3 s texto sobre jóvenes en clase: "Salió del colegio. ¿Y ahora qué?" → 3-11 s Jacqueline: "Ese año no tiene que perderse: puede ser el año en que resuelve el inglés." → 11-15 s: "Pregúntenos qué horario le sirve. Escríbanos."</w:t>
       </w:r>
     </w:p>
     <w:p>
@@ -2193,7 +2419,7 @@
           <w:color w:val="666666"/>
           <w:sz w:val="19"/>
         </w:rPr>
-        <w:t>Nota: Es la pieza que más filtra: menos conversaciones, mejores. Medir costo por CITA, no por lead.</w:t>
+        <w:t>Nota: Nada de Saber 11 ni de niños de colegio: el público son los que ya salieron. Sin precio.</w:t>
       </w:r>
     </w:p>
     <w:p>
@@ -2206,7 +2432,7 @@
           <w:color w:val="E54C09"/>
           <w:sz w:val="25"/>
         </w:rPr>
-        <w:t>GUION 6 — LLEGUÉ SIN UNA PALABRA   [PRIORITARIO]   · anuncio V1_VIDEODEHOY</w:t>
+        <w:t>GUION 8 — EL PASAPORTE   [PRIORITARIO (destino: irse)]   · anuncio V5_PASAPORTE</w:t>
       </w:r>
     </w:p>
     <w:p>
@@ -2227,7 +2453,7 @@
           <w:i w:val="0"/>
           <w:sz w:val="21"/>
         </w:rPr>
-        <w:t xml:space="preserve"> "Hola, vi el video del antes y después (V1). Quiero saber más."</w:t>
+        <w:t xml:space="preserve"> "Hola, quiero prepararme en inglés para Au Pair / irme (V5)."</w:t>
       </w:r>
     </w:p>
     <w:p>
@@ -2248,7 +2474,7 @@
           <w:i w:val="0"/>
           <w:sz w:val="21"/>
         </w:rPr>
-        <w:t xml:space="preserve"> Segundo 0: el estudiante a cámara, en español: "Llegué el primer día sin hablar una palabra de inglés." (formato CONFESIÓN, top 5 de ganchos por tasa de acierto en Motion 2026). Corte seco a él hablando en inglés. En pantalla el dato exacto: "Hace ___ meses" (de la ficha del estudiante; sin dato real no se publica).</w:t>
+        <w:t xml:space="preserve"> Estudiante a cámara, en inglés, respondiendo "Tell me about yourself". Texto grande: "La familia te entrevista en inglés antes de elegirte." Texto del anuncio (no del video), primera línea obligatoria: "No somos agencia: te preparamos en inglés para la entrevista de Au Pair. El trámite lo haces con la agencia que elijas."</w:t>
       </w:r>
     </w:p>
     <w:p>
@@ -2269,7 +2495,7 @@
           <w:i w:val="0"/>
           <w:sz w:val="21"/>
         </w:rPr>
-        <w:t xml:space="preserve"> Prueba real: tres estudiantes que entraron a Heiiu sin hablar inglés y hoy hablan. Confesión en español + 10 s en inglés. (No hay video de entrada de este grupo; la prueba es su palabra con el dato real y su inglés de hoy.)</w:t>
+        <w:t xml:space="preserve"> El destino #2 de la base: Au Pair (solo Au Pair: es el programa donde la familia sí entrevista en inglés antes de elegir; Work and Travel y Europa no siempre exigen inglés, así que no se afirman). Sin prometer familia, visa ni empleo.</w:t>
       </w:r>
     </w:p>
     <w:p>
@@ -2290,7 +2516,7 @@
           <w:i w:val="0"/>
           <w:sz w:val="21"/>
         </w:rPr>
-        <w:t xml:space="preserve"> Cada uno de los 3 que empezó de cero en Heiiu, de pie frente a la cámara, en el salón: (a) en español: "Llegué el primer día sin hablar una palabra de inglés. Hace ___ meses." (dato real de cada uno); (b) 10 segundos en inglés sobre algo suyo. Luego la profe a cámara. Son 3 piezas (una por estudiante) con la misma estructura.   ·   </w:t>
+        <w:t xml:space="preserve"> Simulación real del grupo B1/B2: una familia de Estados Unidos entrevista por videollamada a su candidata a Au Pair. El hombre del grupo hace de papá de la familia (lee las preguntas del tablero); las mujeres son las candidatas, una a la vez. Luego la profe a cámara.   ·   </w:t>
       </w:r>
       <w:r>
         <w:rPr>
@@ -2327,7 +2553,7 @@
           <w:i w:val="0"/>
           <w:sz w:val="21"/>
         </w:rPr>
-        <w:t xml:space="preserve"> Plano medio fijo del estudiante. Texto grande con su frase en español mientras la dice; corte a él hablando en inglés con el texto "Hoy". Luego la profe a cámara.</w:t>
+        <w:t xml:space="preserve"> Abre con 1 segundo de la fachada y el texto "Aquí, en Bucaramanga". Dos segundos de la entrevista en inglés; 8 segundos más de la simulación; profe a cámara; cierre.</w:t>
       </w:r>
     </w:p>
     <w:p>
@@ -2353,7 +2579,7 @@
           <w:i/>
           <w:sz w:val="21"/>
         </w:rPr>
-        <w:t>"Estudiante, en español: "Llegué el primer día sin hablar una palabra de inglés. Hace ___ meses." (luego 10 s en inglés)"</w:t>
+        <w:t>"(simulación: "Tell me about yourself. Why do you want to live with a family abroad? What would you do if the child refuses to eat?")"</w:t>
       </w:r>
     </w:p>
     <w:p>
@@ -2366,7 +2592,7 @@
           <w:i/>
           <w:sz w:val="21"/>
         </w:rPr>
-        <w:t>"Profe: Esto no pasa por venir a clase a copiar. Pasa porque desde el primer día hablan, se equivocan, los corregimos y lo vuelven a decir."</w:t>
+        <w:t>"Profe: En Au Pair, la familia te entrevista en inglés antes de elegirte. Sin esa entrevista, no hay familia."</w:t>
       </w:r>
     </w:p>
     <w:p>
@@ -2379,7 +2605,7 @@
           <w:i/>
           <w:sz w:val="21"/>
         </w:rPr>
-        <w:t>"Eso es lo que compras aquí."</w:t>
+        <w:t>"Aquí la ensayamos hasta que la contestas sin pensar."</w:t>
       </w:r>
     </w:p>
     <w:p>
@@ -2400,7 +2626,7 @@
           <w:i w:val="0"/>
           <w:sz w:val="21"/>
         </w:rPr>
-        <w:t xml:space="preserve"> "Llegó sin una palabra de inglés" · "Hace ___ meses" (dato real) · "Hoy"</w:t>
+        <w:t xml:space="preserve"> "No somos agencia. Te preparamos para la entrevista" · "El inglés es el pasaporte"</w:t>
       </w:r>
     </w:p>
     <w:p>
@@ -2421,7 +2647,28 @@
           <w:i w:val="0"/>
           <w:sz w:val="21"/>
         </w:rPr>
-        <w:t xml:space="preserve"> "¿Quieres llegar ahí? Escríbenos." Botón: WhatsApp. TOMA 2 DEL CIERRE (se graba adicional, 5 s de la profe): "Mándanos un audio de 30 segundos y te decimos tu nivel." Solo se publica si el agente recibe audios y alguien los responde en menos de 24 h; si no, "te decimos tu nivel en la cita".</w:t>
+        <w:t xml:space="preserve"> "Cuéntanos a dónde quieres ir y te decimos qué nivel te pide. Escríbenos." Botón: WhatsApp.</w:t>
+      </w:r>
+    </w:p>
+    <w:p>
+      <w:pPr>
+        <w:spacing w:after="40"/>
+      </w:pPr>
+      <w:r>
+        <w:rPr>
+          <w:b/>
+          <w:i w:val="0"/>
+          <w:sz w:val="21"/>
+        </w:rPr>
+        <w:t>VERSIÓN DE 15 SEGUNDOS (se corta en edición del mismo material; no se graba aparte):</w:t>
+      </w:r>
+      <w:r>
+        <w:rPr>
+          <w:b w:val="0"/>
+          <w:i w:val="0"/>
+          <w:sz w:val="21"/>
+        </w:rPr>
+        <w:t xml:space="preserve"> 0-3 s candidata respondiendo "Tell me about yourself" (texto: "La familia te entrevista en inglés antes de elegirte.") → 3-11 s profe: "Sin esa entrevista, no hay familia. Aquí la ensayamos hasta que la contestas sin pensar." → 11-15 s: "Cuéntanos a dónde quieres ir. Escríbenos."</w:t>
       </w:r>
     </w:p>
     <w:p>
@@ -2435,7 +2682,7 @@
           <w:color w:val="666666"/>
           <w:sz w:val="19"/>
         </w:rPr>
-        <w:t>Nota: Grabar a los 3: tres piezas distintas con el mismo guion (Meta premia caras y conceptos distintos). Si uno no quiere salir, se hace con los que sí.</w:t>
+        <w:t>Nota: Prohibido: "te conseguimos la familia / la visa / el empleo", nombres de agencias, países con salario prometido, y afirmar que Work and Travel o Europa exigen inglés (no siempre). Es preparación para la entrevista, no colocación. Prueba la hipótesis destino "irse" contra destino "trabajo aquí" (guion 3).</w:t>
       </w:r>
     </w:p>
     <w:p>
@@ -2448,7 +2695,7 @@
           <w:color w:val="E54C09"/>
           <w:sz w:val="25"/>
         </w:rPr>
-        <w:t>GUION 7 — EL AÑO DESPUÉS DEL COLEGIO   [SE GRABA (padres de jóvenes de 17-20 años)]   · anuncio V8_PADRES</w:t>
+        <w:t>GUION 9 — LA CORRECCIÓN DEL DÍA   [PRIORITARIO (10 minutos; el único que da algo antes de pedir)]   · anuncio V9_CORRECCION</w:t>
       </w:r>
     </w:p>
     <w:p>
@@ -2469,7 +2716,7 @@
           <w:i w:val="0"/>
           <w:sz w:val="21"/>
         </w:rPr>
-        <w:t xml:space="preserve"> "Hola, vi el video del año después del colegio (V8). Es para mi hijo/a."</w:t>
+        <w:t xml:space="preserve"> "Hola, vi la corrección del día (V9). Aquí va mi audio."</w:t>
       </w:r>
     </w:p>
     <w:p>
@@ -2490,7 +2737,7 @@
           <w:i w:val="0"/>
           <w:sz w:val="21"/>
         </w:rPr>
-        <w:t xml:space="preserve"> Texto grande sobre jóvenes en clase: "Salió del colegio. ¿Y ahora qué?"</w:t>
+        <w:t xml:space="preserve"> Segundo 0: el marcador escribiendo el error en el tablero. Texto grande: "El error que más oigo en clase."</w:t>
       </w:r>
     </w:p>
     <w:p>
@@ -2511,7 +2758,7 @@
           <w:i w:val="0"/>
           <w:sz w:val="21"/>
         </w:rPr>
-        <w:t xml:space="preserve"> Padres de jóvenes que ya salieron del colegio y no han entrado a la universidad (no saben qué estudiar o todavía no alcanza la plata): ese año resuelve el inglés. Más la constancia que se entrena aquí.</w:t>
+        <w:t xml:space="preserve"> Reciprocidad + valor primero: el único formato tutorial del set. Muestra cómo se corrige en Heiiu y regala una corrección real.</w:t>
       </w:r>
     </w:p>
     <w:p>
@@ -2532,7 +2779,7 @@
           <w:i w:val="0"/>
           <w:sz w:val="21"/>
         </w:rPr>
-        <w:t xml:space="preserve"> Coordinación (Jacqueline) a cámara, en la recepción, hablando a un papá o mamá. Si hay un padre voluntario, mejor él.   ·   </w:t>
+        <w:t xml:space="preserve"> La profe en el tablero con el grupo B1/B2 de pie. El error sale del error paper del grupo si existe; si no, uno de los tres típicos de hispanohablantes que trae la hoja de la profe ("I am agree" → "I agree"; "depends of" → "depends on"; "people is" → "people are"). La voz de la profe en inglés es mínima: el contenido va escrito.   ·   </w:t>
       </w:r>
       <w:r>
         <w:rPr>
@@ -2548,7 +2795,7 @@
           <w:i w:val="0"/>
           <w:sz w:val="21"/>
         </w:rPr>
-        <w:t xml:space="preserve"> 25-30 s</w:t>
+        <w:t xml:space="preserve"> 15-20 s</w:t>
       </w:r>
     </w:p>
     <w:p>
@@ -2569,7 +2816,7 @@
           <w:i w:val="0"/>
           <w:sz w:val="21"/>
         </w:rPr>
-        <w:t xml:space="preserve"> Plano medio fijo; corte de 3 segundos a jóvenes del grupo en clase (de espaldas o con autorización).</w:t>
+        <w:t xml:space="preserve"> Segundos 0-2: el profe escribe el error real en el tablero. Segundos 2-8: lo tacha y escribe la forma correcta; debajo queda la Frase del Día. Segundos 8-14: los estudiantes la repiten de pie; uno de los que empezó de cero la usa en una frase propia. Cierre del profe a cámara.</w:t>
       </w:r>
     </w:p>
     <w:p>
@@ -2595,7 +2842,7 @@
           <w:i/>
           <w:sz w:val="21"/>
         </w:rPr>
-        <w:t>"Su hijo ya salió del colegio y todavía no ha entrado a la universidad. No sabe qué estudiar, o todavía no alcanza la plata."</w:t>
+        <w:t>"(profe escribe el error, lo tacha, escribe la forma correcta y la dice en voz alta)"</w:t>
       </w:r>
     </w:p>
     <w:p>
@@ -2608,7 +2855,7 @@
           <w:i/>
           <w:sz w:val="21"/>
         </w:rPr>
-        <w:t>"Ese año no tiene que perderse: puede ser el año en que resuelve el inglés, y llega a la universidad o a su primer trabajo con eso listo."</w:t>
+        <w:t>"Profe (en inglés): "Can anyone tell me why this is wrong?" → lo tacha, escribe la correcta → "Repeat.""</w:t>
       </w:r>
     </w:p>
     <w:p>
@@ -2621,20 +2868,7 @@
           <w:i/>
           <w:sz w:val="21"/>
         </w:rPr>
-        <w:t>"Y algo que los papás nos agradecen más que el inglés: aquí se entrena constancia. Asistencia, tareas, cumplir. Y cumplir no es solo para aprender inglés: es para la vida."</w:t>
-      </w:r>
-    </w:p>
-    <w:p>
-      <w:pPr>
-        <w:spacing w:after="40"/>
-      </w:pPr>
-      <w:r>
-        <w:rPr>
-          <w:b w:val="0"/>
-          <w:i/>
-          <w:sz w:val="21"/>
-        </w:rPr>
-        <w:t>"En un mundo con inteligencia artificial, el que se sabe comunicar y cumple es el que avanza. Su hijo se lo va a agradecer. En la tarde, en la noche o los sábados."</w:t>
+        <w:t>"Profe a cámara, en español: Mándanos un audio con tu propia frase usando esto, y te la corregimos."</w:t>
       </w:r>
     </w:p>
     <w:p>
@@ -2655,7 +2889,7 @@
           <w:i w:val="0"/>
           <w:sz w:val="21"/>
         </w:rPr>
-        <w:t xml:space="preserve"> "Salió del colegio. ¿Y ahora qué?" · "El año en que resuelve el inglés" · "Tarde · noche · sábados"</w:t>
+        <w:t xml:space="preserve"> "El error que más oigo en clase" · la forma correcta en el tablero · "Así se corrige en Heiiu"</w:t>
       </w:r>
     </w:p>
     <w:p>
@@ -2676,7 +2910,28 @@
           <w:i w:val="0"/>
           <w:sz w:val="21"/>
         </w:rPr>
-        <w:t xml:space="preserve"> "Pregúntenos qué horario le sirve. Escríbanos." Botón: WhatsApp.</w:t>
+        <w:t xml:space="preserve"> "Mándanos un audio con tu propia frase usando esto, y te la corregimos." Botón: WhatsApp. (Si el agente no recibe audios: "Escríbenos y te decimos tu nivel en la cita".)</w:t>
+      </w:r>
+    </w:p>
+    <w:p>
+      <w:pPr>
+        <w:spacing w:after="40"/>
+      </w:pPr>
+      <w:r>
+        <w:rPr>
+          <w:b/>
+          <w:i w:val="0"/>
+          <w:sz w:val="21"/>
+        </w:rPr>
+        <w:t>VERSIÓN DE 15 SEGUNDOS (se corta en edición del mismo material; no se graba aparte):</w:t>
+      </w:r>
+      <w:r>
+        <w:rPr>
+          <w:b w:val="0"/>
+          <w:i w:val="0"/>
+          <w:sz w:val="21"/>
+        </w:rPr>
+        <w:t xml:space="preserve"> 0-3 s el marcador escribiendo el error (texto: "El error que más oigo en clase") → 3-10 s lo tacha, escribe la forma correcta, el grupo repite → 10-15 s profe: "Mándanos un audio con tu propia frase usando esto, y te la corregimos."</w:t>
       </w:r>
     </w:p>
     <w:p>
@@ -2690,595 +2945,111 @@
           <w:color w:val="666666"/>
           <w:sz w:val="19"/>
         </w:rPr>
-        <w:t>Nota: Nada de Saber 11 ni de niños de colegio: el público son los que ya salieron. Sin precio.</w:t>
+        <w:t>Nota: Sin la palabra "gratis". El acento de la profe no es tema: la pieza muestra la corrección escrita, no una clase de pronunciación. Es la pieza que prueba la hipótesis de dar valor primero (Freedman y Fraser 1966).</w:t>
       </w:r>
     </w:p>
     <w:p>
       <w:pPr>
-        <w:spacing w:before="280" w:after="80"/>
+        <w:spacing w:before="200" w:after="80"/>
       </w:pPr>
       <w:r>
         <w:rPr>
           <w:b/>
           <w:color w:val="E54C09"/>
-          <w:sz w:val="25"/>
-        </w:rPr>
-        <w:t>GUION 8 — EL PASAPORTE   [PRIORITARIO (destino: irse)]   · anuncio V5_PASAPORTE</w:t>
+          <w:sz w:val="24"/>
+        </w:rPr>
+        <w:t>CHECKLIST DEL DÍA DE GRABACIÓN</w:t>
       </w:r>
     </w:p>
     <w:p>
       <w:pPr>
         <w:spacing w:after="40"/>
       </w:pPr>
-      <w:r>
-        <w:rPr>
-          <w:b/>
-          <w:i w:val="0"/>
-          <w:sz w:val="21"/>
-        </w:rPr>
-        <w:t>Mensaje prellenado del botón de WhatsApp:</w:t>
-      </w:r>
       <w:r>
         <w:rPr>
           <w:b w:val="0"/>
           <w:i w:val="0"/>
           <w:sz w:val="21"/>
         </w:rPr>
-        <w:t xml:space="preserve"> "Hola, quiero prepararme en inglés para Au Pair / irme (V5)."</w:t>
+        <w:t>• Vertical 9:16, subtítulos grandes desde el primer segundo, sin música encima de la voz en los guiones 1, 5 y 6. Texto y subtítulos dentro de la ZONA SEGURA de Reels (ni en el 14% superior ni en el 35% inferior de la pantalla); audio siempre (Meta: video 9:16 con audio y texto en zona segura = 34,5% menos costo por resultado que imágenes).</w:t>
       </w:r>
     </w:p>
     <w:p>
       <w:pPr>
         <w:spacing w:after="40"/>
       </w:pPr>
-      <w:r>
-        <w:rPr>
-          <w:b/>
-          <w:i w:val="0"/>
-          <w:sz w:val="21"/>
-        </w:rPr>
-        <w:t>GANCHO (segundos 0-2, lo que para el dedo):</w:t>
-      </w:r>
       <w:r>
         <w:rPr>
           <w:b w:val="0"/>
           <w:i w:val="0"/>
           <w:sz w:val="21"/>
         </w:rPr>
-        <w:t xml:space="preserve"> Estudiante a cámara, en inglés, respondiendo "Tell me about yourself". Texto grande: "La familia te entrevista en inglés antes de elegirte." Texto del anuncio (no del video), primera línea obligatoria: "No somos agencia: te preparamos en inglés para la entrevista de Au Pair. El trámite lo haces con la agencia que elijas."</w:t>
+        <w:t>• DATOS A CONFIRMAR ANTES DE PUBLICAR (no se inventan): meses reales desde la PRIMERA CLASE (no desde la matrícula) de cada uno de los 3 que empezaron de cero (guiones 2 y 6); que el agente de WhatsApp recibe audios y alguien los responde en menos de 24 h (cierres de reciprocidad).</w:t>
       </w:r>
     </w:p>
     <w:p>
       <w:pPr>
         <w:spacing w:after="40"/>
       </w:pPr>
-      <w:r>
-        <w:rPr>
-          <w:b/>
-          <w:i w:val="0"/>
-          <w:sz w:val="21"/>
-        </w:rPr>
-        <w:t>Qué vende:</w:t>
-      </w:r>
       <w:r>
         <w:rPr>
           <w:b w:val="0"/>
           <w:i w:val="0"/>
           <w:sz w:val="21"/>
         </w:rPr>
-        <w:t xml:space="preserve"> El destino #2 de la base: Au Pair (solo Au Pair: es el programa donde la familia sí entrevista en inglés antes de elegir; Work and Travel y Europa no siempre exigen inglés, así que no se afirman). Sin prometer familia, visa ni empleo.</w:t>
+        <w:t>• Cada video lleva su código de anuncio (V1-V9) y su mensaje prellenado (están en cada guion): el editor nombra el archivo con el código.</w:t>
       </w:r>
     </w:p>
     <w:p>
       <w:pPr>
         <w:spacing w:after="40"/>
       </w:pPr>
-      <w:r>
-        <w:rPr>
-          <w:b/>
-          <w:i w:val="0"/>
-          <w:sz w:val="21"/>
-        </w:rPr>
-        <w:t>Quién habla:</w:t>
-      </w:r>
       <w:r>
         <w:rPr>
           <w:b w:val="0"/>
           <w:i w:val="0"/>
           <w:sz w:val="21"/>
         </w:rPr>
-        <w:t xml:space="preserve"> Simulación real del grupo B1/B2: una familia de Estados Unidos entrevista por videollamada a su candidata a Au Pair. El hombre del grupo hace de papá de la familia (lee las preguntas del tablero); las mujeres son las candidatas, una a la vez. Luego la profe a cámara.   ·   </w:t>
-      </w:r>
-      <w:r>
-        <w:rPr>
-          <w:b/>
-          <w:i w:val="0"/>
-          <w:sz w:val="21"/>
-        </w:rPr>
-        <w:t>Duración:</w:t>
-      </w:r>
+        <w:t>• La autorización de imagen está en el contrato de matrícula que todos firmaron; la profe lo plantea como ayuda a su trabajo y quien diga voluntariamente que no, queda fuera de plano. Sin nombres en pantalla.</w:t>
+      </w:r>
+    </w:p>
+    <w:p>
+      <w:pPr>
+        <w:spacing w:after="40"/>
+      </w:pPr>
       <w:r>
         <w:rPr>
           <w:b w:val="0"/>
           <w:i w:val="0"/>
           <w:sz w:val="21"/>
         </w:rPr>
-        <w:t xml:space="preserve"> 25-30 s</w:t>
+        <w:t>• Prohibido en pantalla y en voz: precio, "Arranque", "A1 intensivo", "descuento", "gratis", "fácil", "rápido" sin número, "bilingüe", "consigue trabajo", "duplica tu salario", "profesores nativos", "única academia con garantía" sin la palabra PRESENCIAL (las online E4CC y EF la tienen), fecha de inicio de cohorte.</w:t>
       </w:r>
     </w:p>
     <w:p>
       <w:pPr>
-        <w:spacing w:after="80"/>
-      </w:pPr>
-      <w:r>
-        <w:rPr>
-          <w:b/>
-          <w:i w:val="0"/>
-          <w:sz w:val="21"/>
-        </w:rPr>
-        <w:t>Qué se ve:</w:t>
-      </w:r>
+        <w:spacing w:after="40"/>
+      </w:pPr>
       <w:r>
         <w:rPr>
           <w:b w:val="0"/>
           <w:i w:val="0"/>
           <w:sz w:val="21"/>
         </w:rPr>
-        <w:t xml:space="preserve"> Abre con 1 segundo de la fachada y el texto "Aquí, en Bucaramanga". Dos segundos de la entrevista en inglés; 8 segundos más de la simulación; profe a cámara; cierre.</w:t>
+        <w:t>• Cierre de todos: botón de WhatsApp (los anuncios nuevos van a clic-a-WhatsApp para que el agente los reciba; los de formulario llevan la pregunta de motivo).</w:t>
       </w:r>
     </w:p>
     <w:p>
       <w:pPr>
-        <w:spacing w:after="20"/>
-      </w:pPr>
-      <w:r>
-        <w:rPr>
-          <w:b/>
-          <w:i w:val="0"/>
-          <w:sz w:val="21"/>
-        </w:rPr>
-        <w:t>Texto (se dice tal cual, con subtítulos):</w:t>
-      </w:r>
-    </w:p>
-    <w:p>
-      <w:pPr>
         <w:spacing w:after="40"/>
       </w:pPr>
-      <w:r>
-        <w:rPr>
-          <w:b w:val="0"/>
-          <w:i/>
-          <w:sz w:val="21"/>
-        </w:rPr>
-        <w:t>"(simulación: "Tell me about yourself. Why do you want to live with a family abroad? What would you do if the child refuses to eat?")"</w:t>
-      </w:r>
-    </w:p>
-    <w:p>
-      <w:pPr>
-        <w:spacing w:after="40"/>
-      </w:pPr>
-      <w:r>
-        <w:rPr>
-          <w:b w:val="0"/>
-          <w:i/>
-          <w:sz w:val="21"/>
-        </w:rPr>
-        <w:t>"Profe: En Au Pair, la familia te entrevista en inglés antes de elegirte. Sin esa entrevista, no hay familia."</w:t>
-      </w:r>
-    </w:p>
-    <w:p>
-      <w:pPr>
-        <w:spacing w:after="40"/>
-      </w:pPr>
-      <w:r>
-        <w:rPr>
-          <w:b w:val="0"/>
-          <w:i/>
-          <w:sz w:val="21"/>
-        </w:rPr>
-        <w:t>"Aquí la ensayamos hasta que la contestas sin pensar."</w:t>
-      </w:r>
-    </w:p>
-    <w:p>
-      <w:pPr>
-        <w:spacing w:after="40"/>
-      </w:pPr>
-      <w:r>
-        <w:rPr>
-          <w:b/>
-          <w:i w:val="0"/>
-          <w:sz w:val="21"/>
-        </w:rPr>
-        <w:t>Texto en pantalla:</w:t>
-      </w:r>
       <w:r>
         <w:rPr>
           <w:b w:val="0"/>
           <w:i w:val="0"/>
           <w:sz w:val="21"/>
         </w:rPr>
-        <w:t xml:space="preserve"> "No somos agencia. Te preparamos para la entrevista" · "El inglés es el pasaporte"</w:t>
-      </w:r>
-    </w:p>
-    <w:p>
-      <w:pPr>
-        <w:spacing w:after="40"/>
-      </w:pPr>
-      <w:r>
-        <w:rPr>
-          <w:b/>
-          <w:i w:val="0"/>
-          <w:sz w:val="21"/>
-        </w:rPr>
-        <w:t>Cierre:</w:t>
-      </w:r>
-      <w:r>
-        <w:rPr>
-          <w:b w:val="0"/>
-          <w:i w:val="0"/>
-          <w:sz w:val="21"/>
-        </w:rPr>
-        <w:t xml:space="preserve"> "Cuéntanos a dónde quieres ir y te decimos qué nivel te pide. Escríbenos." Botón: WhatsApp.</w:t>
-      </w:r>
-    </w:p>
-    <w:p>
-      <w:pPr>
-        <w:spacing w:after="80"/>
-      </w:pPr>
-      <w:r>
-        <w:rPr>
-          <w:b w:val="0"/>
-          <w:i w:val="0"/>
-          <w:color w:val="666666"/>
-          <w:sz w:val="19"/>
-        </w:rPr>
-        <w:t>Nota: Prohibido: "te conseguimos la familia / la visa / el empleo", nombres de agencias, países con salario prometido, y afirmar que Work and Travel o Europa exigen inglés (no siempre). Es preparación para la entrevista, no colocación. Prueba la hipótesis destino "irse" contra destino "trabajo aquí" (guion 3).</w:t>
-      </w:r>
-    </w:p>
-    <w:p>
-      <w:pPr>
-        <w:spacing w:before="280" w:after="80"/>
-      </w:pPr>
-      <w:r>
-        <w:rPr>
-          <w:b/>
-          <w:color w:val="E54C09"/>
-          <w:sz w:val="25"/>
-        </w:rPr>
-        <w:t>GUION 9 — LA CORRECCIÓN DEL DÍA   [PRIORITARIO (10 minutos; el único que da algo antes de pedir)]   · anuncio V9_CORRECCION</w:t>
-      </w:r>
-    </w:p>
-    <w:p>
-      <w:pPr>
-        <w:spacing w:after="40"/>
-      </w:pPr>
-      <w:r>
-        <w:rPr>
-          <w:b/>
-          <w:i w:val="0"/>
-          <w:sz w:val="21"/>
-        </w:rPr>
-        <w:t>Mensaje prellenado del botón de WhatsApp:</w:t>
-      </w:r>
-      <w:r>
-        <w:rPr>
-          <w:b w:val="0"/>
-          <w:i w:val="0"/>
-          <w:sz w:val="21"/>
-        </w:rPr>
-        <w:t xml:space="preserve"> "Hola, vi la corrección del día (V9). Aquí va mi audio."</w:t>
-      </w:r>
-    </w:p>
-    <w:p>
-      <w:pPr>
-        <w:spacing w:after="40"/>
-      </w:pPr>
-      <w:r>
-        <w:rPr>
-          <w:b/>
-          <w:i w:val="0"/>
-          <w:sz w:val="21"/>
-        </w:rPr>
-        <w:t>GANCHO (segundos 0-2, lo que para el dedo):</w:t>
-      </w:r>
-      <w:r>
-        <w:rPr>
-          <w:b w:val="0"/>
-          <w:i w:val="0"/>
-          <w:sz w:val="21"/>
-        </w:rPr>
-        <w:t xml:space="preserve"> Segundo 0: el marcador escribiendo el error en el tablero. Texto grande: "El error que más oigo en clase."</w:t>
-      </w:r>
-    </w:p>
-    <w:p>
-      <w:pPr>
-        <w:spacing w:after="40"/>
-      </w:pPr>
-      <w:r>
-        <w:rPr>
-          <w:b/>
-          <w:i w:val="0"/>
-          <w:sz w:val="21"/>
-        </w:rPr>
-        <w:t>Qué vende:</w:t>
-      </w:r>
-      <w:r>
-        <w:rPr>
-          <w:b w:val="0"/>
-          <w:i w:val="0"/>
-          <w:sz w:val="21"/>
-        </w:rPr>
-        <w:t xml:space="preserve"> Reciprocidad + valor primero: el único formato tutorial del set. Muestra cómo se corrige en Heiiu y regala una corrección real.</w:t>
-      </w:r>
-    </w:p>
-    <w:p>
-      <w:pPr>
-        <w:spacing w:after="40"/>
-      </w:pPr>
-      <w:r>
-        <w:rPr>
-          <w:b/>
-          <w:i w:val="0"/>
-          <w:sz w:val="21"/>
-        </w:rPr>
-        <w:t>Quién habla:</w:t>
-      </w:r>
-      <w:r>
-        <w:rPr>
-          <w:b w:val="0"/>
-          <w:i w:val="0"/>
-          <w:sz w:val="21"/>
-        </w:rPr>
-        <w:t xml:space="preserve"> La profe en el tablero con el grupo B1/B2 de pie. El error sale del error paper del grupo si existe; si no, uno de los tres típicos de hispanohablantes que trae la hoja de la profe ("I am agree" → "I agree"; "depends of" → "depends on"; "people is" → "people are"). La voz de la profe en inglés es mínima: el contenido va escrito.   ·   </w:t>
-      </w:r>
-      <w:r>
-        <w:rPr>
-          <w:b/>
-          <w:i w:val="0"/>
-          <w:sz w:val="21"/>
-        </w:rPr>
-        <w:t>Duración:</w:t>
-      </w:r>
-      <w:r>
-        <w:rPr>
-          <w:b w:val="0"/>
-          <w:i w:val="0"/>
-          <w:sz w:val="21"/>
-        </w:rPr>
-        <w:t xml:space="preserve"> 15-20 s</w:t>
-      </w:r>
-    </w:p>
-    <w:p>
-      <w:pPr>
-        <w:spacing w:after="80"/>
-      </w:pPr>
-      <w:r>
-        <w:rPr>
-          <w:b/>
-          <w:i w:val="0"/>
-          <w:sz w:val="21"/>
-        </w:rPr>
-        <w:t>Qué se ve:</w:t>
-      </w:r>
-      <w:r>
-        <w:rPr>
-          <w:b w:val="0"/>
-          <w:i w:val="0"/>
-          <w:sz w:val="21"/>
-        </w:rPr>
-        <w:t xml:space="preserve"> Segundos 0-2: el profe escribe el error real en el tablero. Segundos 2-8: lo tacha y escribe la forma correcta; debajo queda la Frase del Día. Segundos 8-14: los estudiantes la repiten de pie; uno de los que empezó de cero la usa en una frase propia. Cierre del profe a cámara.</w:t>
-      </w:r>
-    </w:p>
-    <w:p>
-      <w:pPr>
-        <w:spacing w:after="20"/>
-      </w:pPr>
-      <w:r>
-        <w:rPr>
-          <w:b/>
-          <w:i w:val="0"/>
-          <w:sz w:val="21"/>
-        </w:rPr>
-        <w:t>Texto (se dice tal cual, con subtítulos):</w:t>
-      </w:r>
-    </w:p>
-    <w:p>
-      <w:pPr>
-        <w:spacing w:after="40"/>
-      </w:pPr>
-      <w:r>
-        <w:rPr>
-          <w:b w:val="0"/>
-          <w:i/>
-          <w:sz w:val="21"/>
-        </w:rPr>
-        <w:t>"(profe escribe el error, lo tacha, escribe la forma correcta y la dice en voz alta)"</w:t>
-      </w:r>
-    </w:p>
-    <w:p>
-      <w:pPr>
-        <w:spacing w:after="40"/>
-      </w:pPr>
-      <w:r>
-        <w:rPr>
-          <w:b w:val="0"/>
-          <w:i/>
-          <w:sz w:val="21"/>
-        </w:rPr>
-        <w:t>"Profe (en inglés): "Can anyone tell me why this is wrong?" → lo tacha, escribe la correcta → "Repeat.""</w:t>
-      </w:r>
-    </w:p>
-    <w:p>
-      <w:pPr>
-        <w:spacing w:after="40"/>
-      </w:pPr>
-      <w:r>
-        <w:rPr>
-          <w:b w:val="0"/>
-          <w:i/>
-          <w:sz w:val="21"/>
-        </w:rPr>
-        <w:t>"Profe a cámara, en español: Mándanos un audio con tu propia frase usando esto, y te la corregimos."</w:t>
-      </w:r>
-    </w:p>
-    <w:p>
-      <w:pPr>
-        <w:spacing w:after="40"/>
-      </w:pPr>
-      <w:r>
-        <w:rPr>
-          <w:b/>
-          <w:i w:val="0"/>
-          <w:sz w:val="21"/>
-        </w:rPr>
-        <w:t>Texto en pantalla:</w:t>
-      </w:r>
-      <w:r>
-        <w:rPr>
-          <w:b w:val="0"/>
-          <w:i w:val="0"/>
-          <w:sz w:val="21"/>
-        </w:rPr>
-        <w:t xml:space="preserve"> "El error que más oigo en clase" · la forma correcta en el tablero · "Así se corrige en Heiiu"</w:t>
-      </w:r>
-    </w:p>
-    <w:p>
-      <w:pPr>
-        <w:spacing w:after="40"/>
-      </w:pPr>
-      <w:r>
-        <w:rPr>
-          <w:b/>
-          <w:i w:val="0"/>
-          <w:sz w:val="21"/>
-        </w:rPr>
-        <w:t>Cierre:</w:t>
-      </w:r>
-      <w:r>
-        <w:rPr>
-          <w:b w:val="0"/>
-          <w:i w:val="0"/>
-          <w:sz w:val="21"/>
-        </w:rPr>
-        <w:t xml:space="preserve"> "Mándanos un audio con tu propia frase usando esto, y te la corregimos." Botón: WhatsApp. (Si el agente no recibe audios: "Escríbenos y te decimos tu nivel en la cita".)</w:t>
-      </w:r>
-    </w:p>
-    <w:p>
-      <w:pPr>
-        <w:spacing w:after="80"/>
-      </w:pPr>
-      <w:r>
-        <w:rPr>
-          <w:b w:val="0"/>
-          <w:i w:val="0"/>
-          <w:color w:val="666666"/>
-          <w:sz w:val="19"/>
-        </w:rPr>
-        <w:t>Nota: Sin la palabra "gratis". El acento de la profe no es tema: la pieza muestra la corrección escrita, no una clase de pronunciación. Es la pieza que prueba la hipótesis de dar valor primero (Freedman y Fraser 1966).</w:t>
-      </w:r>
-    </w:p>
-    <w:p>
-      <w:pPr>
-        <w:spacing w:before="200" w:after="80"/>
-      </w:pPr>
-      <w:r>
-        <w:rPr>
-          <w:b/>
-          <w:color w:val="E54C09"/>
-          <w:sz w:val="24"/>
-        </w:rPr>
-        <w:t>CHECKLIST DEL DÍA DE GRABACIÓN</w:t>
-      </w:r>
-    </w:p>
-    <w:p>
-      <w:pPr>
-        <w:spacing w:after="40"/>
-      </w:pPr>
-      <w:r>
-        <w:rPr>
-          <w:b w:val="0"/>
-          <w:i w:val="0"/>
-          <w:sz w:val="21"/>
-        </w:rPr>
-        <w:t>• Vertical 9:16, subtítulos grandes desde el primer segundo, sin música encima de la voz en los guiones 1, 5 y 6. Texto y subtítulos dentro de la ZONA SEGURA de Reels (ni en el 14% superior ni en el 35% inferior de la pantalla); audio siempre (Meta: video 9:16 con audio y texto en zona segura = 34,5% menos costo por resultado que imágenes).</w:t>
-      </w:r>
-    </w:p>
-    <w:p>
-      <w:pPr>
-        <w:spacing w:after="40"/>
-      </w:pPr>
-      <w:r>
-        <w:rPr>
-          <w:b w:val="0"/>
-          <w:i w:val="0"/>
-          <w:sz w:val="21"/>
-        </w:rPr>
-        <w:t>• DATOS A CONFIRMAR ANTES DE PUBLICAR (no se inventan): meses reales desde la PRIMERA CLASE (no desde la matrícula) de cada uno de los 3 que empezaron de cero (guiones 2 y 6); que el agente de WhatsApp recibe audios y alguien los responde en menos de 24 h (cierres de reciprocidad).</w:t>
-      </w:r>
-    </w:p>
-    <w:p>
-      <w:pPr>
-        <w:spacing w:after="40"/>
-      </w:pPr>
-      <w:r>
-        <w:rPr>
-          <w:b w:val="0"/>
-          <w:i w:val="0"/>
-          <w:sz w:val="21"/>
-        </w:rPr>
-        <w:t>• Cada video lleva su código de anuncio (V1-V9) y su mensaje prellenado (están en cada guion): el editor nombra el archivo con el código.</w:t>
-      </w:r>
-    </w:p>
-    <w:p>
-      <w:pPr>
-        <w:spacing w:after="40"/>
-      </w:pPr>
-      <w:r>
-        <w:rPr>
-          <w:b w:val="0"/>
-          <w:i w:val="0"/>
-          <w:sz w:val="21"/>
-        </w:rPr>
-        <w:t>• La autorización de imagen está en el contrato de matrícula que todos firmaron; la profe lo plantea como ayuda a su trabajo y quien diga voluntariamente que no, queda fuera de plano. Sin nombres en pantalla.</w:t>
-      </w:r>
-    </w:p>
-    <w:p>
-      <w:pPr>
-        <w:spacing w:after="40"/>
-      </w:pPr>
-      <w:r>
-        <w:rPr>
-          <w:b w:val="0"/>
-          <w:i w:val="0"/>
-          <w:sz w:val="21"/>
-        </w:rPr>
-        <w:t>• Prohibido en pantalla y en voz: precio, "Arranque", "A1 intensivo", "descuento", "gratis", "fácil", "rápido" sin número, "bilingüe", "consigue trabajo", "duplica tu salario", "profesores nativos", "única academia con garantía" sin la palabra PRESENCIAL (las online E4CC y EF la tienen), fecha de inicio de cohorte.</w:t>
-      </w:r>
-    </w:p>
-    <w:p>
-      <w:pPr>
-        <w:spacing w:after="40"/>
-      </w:pPr>
-      <w:r>
-        <w:rPr>
-          <w:b w:val="0"/>
-          <w:i w:val="0"/>
-          <w:sz w:val="21"/>
-        </w:rPr>
-        <w:t>• Cierre de todos: botón de WhatsApp (los anuncios nuevos van a clic-a-WhatsApp para que el agente los reciba; los de formulario llevan la pregunta de motivo).</w:t>
-      </w:r>
-    </w:p>
-    <w:p>
-      <w:pPr>
-        <w:spacing w:after="40"/>
-      </w:pPr>
-      <w:r>
-        <w:rPr>
-          <w:b w:val="0"/>
-          <w:i w:val="0"/>
-          <w:sz w:val="21"/>
-        </w:rPr>
-        <w:t>• Grabar cada guion dos veces: una completa y una de 15 segundos (solo la frase fuerte + cierre) para pruebas.</w:t>
+        <w:t>• Grabar cada guion completo (2 tomas). La versión de 15 segundos NO se graba aparte: se corta en edición siguiendo la línea "VERSIÓN DE 15 SEGUNDOS" de cada guion.</w:t>
       </w:r>
     </w:p>
     <w:p>

</xml_diff>

<commit_message>
Guiones Isaac: orden de edicion (tanda 1: 9 de 30 s el lunes; tanda 2: 13 restantes el miercoles)
Co-Authored-By: Claude Opus 5.5 <noreply@anthropic.com>
</commit_message>
<xml_diff>
--- a/recursos/comercial/campañas/GUIONES_GRABACION_2026-10-09.docx
+++ b/recursos/comercial/campañas/GUIONES_GRABACION_2026-10-09.docx
@@ -186,7 +186,7 @@
           <w:i w:val="0"/>
           <w:sz w:val="21"/>
         </w:rPr>
-        <w:t>Qué se entrega (lunes 12/10, al WhatsApp de gerencia, enviados como DOCUMENTO, no como video, para que WhatsApp no los comprima):</w:t>
+        <w:t>Qué se entrega (al WhatsApp de gerencia, enviados como DOCUMENTO, no como video, para que WhatsApp no los comprima; tanda 1 el lunes 12/10 y tanda 2 el miércoles 14/10, ver "Qué se edita primero"):</w:t>
       </w:r>
       <w:r>
         <w:rPr>
@@ -475,6 +475,484 @@
     <w:p>
       <w:r>
         <w:br w:type="page"/>
+      </w:r>
+    </w:p>
+    <w:p>
+      <w:pPr>
+        <w:spacing w:before="200" w:after="80"/>
+      </w:pPr>
+      <w:r>
+        <w:rPr>
+          <w:b/>
+          <w:color w:val="E54C09"/>
+          <w:sz w:val="24"/>
+        </w:rPr>
+        <w:t>QUÉ SE EDITA PRIMERO Y CUÁNDO SE ENTREGA</w:t>
+      </w:r>
+    </w:p>
+    <w:p>
+      <w:pPr>
+        <w:spacing w:after="60"/>
+      </w:pPr>
+      <w:r>
+        <w:rPr>
+          <w:b w:val="0"/>
+          <w:i w:val="0"/>
+          <w:sz w:val="21"/>
+        </w:rPr>
+        <w:t>Salen 11 videos en dos duraciones = 22 archivos. Se editan en dos tandas:</w:t>
+      </w:r>
+    </w:p>
+    <w:tbl>
+      <w:tblPr>
+        <w:tblStyle w:val="TableGrid"/>
+        <w:tblW w:type="auto" w:w="0"/>
+        <w:tblLook w:firstColumn="1" w:firstRow="1" w:lastColumn="0" w:lastRow="0" w:noHBand="0" w:noVBand="1" w:val="04A0"/>
+      </w:tblPr>
+      <w:tblGrid>
+        <w:gridCol w:w="3280"/>
+        <w:gridCol w:w="3280"/>
+        <w:gridCol w:w="3280"/>
+      </w:tblGrid>
+      <w:tr>
+        <w:tc>
+          <w:tcPr>
+            <w:tcW w:type="dxa" w:w="3280"/>
+          </w:tcPr>
+          <w:p>
+            <w:r>
+              <w:rPr>
+                <w:b/>
+                <w:sz w:val="18"/>
+              </w:rPr>
+              <w:t>#</w:t>
+            </w:r>
+          </w:p>
+        </w:tc>
+        <w:tc>
+          <w:tcPr>
+            <w:tcW w:type="dxa" w:w="3280"/>
+          </w:tcPr>
+          <w:p>
+            <w:r>
+              <w:rPr>
+                <w:b/>
+                <w:sz w:val="18"/>
+              </w:rPr>
+              <w:t>TANDA 1 — los 9 primeros (versión de 30 s) · entrega lunes 12/10</w:t>
+            </w:r>
+          </w:p>
+        </w:tc>
+        <w:tc>
+          <w:tcPr>
+            <w:tcW w:type="dxa" w:w="3280"/>
+          </w:tcPr>
+          <w:p>
+            <w:r>
+              <w:rPr>
+                <w:b/>
+                <w:sz w:val="18"/>
+              </w:rPr>
+              <w:t>Archivo</w:t>
+            </w:r>
+          </w:p>
+        </w:tc>
+      </w:tr>
+      <w:tr>
+        <w:tc>
+          <w:tcPr>
+            <w:tcW w:type="dxa" w:w="3280"/>
+          </w:tcPr>
+          <w:p>
+            <w:r>
+              <w:rPr>
+                <w:sz w:val="18"/>
+              </w:rPr>
+              <w:t>1</w:t>
+            </w:r>
+          </w:p>
+        </w:tc>
+        <w:tc>
+          <w:tcPr>
+            <w:tcW w:type="dxa" w:w="3280"/>
+          </w:tcPr>
+          <w:p>
+            <w:r>
+              <w:rPr>
+                <w:sz w:val="18"/>
+              </w:rPr>
+              <w:t>Llegué sin una palabra — el MEJOR de los 3 estudiantes (el que hable más claro en inglés)</w:t>
+            </w:r>
+          </w:p>
+        </w:tc>
+        <w:tc>
+          <w:tcPr>
+            <w:tcW w:type="dxa" w:w="3280"/>
+          </w:tcPr>
+          <w:p>
+            <w:r>
+              <w:rPr>
+                <w:sz w:val="18"/>
+              </w:rPr>
+              <w:t>V1_VIDEODEHOY_A_30s.mp4</w:t>
+            </w:r>
+          </w:p>
+        </w:tc>
+      </w:tr>
+      <w:tr>
+        <w:tc>
+          <w:tcPr>
+            <w:tcW w:type="dxa" w:w="3280"/>
+          </w:tcPr>
+          <w:p>
+            <w:r>
+              <w:rPr>
+                <w:sz w:val="18"/>
+              </w:rPr>
+              <w:t>2</w:t>
+            </w:r>
+          </w:p>
+        </w:tc>
+        <w:tc>
+          <w:tcPr>
+            <w:tcW w:type="dxa" w:w="3280"/>
+          </w:tcPr>
+          <w:p>
+            <w:r>
+              <w:rPr>
+                <w:sz w:val="18"/>
+              </w:rPr>
+              <w:t>Esto es una clase</w:t>
+            </w:r>
+          </w:p>
+        </w:tc>
+        <w:tc>
+          <w:tcPr>
+            <w:tcW w:type="dxa" w:w="3280"/>
+          </w:tcPr>
+          <w:p>
+            <w:r>
+              <w:rPr>
+                <w:sz w:val="18"/>
+              </w:rPr>
+              <w:t>V2_CLASE_30s.mp4</w:t>
+            </w:r>
+          </w:p>
+        </w:tc>
+      </w:tr>
+      <w:tr>
+        <w:tc>
+          <w:tcPr>
+            <w:tcW w:type="dxa" w:w="3280"/>
+          </w:tcPr>
+          <w:p>
+            <w:r>
+              <w:rPr>
+                <w:sz w:val="18"/>
+              </w:rPr>
+              <w:t>3</w:t>
+            </w:r>
+          </w:p>
+        </w:tc>
+        <w:tc>
+          <w:tcPr>
+            <w:tcW w:type="dxa" w:w="3280"/>
+          </w:tcPr>
+          <w:p>
+            <w:r>
+              <w:rPr>
+                <w:sz w:val="18"/>
+              </w:rPr>
+              <w:t>Siete meses</w:t>
+            </w:r>
+          </w:p>
+        </w:tc>
+        <w:tc>
+          <w:tcPr>
+            <w:tcW w:type="dxa" w:w="3280"/>
+          </w:tcPr>
+          <w:p>
+            <w:r>
+              <w:rPr>
+                <w:sz w:val="18"/>
+              </w:rPr>
+              <w:t>V3_575H_30s.mp4</w:t>
+            </w:r>
+          </w:p>
+        </w:tc>
+      </w:tr>
+      <w:tr>
+        <w:tc>
+          <w:tcPr>
+            <w:tcW w:type="dxa" w:w="3280"/>
+          </w:tcPr>
+          <w:p>
+            <w:r>
+              <w:rPr>
+                <w:sz w:val="18"/>
+              </w:rPr>
+              <w:t>4</w:t>
+            </w:r>
+          </w:p>
+        </w:tc>
+        <w:tc>
+          <w:tcPr>
+            <w:tcW w:type="dxa" w:w="3280"/>
+          </w:tcPr>
+          <w:p>
+            <w:r>
+              <w:rPr>
+                <w:sz w:val="18"/>
+              </w:rPr>
+              <w:t>La vacante</w:t>
+            </w:r>
+          </w:p>
+        </w:tc>
+        <w:tc>
+          <w:tcPr>
+            <w:tcW w:type="dxa" w:w="3280"/>
+          </w:tcPr>
+          <w:p>
+            <w:r>
+              <w:rPr>
+                <w:sz w:val="18"/>
+              </w:rPr>
+              <w:t>V4_VACANTE_30s.mp4</w:t>
+            </w:r>
+          </w:p>
+        </w:tc>
+      </w:tr>
+      <w:tr>
+        <w:tc>
+          <w:tcPr>
+            <w:tcW w:type="dxa" w:w="3280"/>
+          </w:tcPr>
+          <w:p>
+            <w:r>
+              <w:rPr>
+                <w:sz w:val="18"/>
+              </w:rPr>
+              <w:t>5</w:t>
+            </w:r>
+          </w:p>
+        </w:tc>
+        <w:tc>
+          <w:tcPr>
+            <w:tcW w:type="dxa" w:w="3280"/>
+          </w:tcPr>
+          <w:p>
+            <w:r>
+              <w:rPr>
+                <w:sz w:val="18"/>
+              </w:rPr>
+              <w:t>El pasaporte (Au Pair)</w:t>
+            </w:r>
+          </w:p>
+        </w:tc>
+        <w:tc>
+          <w:tcPr>
+            <w:tcW w:type="dxa" w:w="3280"/>
+          </w:tcPr>
+          <w:p>
+            <w:r>
+              <w:rPr>
+                <w:sz w:val="18"/>
+              </w:rPr>
+              <w:t>V5_PASAPORTE_30s.mp4</w:t>
+            </w:r>
+          </w:p>
+        </w:tc>
+      </w:tr>
+      <w:tr>
+        <w:tc>
+          <w:tcPr>
+            <w:tcW w:type="dxa" w:w="3280"/>
+          </w:tcPr>
+          <w:p>
+            <w:r>
+              <w:rPr>
+                <w:sz w:val="18"/>
+              </w:rPr>
+              <w:t>6</w:t>
+            </w:r>
+          </w:p>
+        </w:tc>
+        <w:tc>
+          <w:tcPr>
+            <w:tcW w:type="dxa" w:w="3280"/>
+          </w:tcPr>
+          <w:p>
+            <w:r>
+              <w:rPr>
+                <w:sz w:val="18"/>
+              </w:rPr>
+              <w:t>Te acompañamos</w:t>
+            </w:r>
+          </w:p>
+        </w:tc>
+        <w:tc>
+          <w:tcPr>
+            <w:tcW w:type="dxa" w:w="3280"/>
+          </w:tcPr>
+          <w:p>
+            <w:r>
+              <w:rPr>
+                <w:sz w:val="18"/>
+              </w:rPr>
+              <w:t>V6_GARANTIA_30s.mp4</w:t>
+            </w:r>
+          </w:p>
+        </w:tc>
+      </w:tr>
+      <w:tr>
+        <w:tc>
+          <w:tcPr>
+            <w:tcW w:type="dxa" w:w="3280"/>
+          </w:tcPr>
+          <w:p>
+            <w:r>
+              <w:rPr>
+                <w:sz w:val="18"/>
+              </w:rPr>
+              <w:t>7</w:t>
+            </w:r>
+          </w:p>
+        </w:tc>
+        <w:tc>
+          <w:tcPr>
+            <w:tcW w:type="dxa" w:w="3280"/>
+          </w:tcPr>
+          <w:p>
+            <w:r>
+              <w:rPr>
+                <w:sz w:val="18"/>
+              </w:rPr>
+              <w:t>El Pacto</w:t>
+            </w:r>
+          </w:p>
+        </w:tc>
+        <w:tc>
+          <w:tcPr>
+            <w:tcW w:type="dxa" w:w="3280"/>
+          </w:tcPr>
+          <w:p>
+            <w:r>
+              <w:rPr>
+                <w:sz w:val="18"/>
+              </w:rPr>
+              <w:t>V7_NOESFACIL_30s.mp4</w:t>
+            </w:r>
+          </w:p>
+        </w:tc>
+      </w:tr>
+      <w:tr>
+        <w:tc>
+          <w:tcPr>
+            <w:tcW w:type="dxa" w:w="3280"/>
+          </w:tcPr>
+          <w:p>
+            <w:r>
+              <w:rPr>
+                <w:sz w:val="18"/>
+              </w:rPr>
+              <w:t>8</w:t>
+            </w:r>
+          </w:p>
+        </w:tc>
+        <w:tc>
+          <w:tcPr>
+            <w:tcW w:type="dxa" w:w="3280"/>
+          </w:tcPr>
+          <w:p>
+            <w:r>
+              <w:rPr>
+                <w:sz w:val="18"/>
+              </w:rPr>
+              <w:t>El año después del colegio</w:t>
+            </w:r>
+          </w:p>
+        </w:tc>
+        <w:tc>
+          <w:tcPr>
+            <w:tcW w:type="dxa" w:w="3280"/>
+          </w:tcPr>
+          <w:p>
+            <w:r>
+              <w:rPr>
+                <w:sz w:val="18"/>
+              </w:rPr>
+              <w:t>V8_PADRES_30s.mp4</w:t>
+            </w:r>
+          </w:p>
+        </w:tc>
+      </w:tr>
+      <w:tr>
+        <w:tc>
+          <w:tcPr>
+            <w:tcW w:type="dxa" w:w="3280"/>
+          </w:tcPr>
+          <w:p>
+            <w:r>
+              <w:rPr>
+                <w:sz w:val="18"/>
+              </w:rPr>
+              <w:t>9</w:t>
+            </w:r>
+          </w:p>
+        </w:tc>
+        <w:tc>
+          <w:tcPr>
+            <w:tcW w:type="dxa" w:w="3280"/>
+          </w:tcPr>
+          <w:p>
+            <w:r>
+              <w:rPr>
+                <w:sz w:val="18"/>
+              </w:rPr>
+              <w:t>La corrección del día</w:t>
+            </w:r>
+          </w:p>
+        </w:tc>
+        <w:tc>
+          <w:tcPr>
+            <w:tcW w:type="dxa" w:w="3280"/>
+          </w:tcPr>
+          <w:p>
+            <w:r>
+              <w:rPr>
+                <w:sz w:val="18"/>
+              </w:rPr>
+              <w:t>V9_CORRECCION_30s.mp4</w:t>
+            </w:r>
+          </w:p>
+        </w:tc>
+      </w:tr>
+    </w:tbl>
+    <w:p>
+      <w:pPr>
+        <w:spacing w:after="60"/>
+      </w:pPr>
+      <w:r>
+        <w:rPr>
+          <w:b w:val="0"/>
+          <w:i w:val="0"/>
+          <w:sz w:val="21"/>
+        </w:rPr>
+        <w:t>TANDA 2 — los 13 restantes · entrega miércoles 14/10: las 9 versiones de 15 s (V1_A_15s … V9_15s) + los otros 2 estudiantes de "Llegué sin una palabra" en 30 s y 15 s (V1_VIDEODEHOY_B_30s, V1_VIDEODEHOY_B_15s, V1_VIDEODEHOY_C_30s, V1_VIDEODEHOY_C_15s).</w:t>
+      </w:r>
+    </w:p>
+    <w:p>
+      <w:pPr>
+        <w:spacing w:after="160"/>
+      </w:pPr>
+      <w:r>
+        <w:rPr>
+          <w:b w:val="0"/>
+          <w:i w:val="0"/>
+          <w:color w:val="666666"/>
+          <w:sz w:val="19"/>
+        </w:rPr>
+        <w:t>Las variantes con el cierre "Mándanos un audio" NO se editan hasta que gerencia lo autorice.</w:t>
       </w:r>
     </w:p>
     <w:p>

</xml_diff>

<commit_message>
Guiones: 'coach' -> 'mentor' (V6); instrucciones Meta: formulario con 2 preguntas de calificacion (video diario, forma de pago)
Co-Authored-By: Claude Fable 5.1 <noreply@anthropic.com>
</commit_message>
<xml_diff>
--- a/recursos/comercial/campañas/GUIONES_GRABACION_2026-10-09.docx
+++ b/recursos/comercial/campañas/GUIONES_GRABACION_2026-10-09.docx
@@ -23,7 +23,7 @@
           <w:color w:val="666666"/>
           <w:sz w:val="19"/>
         </w:rPr>
-        <w:t>Venden el SERVICIO, no el producto: garantía por escrito, profesor que entrena (coach), acompañamiento diario, y un plan con fecha de llegada. Reglas del calendario: gancho de destino, sin precio ni nombre del programa, nunca "fácil", "rápido" ni "gratis"; caras de profes, estudiantes con cláusula de imagen y coordinación; nunca gerencia. Verticales (9:16), 20-30 segundos, subtítulos grandes. Cada guion abre con un GANCHO de 2 segundos (imagen + texto grande) que es lo que detiene el dedo; la clase, el profe o el contrato son la prueba que viene después. Cierre siempre a WhatsApp. GRUPO DISPONIBLE EL 09/10: un grupo de B1/B2 de 5 estudiantes; 3 de ellos empezaron de cero (A1) en Heiiu (no hay video de entrada de ellos; la prueba es su confesión con el dato real y su inglés de hoy): son los protagonistas de los guiones 2 y 6.</w:t>
+        <w:t>Venden el SERVICIO, no el producto: garantía por escrito, profesor que entrena (mentor), acompañamiento diario, y un plan con fecha de llegada. Reglas del calendario: gancho de destino, sin precio ni nombre del programa, nunca "fácil", "rápido" ni "gratis"; caras de profes, estudiantes con cláusula de imagen y coordinación; nunca gerencia. Verticales (9:16), 20-30 segundos, subtítulos grandes. Cada guion abre con un GANCHO de 2 segundos (imagen + texto grande) que es lo que detiene el dedo; la clase, el profe o el contrato son la prueba que viene después. Cierre siempre a WhatsApp. GRUPO DISPONIBLE EL 09/10: un grupo de B1/B2 de 5 estudiantes; 3 de ellos empezaron de cero (A1) en Heiiu (no hay video de entrada de ellos; la prueba es su confesión con el dato real y su inglés de hoy): son los protagonistas de los guiones 2 y 6.</w:t>
       </w:r>
     </w:p>
     <w:p>
@@ -1132,7 +1132,7 @@
           <w:i w:val="0"/>
           <w:sz w:val="21"/>
         </w:rPr>
-        <w:t xml:space="preserve"> La motivación que falla y el acompañamiento que la sostiene (el profe como coach), cerrado con la garantía por escrito. OJO: siempre "única academia PRESENCIAL de Bucaramanga" (las plataformas online E4CC y EF sí tienen garantía escrita).</w:t>
+        <w:t xml:space="preserve"> La motivación que falla y el acompañamiento que la sostiene (el profe como mentor), cerrado con la garantía por escrito. OJO: siempre "única academia PRESENCIAL de Bucaramanga" (las plataformas online E4CC y EF sí tienen garantía escrita).</w:t>
       </w:r>
     </w:p>
     <w:p>
@@ -1229,7 +1229,7 @@
           <w:i/>
           <w:sz w:val="21"/>
         </w:rPr>
-        <w:t>"Por eso aquí no solo te enseñamos. Te acompañamos: tu profe es tu coach. Te corrige, te pide cuentas y no te suelta."</w:t>
+        <w:t>"Por eso aquí no solo te enseñamos. Te acompañamos: tu profe es tu mentor. Te corrige, te pide cuentas y no te suelta."</w:t>
       </w:r>
     </w:p>
     <w:p>
@@ -1263,7 +1263,7 @@
           <w:i w:val="0"/>
           <w:sz w:val="21"/>
         </w:rPr>
-        <w:t xml:space="preserve"> "Las ganas no bastan" · "Tu profe es tu coach" · "Garantía de aprendizaje por escrito · única academia presencial de Bucaramanga que la firma"</w:t>
+        <w:t xml:space="preserve"> "Las ganas no bastan" · "Tu profe es tu mentor" · "Garantía de aprendizaje por escrito · única academia presencial de Bucaramanga que la firma"</w:t>
       </w:r>
     </w:p>
     <w:p>
@@ -1305,7 +1305,7 @@
           <w:i w:val="0"/>
           <w:sz w:val="21"/>
         </w:rPr>
-        <w:t xml:space="preserve"> 0-3 s Jacqueline: "Tienes las ganas. Pero a veces te falla la motivación." (texto: "Las ganas no bastan") → 3-11 s: "Aquí tu profe es tu coach: te corrige, te pide cuentas y no te suelta. Tú pones tu parte y, si no aprendes, te devolvemos el nivel." (levanta el anexo) → 11-15 s cierre: "Escríbenos."</w:t>
+        <w:t xml:space="preserve"> 0-3 s Jacqueline: "Tienes las ganas. Pero a veces te falla la motivación." (texto: "Las ganas no bastan") → 3-11 s: "Aquí tu profe es tu mentor: te corrige, te pide cuentas y no te suelta. Tú pones tu parte y, si no aprendes, te devolvemos el nivel." (levanta el anexo) → 11-15 s cierre: "Escríbenos."</w:t>
       </w:r>
     </w:p>
     <w:p>
@@ -1395,7 +1395,7 @@
           <w:i w:val="0"/>
           <w:sz w:val="21"/>
         </w:rPr>
-        <w:t xml:space="preserve"> El método visto: estudiantes hablando desde la primera clase, el profesor como coach, no como conferencista.</w:t>
+        <w:t xml:space="preserve"> El método visto: estudiantes hablando desde la primera clase, el profesor como mentor, no como conferencista.</w:t>
       </w:r>
     </w:p>
     <w:p>

</xml_diff>